<commit_message>
Validate Book Two EPUB pipeline
</commit_message>
<xml_diff>
--- a/transformers-kdp.docx
+++ b/transformers-kdp.docx
@@ -415,7 +415,7 @@
       <w:pPr>
         <w:pStyle w:val="Heading1"/>
       </w:pPr>
-      <w:bookmarkStart w:id="26" w:name="chapter-1-rules-operations-and-programs"/>
+      <w:bookmarkStart w:id="26" w:name="chapter-1"/>
       <w:r>
         <w:t xml:space="preserve">Chapter 1 — Rules, Operations, and Programs</w:t>
       </w:r>
@@ -469,7 +469,7 @@
       <w:pPr>
         <w:pStyle w:val="Heading2"/>
       </w:pPr>
-      <w:bookmarkStart w:id="27" w:name="one-door-three-states"/>
+      <w:bookmarkStart w:id="27" w:name="chapter-1-one-door-three-states"/>
       <w:r>
         <w:t xml:space="preserve">One Door, Three States</w:t>
       </w:r>
@@ -989,7 +989,7 @@
       <w:pPr>
         <w:pStyle w:val="Heading2"/>
       </w:pPr>
-      <w:bookmarkStart w:id="28" w:name="the-algebraic-gate"/>
+      <w:bookmarkStart w:id="28" w:name="chapter-1-the-algebraic-gate"/>
       <w:r>
         <w:t xml:space="preserve">The Algebraic Gate</w:t>
       </w:r>
@@ -1440,7 +1440,7 @@
       <w:pPr>
         <w:pStyle w:val="Heading2"/>
       </w:pPr>
-      <w:bookmarkStart w:id="29" w:name="the-symbolic-gate"/>
+      <w:bookmarkStart w:id="29" w:name="chapter-1-the-symbolic-gate"/>
       <w:r>
         <w:t xml:space="preserve">The Symbolic Gate</w:t>
       </w:r>
@@ -1746,7 +1746,7 @@
       <w:pPr>
         <w:pStyle w:val="Heading2"/>
       </w:pPr>
-      <w:bookmarkStart w:id="30" w:name="the-programmed-gate"/>
+      <w:bookmarkStart w:id="30" w:name="chapter-1-the-programmed-gate"/>
       <w:r>
         <w:t xml:space="preserve">The Programmed Gate</w:t>
       </w:r>
@@ -2637,7 +2637,7 @@
       <w:pPr>
         <w:pStyle w:val="Heading2"/>
       </w:pPr>
-      <w:bookmarkStart w:id="31" w:name="three-forms-of-constraint"/>
+      <w:bookmarkStart w:id="31" w:name="chapter-1-three-forms-of-constraint"/>
       <w:r>
         <w:t xml:space="preserve">Three Forms of Constraint</w:t>
       </w:r>
@@ -3092,7 +3092,7 @@
       <w:pPr>
         <w:pStyle w:val="Heading2"/>
       </w:pPr>
-      <w:bookmarkStart w:id="33" w:name="where-internal-success-ends"/>
+      <w:bookmarkStart w:id="33" w:name="chapter-1-where-internal-success-ends"/>
       <w:r>
         <w:t xml:space="preserve">Where Internal Success Ends</w:t>
       </w:r>
@@ -3476,7 +3476,7 @@
       <w:pPr>
         <w:pStyle w:val="Heading2"/>
       </w:pPr>
-      <w:bookmarkStart w:id="34" w:name="from-rules-to-representation"/>
+      <w:bookmarkStart w:id="34" w:name="chapter-1-from-rules-to-representation"/>
       <w:r>
         <w:t xml:space="preserve">From Rules to Representation</w:t>
       </w:r>
@@ -3549,7 +3549,7 @@
       <w:pPr>
         <w:pStyle w:val="Heading2"/>
       </w:pPr>
-      <w:bookmarkStart w:id="35" w:name="sources-and-evidence"/>
+      <w:bookmarkStart w:id="35" w:name="chapter-1-sources-and-evidence"/>
       <w:r>
         <w:t xml:space="preserve">Sources and Evidence</w:t>
       </w:r>
@@ -3623,7 +3623,7 @@
       <w:pPr>
         <w:pStyle w:val="Heading1"/>
       </w:pPr>
-      <w:bookmarkStart w:id="40" w:name="X436528048d502ef59bca19955afd5251c161006"/>
+      <w:bookmarkStart w:id="40" w:name="chapter-2"/>
       <w:r>
         <w:t xml:space="preserve">Chapter 2 — Representation Becomes Numerical</w:t>
       </w:r>
@@ -3722,7 +3722,7 @@
       <w:pPr>
         <w:pStyle w:val="Heading2"/>
       </w:pPr>
-      <w:bookmarkStart w:id="41" w:name="start-with-source-text"/>
+      <w:bookmarkStart w:id="41" w:name="chapter-2-start-with-source-text"/>
       <w:r>
         <w:t xml:space="preserve">Start with Source Text</w:t>
       </w:r>
@@ -3849,7 +3849,7 @@
       <w:pPr>
         <w:pStyle w:val="Heading2"/>
       </w:pPr>
-      <w:bookmarkStart w:id="42" w:name="a-token-is-not-its-identifier"/>
+      <w:bookmarkStart w:id="42" w:name="chapter-2-a-token-is-not-its-identifier"/>
       <w:r>
         <w:t xml:space="preserve">A Token Is Not Its Identifier</w:t>
       </w:r>
@@ -4399,7 +4399,7 @@
       <w:pPr>
         <w:pStyle w:val="Heading2"/>
       </w:pPr>
-      <w:bookmarkStart w:id="43" w:name="from-identifier-to-coordinate"/>
+      <w:bookmarkStart w:id="43" w:name="chapter-2-from-identifier-to-coordinate"/>
       <w:r>
         <w:t xml:space="preserve">From Identifier to Coordinate</w:t>
       </w:r>
@@ -4803,7 +4803,7 @@
       <w:pPr>
         <w:pStyle w:val="Heading2"/>
       </w:pPr>
-      <w:bookmarkStart w:id="44" w:name="lookup-is-another-mapping"/>
+      <w:bookmarkStart w:id="44" w:name="chapter-2-lookup-is-another-mapping"/>
       <w:r>
         <w:t xml:space="preserve">Lookup Is Another Mapping</w:t>
       </w:r>
@@ -5423,7 +5423,7 @@
       <w:pPr>
         <w:pStyle w:val="Heading2"/>
       </w:pPr>
-      <w:bookmarkStart w:id="45" w:name="from-token-to-coordinate"/>
+      <w:bookmarkStart w:id="45" w:name="chapter-2-from-token-to-coordinate"/>
       <w:r>
         <w:t xml:space="preserve">From Token to Coordinate</w:t>
       </w:r>
@@ -5746,7 +5746,7 @@
       <w:pPr>
         <w:pStyle w:val="Heading2"/>
       </w:pPr>
-      <w:bookmarkStart w:id="47" w:name="representation-can-discard-distinctions"/>
+      <w:bookmarkStart w:id="47" w:name="Xf151ae8792c2fab9c54d3dbcdcf5541292af3f2"/>
       <w:r>
         <w:t xml:space="preserve">Representation Can Discard Distinctions</w:t>
       </w:r>
@@ -6067,7 +6067,7 @@
       <w:pPr>
         <w:pStyle w:val="Heading2"/>
       </w:pPr>
-      <w:bookmarkStart w:id="48" w:name="what-the-probe-establishes"/>
+      <w:bookmarkStart w:id="48" w:name="chapter-2-what-the-probe-establishes"/>
       <w:r>
         <w:t xml:space="preserve">What the Probe Establishes</w:t>
       </w:r>
@@ -6212,7 +6212,7 @@
       <w:pPr>
         <w:pStyle w:val="Heading2"/>
       </w:pPr>
-      <w:bookmarkStart w:id="49" w:name="X7fb2d020421ca400dccbed609b5cb3ade4e50df"/>
+      <w:bookmarkStart w:id="49" w:name="X0cc56a7a6c171485317a6dfe9102cef46f4df23"/>
       <w:r>
         <w:t xml:space="preserve">Numerical Objects Ready for Transformation</w:t>
       </w:r>
@@ -6254,7 +6254,7 @@
       <w:pPr>
         <w:pStyle w:val="Heading2"/>
       </w:pPr>
-      <w:bookmarkStart w:id="50" w:name="sources-and-evidence"/>
+      <w:bookmarkStart w:id="50" w:name="chapter-2-sources-and-evidence"/>
       <w:r>
         <w:t xml:space="preserve">Sources and Evidence</w:t>
       </w:r>
@@ -6328,7 +6328,7 @@
       <w:pPr>
         <w:pStyle w:val="Heading1"/>
       </w:pPr>
-      <w:bookmarkStart w:id="55" w:name="chapter-3-reasoning-under-uncertainty"/>
+      <w:bookmarkStart w:id="55" w:name="chapter-3"/>
       <w:r>
         <w:t xml:space="preserve">Chapter 3 — Reasoning Under Uncertainty</w:t>
       </w:r>
@@ -6362,7 +6362,7 @@
       <w:pPr>
         <w:pStyle w:val="Heading2"/>
       </w:pPr>
-      <w:bookmarkStart w:id="56" w:name="possibilities-before-predictions"/>
+      <w:bookmarkStart w:id="56" w:name="X27652c7096aa47ab46f16a1d3e6053731cfa4e2"/>
       <w:r>
         <w:t xml:space="preserve">Possibilities Before Predictions</w:t>
       </w:r>
@@ -6690,7 +6690,7 @@
       <w:pPr>
         <w:pStyle w:val="Heading2"/>
       </w:pPr>
-      <w:bookmarkStart w:id="57" w:name="evidence-needs-a-likelihood-model"/>
+      <w:bookmarkStart w:id="57" w:name="Xba3997721c17826e7cfb544cec7696c42a2d30d"/>
       <w:r>
         <w:t xml:space="preserve">Evidence Needs a Likelihood Model</w:t>
       </w:r>
@@ -7007,7 +7007,7 @@
       <w:pPr>
         <w:pStyle w:val="Heading2"/>
       </w:pPr>
-      <w:bookmarkStart w:id="58" w:name="weight-then-normalize"/>
+      <w:bookmarkStart w:id="58" w:name="chapter-3-weight-then-normalize"/>
       <w:r>
         <w:t xml:space="preserve">Weight, Then Normalize</w:t>
       </w:r>
@@ -7747,7 +7747,7 @@
       <w:pPr>
         <w:pStyle w:val="Heading2"/>
       </w:pPr>
-      <w:bookmarkStart w:id="60" w:name="the-same-evidence-different-assumptions"/>
+      <w:bookmarkStart w:id="60" w:name="Xd9bc5ff74c3066f8c3715c2e6f88ea753ee2351"/>
       <w:r>
         <w:t xml:space="preserve">The Same Evidence, Different Assumptions</w:t>
       </w:r>
@@ -8307,7 +8307,7 @@
       <w:pPr>
         <w:pStyle w:val="Heading2"/>
       </w:pPr>
-      <w:bookmarkStart w:id="61" w:name="a-graph-declares-dependence"/>
+      <w:bookmarkStart w:id="61" w:name="chapter-3-a-graph-declares-dependence"/>
       <w:r>
         <w:t xml:space="preserve">A Graph Declares Dependence</w:t>
       </w:r>
@@ -8373,7 +8373,7 @@
       <w:pPr>
         <w:pStyle w:val="Heading2"/>
       </w:pPr>
-      <w:bookmarkStart w:id="62" w:name="inference-is-not-a-decision"/>
+      <w:bookmarkStart w:id="62" w:name="chapter-3-inference-is-not-a-decision"/>
       <w:r>
         <w:t xml:space="preserve">Inference Is Not a Decision</w:t>
       </w:r>
@@ -8533,7 +8533,7 @@
       <w:pPr>
         <w:pStyle w:val="Heading2"/>
       </w:pPr>
-      <w:bookmarkStart w:id="63" w:name="what-the-probe-establishes"/>
+      <w:bookmarkStart w:id="63" w:name="chapter-3-what-the-probe-establishes"/>
       <w:r>
         <w:t xml:space="preserve">What the Probe Establishes</w:t>
       </w:r>
@@ -8612,7 +8612,7 @@
       <w:pPr>
         <w:pStyle w:val="Heading2"/>
       </w:pPr>
-      <w:bookmarkStart w:id="64" w:name="a-distribution-ready-for-later-machinery"/>
+      <w:bookmarkStart w:id="64" w:name="X3bebad3c1d955aa2a3c20d7e6c69792489b6ea6"/>
       <w:r>
         <w:t xml:space="preserve">A Distribution Ready for Later Machinery</w:t>
       </w:r>
@@ -8654,7 +8654,7 @@
       <w:pPr>
         <w:pStyle w:val="Heading2"/>
       </w:pPr>
-      <w:bookmarkStart w:id="65" w:name="sources-and-evidence"/>
+      <w:bookmarkStart w:id="65" w:name="chapter-3-sources-and-evidence"/>
       <w:r>
         <w:t xml:space="preserve">Sources and Evidence</w:t>
       </w:r>
@@ -8728,7 +8728,7 @@
       <w:pPr>
         <w:pStyle w:val="Heading1"/>
       </w:pPr>
-      <w:bookmarkStart w:id="70" w:name="chapter-4-transformations-and-change"/>
+      <w:bookmarkStart w:id="70" w:name="chapter-4"/>
       <w:r>
         <w:t xml:space="preserve">Chapter 4 — Transformations and Change</w:t>
       </w:r>
@@ -8777,7 +8777,7 @@
       <w:pPr>
         <w:pStyle w:val="Heading2"/>
       </w:pPr>
-      <w:bookmarkStart w:id="71" w:name="a-matrix-acts-on-coordinates"/>
+      <w:bookmarkStart w:id="71" w:name="chapter-4-a-matrix-acts-on-coordinates"/>
       <w:r>
         <w:t xml:space="preserve">A Matrix Acts on Coordinates</w:t>
       </w:r>
@@ -9109,7 +9109,7 @@
       <w:pPr>
         <w:pStyle w:val="Heading2"/>
       </w:pPr>
-      <w:bookmarkStart w:id="72" w:name="what-makes-the-map-linear"/>
+      <w:bookmarkStart w:id="72" w:name="chapter-4-what-makes-the-map-linear"/>
       <w:r>
         <w:t xml:space="preserve">What Makes the Map Linear</w:t>
       </w:r>
@@ -9668,7 +9668,7 @@
       <w:pPr>
         <w:pStyle w:val="Heading2"/>
       </w:pPr>
-      <w:bookmarkStart w:id="73" w:name="a-transformation-that-is-not-linear"/>
+      <w:bookmarkStart w:id="73" w:name="X4ca777c6cef9e1b14abd0974c6c9be9a5ccbd24"/>
       <w:r>
         <w:t xml:space="preserve">A Transformation That Is Not Linear</w:t>
       </w:r>
@@ -10037,7 +10037,7 @@
       <w:pPr>
         <w:pStyle w:val="Heading2"/>
       </w:pPr>
-      <w:bookmarkStart w:id="74" w:name="change-near-one-point"/>
+      <w:bookmarkStart w:id="74" w:name="chapter-4-change-near-one-point"/>
       <w:r>
         <w:t xml:space="preserve">Change Near One Point</w:t>
       </w:r>
@@ -10620,7 +10620,7 @@
       <w:pPr>
         <w:pStyle w:val="Heading2"/>
       </w:pPr>
-      <w:bookmarkStart w:id="76" w:name="checking-the-derivative-numerically"/>
+      <w:bookmarkStart w:id="76" w:name="X1098cbb4237a0d54469f7b1efacc9becdcdc1a1"/>
       <w:r>
         <w:t xml:space="preserve">Checking the Derivative Numerically</w:t>
       </w:r>
@@ -11118,7 +11118,7 @@
       <w:pPr>
         <w:pStyle w:val="Heading2"/>
       </w:pPr>
-      <w:bookmarkStart w:id="77" w:name="jacobian-gradient-and-learning"/>
+      <w:bookmarkStart w:id="77" w:name="chapter-4-jacobian-gradient-and-learning"/>
       <w:r>
         <w:t xml:space="preserve">Jacobian, Gradient, and Learning</w:t>
       </w:r>
@@ -11200,7 +11200,7 @@
       <w:pPr>
         <w:pStyle w:val="Heading2"/>
       </w:pPr>
-      <w:bookmarkStart w:id="78" w:name="what-the-probe-establishes"/>
+      <w:bookmarkStart w:id="78" w:name="chapter-4-what-the-probe-establishes"/>
       <w:r>
         <w:t xml:space="preserve">What the Probe Establishes</w:t>
       </w:r>
@@ -11288,7 +11288,7 @@
       <w:pPr>
         <w:pStyle w:val="Heading2"/>
       </w:pPr>
-      <w:bookmarkStart w:id="79" w:name="machinery-ready-for-composition"/>
+      <w:bookmarkStart w:id="79" w:name="Xcda2158c2b783e643ac33298395b406b9342f72"/>
       <w:r>
         <w:t xml:space="preserve">Machinery Ready for Composition</w:t>
       </w:r>
@@ -11330,7 +11330,7 @@
       <w:pPr>
         <w:pStyle w:val="Heading2"/>
       </w:pPr>
-      <w:bookmarkStart w:id="80" w:name="sources-and-evidence"/>
+      <w:bookmarkStart w:id="80" w:name="chapter-4-sources-and-evidence"/>
       <w:r>
         <w:t xml:space="preserve">Sources and Evidence</w:t>
       </w:r>
@@ -11404,7 +11404,7 @@
       <w:pPr>
         <w:pStyle w:val="Heading1"/>
       </w:pPr>
-      <w:bookmarkStart w:id="85" w:name="chapter-5-memory-types-and-translation"/>
+      <w:bookmarkStart w:id="85" w:name="chapter-5"/>
       <w:r>
         <w:t xml:space="preserve">Chapter 5 — Memory, Types, and Translation</w:t>
       </w:r>
@@ -11438,7 +11438,7 @@
       <w:pPr>
         <w:pStyle w:val="Heading2"/>
       </w:pPr>
-      <w:bookmarkStart w:id="86" w:name="a-typed-source-declaration"/>
+      <w:bookmarkStart w:id="86" w:name="chapter-5-a-typed-source-declaration"/>
       <w:r>
         <w:t xml:space="preserve">A Typed Source Declaration</w:t>
       </w:r>
@@ -11897,7 +11897,7 @@
       <w:pPr>
         <w:pStyle w:val="Heading2"/>
       </w:pPr>
-      <w:bookmarkStart w:id="87" w:name="a-type-is-not-yet-a-layout"/>
+      <w:bookmarkStart w:id="87" w:name="chapter-5-a-type-is-not-yet-a-layout"/>
       <w:r>
         <w:t xml:space="preserve">A Type Is Not Yet a Layout</w:t>
       </w:r>
@@ -12406,7 +12406,7 @@
       <w:pPr>
         <w:pStyle w:val="Heading2"/>
       </w:pPr>
-      <w:bookmarkStart w:id="88" w:name="representation-is-a-policy"/>
+      <w:bookmarkStart w:id="88" w:name="chapter-5-representation-is-a-policy"/>
       <w:r>
         <w:t xml:space="preserve">Representation Is a Policy</w:t>
       </w:r>
@@ -12470,7 +12470,7 @@
       <w:pPr>
         <w:pStyle w:val="Heading2"/>
       </w:pPr>
-      <w:bookmarkStart w:id="89" w:name="a-typed-operation"/>
+      <w:bookmarkStart w:id="89" w:name="chapter-5-a-typed-operation"/>
       <w:r>
         <w:t xml:space="preserve">A Typed Operation</w:t>
       </w:r>
@@ -12829,7 +12829,7 @@
       <w:pPr>
         <w:pStyle w:val="Heading2"/>
       </w:pPr>
-      <w:bookmarkStart w:id="90" w:name="source-becomes-an-intermediate-form"/>
+      <w:bookmarkStart w:id="90" w:name="X879b5975ce4f70824f8d130b6826cf2e3573176"/>
       <w:r>
         <w:t xml:space="preserve">Source Becomes an Intermediate Form</w:t>
       </w:r>
@@ -13031,7 +13031,7 @@
       <w:pPr>
         <w:pStyle w:val="Heading2"/>
       </w:pPr>
-      <w:bookmarkStart w:id="92" w:name="observable-output"/>
+      <w:bookmarkStart w:id="92" w:name="chapter-5-observable-output"/>
       <w:r>
         <w:t xml:space="preserve">Observable Output</w:t>
       </w:r>
@@ -13103,7 +13103,7 @@
       <w:pPr>
         <w:pStyle w:val="Heading2"/>
       </w:pPr>
-      <w:bookmarkStart w:id="93" w:name="Xded0e034fd883531da5a9e5ac938e7eee0574ec"/>
+      <w:bookmarkStart w:id="93" w:name="Xbac0ed21fe2971f3fa97646098fea525555c5c3"/>
       <w:r>
         <w:t xml:space="preserve">Compilation Stops Before Runtime Analysis</w:t>
       </w:r>
@@ -13145,7 +13145,7 @@
       <w:pPr>
         <w:pStyle w:val="Heading2"/>
       </w:pPr>
-      <w:bookmarkStart w:id="94" w:name="what-the-probe-establishes"/>
+      <w:bookmarkStart w:id="94" w:name="chapter-5-what-the-probe-establishes"/>
       <w:r>
         <w:t xml:space="preserve">What the Probe Establishes</w:t>
       </w:r>
@@ -13186,7 +13186,7 @@
       <w:pPr>
         <w:pStyle w:val="Heading2"/>
       </w:pPr>
-      <w:bookmarkStart w:id="95" w:name="part-i-structures-ready-to-work"/>
+      <w:bookmarkStart w:id="95" w:name="X29e6ca295a9db37ce9df3799e8ce3c1b793e49e"/>
       <w:r>
         <w:t xml:space="preserve">Part I: Structures Ready to Work</w:t>
       </w:r>
@@ -13220,7 +13220,7 @@
       <w:pPr>
         <w:pStyle w:val="Heading2"/>
       </w:pPr>
-      <w:bookmarkStart w:id="96" w:name="sources-and-evidence"/>
+      <w:bookmarkStart w:id="96" w:name="chapter-5-sources-and-evidence"/>
       <w:r>
         <w:t xml:space="preserve">Sources and Evidence</w:t>
       </w:r>
@@ -13326,7 +13326,7 @@
       <w:pPr>
         <w:pStyle w:val="Heading1"/>
       </w:pPr>
-      <w:bookmarkStart w:id="102" w:name="chapter-6-learning-by-adjustment"/>
+      <w:bookmarkStart w:id="102" w:name="chapter-6"/>
       <w:r>
         <w:t xml:space="preserve">Chapter 6 — Learning by Adjustment</w:t>
       </w:r>
@@ -13360,7 +13360,7 @@
       <w:pPr>
         <w:pStyle w:val="Heading2"/>
       </w:pPr>
-      <w:bookmarkStart w:id="103" w:name="a-model-with-adjustable-parameters"/>
+      <w:bookmarkStart w:id="103" w:name="X3265169ebfd4c4f3681059cdf04affc716d181e"/>
       <w:r>
         <w:t xml:space="preserve">A Model with Adjustable Parameters</w:t>
       </w:r>
@@ -13587,7 +13587,7 @@
       <w:pPr>
         <w:pStyle w:val="Heading2"/>
       </w:pPr>
-      <w:bookmarkStart w:id="104" w:name="examples-and-their-weights"/>
+      <w:bookmarkStart w:id="104" w:name="chapter-6-examples-and-their-weights"/>
       <w:r>
         <w:t xml:space="preserve">Examples and Their Weights</w:t>
       </w:r>
@@ -14271,7 +14271,7 @@
       <w:pPr>
         <w:pStyle w:val="Heading2"/>
       </w:pPr>
-      <w:bookmarkStart w:id="105" w:name="from-loss-to-gradient"/>
+      <w:bookmarkStart w:id="105" w:name="chapter-6-from-loss-to-gradient"/>
       <w:r>
         <w:t xml:space="preserve">From Loss to Gradient</w:t>
       </w:r>
@@ -14942,7 +14942,7 @@
       <w:pPr>
         <w:pStyle w:val="Heading2"/>
       </w:pPr>
-      <w:bookmarkStart w:id="106" w:name="an-update-is-a-decision"/>
+      <w:bookmarkStart w:id="106" w:name="chapter-6-an-update-is-a-decision"/>
       <w:r>
         <w:t xml:space="preserve">An Update Is a Decision</w:t>
       </w:r>
@@ -15237,7 +15237,7 @@
       <w:pPr>
         <w:pStyle w:val="Heading2"/>
       </w:pPr>
-      <w:bookmarkStart w:id="107" w:name="the-repeated-loop"/>
+      <w:bookmarkStart w:id="107" w:name="chapter-6-the-repeated-loop"/>
       <w:r>
         <w:t xml:space="preserve">The Repeated Loop</w:t>
       </w:r>
@@ -15829,7 +15829,7 @@
       <w:pPr>
         <w:pStyle w:val="Heading2"/>
       </w:pPr>
-      <w:bookmarkStart w:id="109" w:name="direction-does-not-guarantee-a-good-step"/>
+      <w:bookmarkStart w:id="109" w:name="Xf0066358c1c75d0a6dbe6fef4aae98466b0e8f1"/>
       <w:r>
         <w:t xml:space="preserve">Direction Does Not Guarantee a Good Step</w:t>
       </w:r>
@@ -15928,7 +15928,7 @@
       <w:pPr>
         <w:pStyle w:val="Heading2"/>
       </w:pPr>
-      <w:bookmarkStart w:id="110" w:name="training-loss-is-not-generalization"/>
+      <w:bookmarkStart w:id="110" w:name="X990cc1089927d18cca87a08ec92dc6dc41ba72b"/>
       <w:r>
         <w:t xml:space="preserve">Training Loss Is Not Generalization</w:t>
       </w:r>
@@ -15977,7 +15977,7 @@
       <w:pPr>
         <w:pStyle w:val="Heading2"/>
       </w:pPr>
-      <w:bookmarkStart w:id="111" w:name="from-one-unit-to-layered-systems"/>
+      <w:bookmarkStart w:id="111" w:name="Xacc1778ad5b885dfe27311be5ac902dfb7fd486"/>
       <w:r>
         <w:t xml:space="preserve">From One Unit to Layered Systems</w:t>
       </w:r>
@@ -16011,7 +16011,7 @@
       <w:pPr>
         <w:pStyle w:val="Heading2"/>
       </w:pPr>
-      <w:bookmarkStart w:id="112" w:name="what-the-probe-establishes"/>
+      <w:bookmarkStart w:id="112" w:name="chapter-6-what-the-probe-establishes"/>
       <w:r>
         <w:t xml:space="preserve">What the Probe Establishes</w:t>
       </w:r>
@@ -16082,7 +16082,7 @@
       <w:pPr>
         <w:pStyle w:val="Heading2"/>
       </w:pPr>
-      <w:bookmarkStart w:id="113" w:name="adjustment-ready-to-scale"/>
+      <w:bookmarkStart w:id="113" w:name="chapter-6-adjustment-ready-to-scale"/>
       <w:r>
         <w:t xml:space="preserve">Adjustment Ready to Scale</w:t>
       </w:r>
@@ -16116,7 +16116,7 @@
       <w:pPr>
         <w:pStyle w:val="Heading2"/>
       </w:pPr>
-      <w:bookmarkStart w:id="114" w:name="sources-and-evidence"/>
+      <w:bookmarkStart w:id="114" w:name="chapter-6-sources-and-evidence"/>
       <w:r>
         <w:t xml:space="preserve">Sources and Evidence</w:t>
       </w:r>
@@ -16190,7 +16190,7 @@
       <w:pPr>
         <w:pStyle w:val="Heading1"/>
       </w:pPr>
-      <w:bookmarkStart w:id="119" w:name="chapter-7-tensors-and-parallel-machines"/>
+      <w:bookmarkStart w:id="119" w:name="chapter-7"/>
       <w:r>
         <w:t xml:space="preserve">Chapter 7 — Tensors and Parallel Machines</w:t>
       </w:r>
@@ -16224,7 +16224,7 @@
       <w:pPr>
         <w:pStyle w:val="Heading2"/>
       </w:pPr>
-      <w:bookmarkStart w:id="120" w:name="shape-before-arithmetic"/>
+      <w:bookmarkStart w:id="120" w:name="chapter-7-shape-before-arithmetic"/>
       <w:r>
         <w:t xml:space="preserve">Shape Before Arithmetic</w:t>
       </w:r>
@@ -16397,7 +16397,7 @@
       <w:pPr>
         <w:pStyle w:val="Heading2"/>
       </w:pPr>
-      <w:bookmarkStart w:id="121" w:name="matrix-multiplication-across-a-batch"/>
+      <w:bookmarkStart w:id="121" w:name="X440585e5228cb621a9719a90729bdd489b6efa5"/>
       <w:r>
         <w:t xml:space="preserve">Matrix Multiplication Across a Batch</w:t>
       </w:r>
@@ -16799,7 +16799,7 @@
       <w:pPr>
         <w:pStyle w:val="Heading2"/>
       </w:pPr>
-      <w:bookmarkStart w:id="122" w:name="one-output-cell"/>
+      <w:bookmarkStart w:id="122" w:name="chapter-7-one-output-cell"/>
       <w:r>
         <w:t xml:space="preserve">One Output Cell</w:t>
       </w:r>
@@ -17108,7 +17108,7 @@
       <w:pPr>
         <w:pStyle w:val="Heading2"/>
       </w:pPr>
-      <w:bookmarkStart w:id="123" w:name="from-coordinates-to-work-assignments"/>
+      <w:bookmarkStart w:id="123" w:name="X2f41cde74f278dd6d5e9105d37b285930f03898"/>
       <w:r>
         <w:t xml:space="preserve">From Coordinates to Work Assignments</w:t>
       </w:r>
@@ -17613,7 +17613,7 @@
       <w:pPr>
         <w:pStyle w:val="Heading2"/>
       </w:pPr>
-      <w:bookmarkStart w:id="125" w:name="the-missing-cell"/>
+      <w:bookmarkStart w:id="125" w:name="chapter-7-the-missing-cell"/>
       <w:r>
         <w:t xml:space="preserve">The Missing Cell</w:t>
       </w:r>
@@ -17698,7 +17698,7 @@
       <w:pPr>
         <w:pStyle w:val="Heading2"/>
       </w:pPr>
-      <w:bookmarkStart w:id="126" w:name="Xc2bc8c547bb757d687fa568d3d59b8c82d8a073"/>
+      <w:bookmarkStart w:id="126" w:name="X55bd3d360b00e57518e4b56c8e0fa845df8ffbf"/>
       <w:r>
         <w:t xml:space="preserve">Parallel Structure Is Not Parallel Execution</w:t>
       </w:r>
@@ -17755,7 +17755,7 @@
       <w:pPr>
         <w:pStyle w:val="Heading2"/>
       </w:pPr>
-      <w:bookmarkStart w:id="127" w:name="where-performance-actually-enters"/>
+      <w:bookmarkStart w:id="127" w:name="X3412c87be45baf85bf87e13ce997dc5e56939db"/>
       <w:r>
         <w:t xml:space="preserve">Where Performance Actually Enters</w:t>
       </w:r>
@@ -17789,7 +17789,7 @@
       <w:pPr>
         <w:pStyle w:val="Heading2"/>
       </w:pPr>
-      <w:bookmarkStart w:id="128" w:name="what-the-probe-establishes"/>
+      <w:bookmarkStart w:id="128" w:name="chapter-7-what-the-probe-establishes"/>
       <w:r>
         <w:t xml:space="preserve">What the Probe Establishes</w:t>
       </w:r>
@@ -17830,7 +17830,7 @@
       <w:pPr>
         <w:pStyle w:val="Heading2"/>
       </w:pPr>
-      <w:bookmarkStart w:id="129" w:name="shaped-work-ready-for-later-systems"/>
+      <w:bookmarkStart w:id="129" w:name="X2d6a0520e9c265748444003f5453a890951319b"/>
       <w:r>
         <w:t xml:space="preserve">Shaped Work Ready for Later Systems</w:t>
       </w:r>
@@ -17864,7 +17864,7 @@
       <w:pPr>
         <w:pStyle w:val="Heading2"/>
       </w:pPr>
-      <w:bookmarkStart w:id="130" w:name="sources-and-evidence"/>
+      <w:bookmarkStart w:id="130" w:name="chapter-7-sources-and-evidence"/>
       <w:r>
         <w:t xml:space="preserve">Sources and Evidence</w:t>
       </w:r>
@@ -17938,7 +17938,7 @@
       <w:pPr>
         <w:pStyle w:val="Heading1"/>
       </w:pPr>
-      <w:bookmarkStart w:id="135" w:name="chapter-8-learned-spaces"/>
+      <w:bookmarkStart w:id="135" w:name="chapter-8"/>
       <w:r>
         <w:t xml:space="preserve">Chapter 8 — Learned Spaces</w:t>
       </w:r>
@@ -17972,7 +17972,7 @@
       <w:pPr>
         <w:pStyle w:val="Heading2"/>
       </w:pPr>
-      <w:bookmarkStart w:id="136" w:name="what-makes-a-space-learned"/>
+      <w:bookmarkStart w:id="136" w:name="chapter-8-what-makes-a-space-learned"/>
       <w:r>
         <w:t xml:space="preserve">What Makes a Space Learned</w:t>
       </w:r>
@@ -18029,7 +18029,7 @@
       <w:pPr>
         <w:pStyle w:val="Heading2"/>
       </w:pPr>
-      <w:bookmarkStart w:id="137" w:name="coordinates-are-not-their-labels"/>
+      <w:bookmarkStart w:id="137" w:name="Xa8fb180c7d02db4df4833975e66f0a639c0f572"/>
       <w:r>
         <w:t xml:space="preserve">Coordinates Are Not Their Labels</w:t>
       </w:r>
@@ -18277,7 +18277,7 @@
       <w:pPr>
         <w:pStyle w:val="Heading2"/>
       </w:pPr>
-      <w:bookmarkStart w:id="138" w:name="two-ways-to-be-near"/>
+      <w:bookmarkStart w:id="138" w:name="chapter-8-two-ways-to-be-near"/>
       <w:r>
         <w:t xml:space="preserve">Two Ways to Be Near</w:t>
       </w:r>
@@ -18877,7 +18877,7 @@
       <w:pPr>
         <w:pStyle w:val="Heading2"/>
       </w:pPr>
-      <w:bookmarkStart w:id="139" w:name="a-transformation-that-preserves-distance"/>
+      <w:bookmarkStart w:id="139" w:name="X310bd15d2ff42e39f27cafecec5de1df6793905"/>
       <w:r>
         <w:t xml:space="preserve">A Transformation That Preserves Distance</w:t>
       </w:r>
@@ -19087,7 +19087,7 @@
       <w:pPr>
         <w:pStyle w:val="Heading2"/>
       </w:pPr>
-      <w:bookmarkStart w:id="140" w:name="X5a3727eea06d94041f799431dee431099199679"/>
+      <w:bookmarkStart w:id="140" w:name="X633ecf68414941376f8107c5e35a7c91c71ae4c"/>
       <w:r>
         <w:t xml:space="preserve">Invertible Does Not Mean Distance-Preserving</w:t>
       </w:r>
@@ -19299,7 +19299,7 @@
       <w:pPr>
         <w:pStyle w:val="Heading2"/>
       </w:pPr>
-      <w:bookmarkStart w:id="142" w:name="geometry-across-training-and-context"/>
+      <w:bookmarkStart w:id="142" w:name="Xfe0ff668d2a970f22ed9116526036bc05cb97ab"/>
       <w:r>
         <w:t xml:space="preserve">Geometry Across Training and Context</w:t>
       </w:r>
@@ -19325,7 +19325,7 @@
       <w:pPr>
         <w:pStyle w:val="Heading2"/>
       </w:pPr>
-      <w:bookmarkStart w:id="143" w:name="from-regularity-to-interpretation"/>
+      <w:bookmarkStart w:id="143" w:name="X30203e97e7efbebbcb1b87a738f1bb1e5da13af"/>
       <w:r>
         <w:t xml:space="preserve">From Regularity to Interpretation</w:t>
       </w:r>
@@ -19359,7 +19359,7 @@
       <w:pPr>
         <w:pStyle w:val="Heading2"/>
       </w:pPr>
-      <w:bookmarkStart w:id="144" w:name="what-the-probe-establishes"/>
+      <w:bookmarkStart w:id="144" w:name="chapter-8-what-the-probe-establishes"/>
       <w:r>
         <w:t xml:space="preserve">What the Probe Establishes</w:t>
       </w:r>
@@ -19430,7 +19430,7 @@
       <w:pPr>
         <w:pStyle w:val="Heading2"/>
       </w:pPr>
-      <w:bookmarkStart w:id="145" w:name="geometry-ready-for-convergence"/>
+      <w:bookmarkStart w:id="145" w:name="chapter-8-geometry-ready-for-convergence"/>
       <w:r>
         <w:t xml:space="preserve">Geometry Ready for Convergence</w:t>
       </w:r>
@@ -19456,7 +19456,7 @@
       <w:pPr>
         <w:pStyle w:val="Heading2"/>
       </w:pPr>
-      <w:bookmarkStart w:id="146" w:name="sources-and-evidence"/>
+      <w:bookmarkStart w:id="146" w:name="chapter-8-sources-and-evidence"/>
       <w:r>
         <w:t xml:space="preserve">Sources and Evidence</w:t>
       </w:r>
@@ -19530,7 +19530,7 @@
       <w:pPr>
         <w:pStyle w:val="Heading1"/>
       </w:pPr>
-      <w:bookmarkStart w:id="151" w:name="chapter-9-sequence-memory-and-runtime"/>
+      <w:bookmarkStart w:id="151" w:name="chapter-9"/>
       <w:r>
         <w:t xml:space="preserve">Chapter 9 — Sequence, Memory, and Runtime</w:t>
       </w:r>
@@ -19564,7 +19564,7 @@
       <w:pPr>
         <w:pStyle w:val="Heading2"/>
       </w:pPr>
-      <w:bookmarkStart w:id="152" w:name="order-before-recurrence"/>
+      <w:bookmarkStart w:id="152" w:name="chapter-9-order-before-recurrence"/>
       <w:r>
         <w:t xml:space="preserve">Order Before Recurrence</w:t>
       </w:r>
@@ -20389,7 +20389,7 @@
       <w:pPr>
         <w:pStyle w:val="Heading2"/>
       </w:pPr>
-      <w:bookmarkStart w:id="153" w:name="the-path-through-time"/>
+      <w:bookmarkStart w:id="153" w:name="chapter-9-the-path-through-time"/>
       <w:r>
         <w:t xml:space="preserve">The Path Through Time</w:t>
       </w:r>
@@ -20602,7 +20602,7 @@
       <w:pPr>
         <w:pStyle w:val="Heading2"/>
       </w:pPr>
-      <w:bookmarkStart w:id="154" w:name="sensitivity-across-the-path"/>
+      <w:bookmarkStart w:id="154" w:name="chapter-9-sensitivity-across-the-path"/>
       <w:r>
         <w:t xml:space="preserve">Sensitivity Across the Path</w:t>
       </w:r>
@@ -21417,7 +21417,7 @@
       <w:pPr>
         <w:pStyle w:val="Heading2"/>
       </w:pPr>
-      <w:bookmarkStart w:id="156" w:name="breaking-the-recurrent-link"/>
+      <w:bookmarkStart w:id="156" w:name="chapter-9-breaking-the-recurrent-link"/>
       <w:r>
         <w:t xml:space="preserve">Breaking the Recurrent Link</w:t>
       </w:r>
@@ -21788,7 +21788,7 @@
       <w:pPr>
         <w:pStyle w:val="Heading2"/>
       </w:pPr>
-      <w:bookmarkStart w:id="157" w:name="what-the-counts-do-not-measure"/>
+      <w:bookmarkStart w:id="157" w:name="chapter-9-what-the-counts-do-not-measure"/>
       <w:r>
         <w:t xml:space="preserve">What the Counts Do Not Measure</w:t>
       </w:r>
@@ -21865,7 +21865,7 @@
       <w:pPr>
         <w:pStyle w:val="Heading2"/>
       </w:pPr>
-      <w:bookmarkStart w:id="158" w:name="why-gates-entered-the-architecture"/>
+      <w:bookmarkStart w:id="158" w:name="X7e7b4a809b4b461860289788618964876a0af72"/>
       <w:r>
         <w:t xml:space="preserve">Why Gates Entered the Architecture</w:t>
       </w:r>
@@ -21899,7 +21899,7 @@
       <w:pPr>
         <w:pStyle w:val="Heading2"/>
       </w:pPr>
-      <w:bookmarkStart w:id="159" w:name="the-bottleneck-precisely"/>
+      <w:bookmarkStart w:id="159" w:name="chapter-9-the-bottleneck-precisely"/>
       <w:r>
         <w:t xml:space="preserve">The Bottleneck, Precisely</w:t>
       </w:r>
@@ -21972,7 +21972,7 @@
       <w:pPr>
         <w:pStyle w:val="Heading2"/>
       </w:pPr>
-      <w:bookmarkStart w:id="160" w:name="what-the-probe-establishes"/>
+      <w:bookmarkStart w:id="160" w:name="chapter-9-what-the-probe-establishes"/>
       <w:r>
         <w:t xml:space="preserve">What the Probe Establishes</w:t>
       </w:r>
@@ -22027,7 +22027,7 @@
       <w:pPr>
         <w:pStyle w:val="Heading2"/>
       </w:pPr>
-      <w:bookmarkStart w:id="161" w:name="X2416e75f87d4bb89a27879f96365b9689ee508a"/>
+      <w:bookmarkStart w:id="161" w:name="X640c13c3ec6c08105aa6aaf3f8463e2d07f5a7e"/>
       <w:r>
         <w:t xml:space="preserve">Part II: The Constraint Attention Inherits</w:t>
       </w:r>
@@ -22053,7 +22053,7 @@
       <w:pPr>
         <w:pStyle w:val="Heading2"/>
       </w:pPr>
-      <w:bookmarkStart w:id="162" w:name="sources-and-evidence"/>
+      <w:bookmarkStart w:id="162" w:name="chapter-9-sources-and-evidence"/>
       <w:r>
         <w:t xml:space="preserve">Sources and Evidence</w:t>
       </w:r>
@@ -22127,7 +22127,7 @@
       <w:pPr>
         <w:pStyle w:val="Heading1"/>
       </w:pPr>
-      <w:bookmarkStart w:id="167" w:name="chapter-10-attention-changes-the-path"/>
+      <w:bookmarkStart w:id="167" w:name="chapter-10"/>
       <w:r>
         <w:t xml:space="preserve">Chapter 10 — Attention Changes the Path</w:t>
       </w:r>
@@ -22161,7 +22161,7 @@
       <w:pPr>
         <w:pStyle w:val="Heading2"/>
       </w:pPr>
-      <w:bookmarkStart w:id="168" w:name="three-roles-at-each-position"/>
+      <w:bookmarkStart w:id="168" w:name="chapter-10-three-roles-at-each-position"/>
       <w:r>
         <w:t xml:space="preserve">Three Roles at Each Position</w:t>
       </w:r>
@@ -22587,7 +22587,7 @@
       <w:pPr>
         <w:pStyle w:val="Heading2"/>
       </w:pPr>
-      <w:bookmarkStart w:id="169" w:name="scores-become-weights"/>
+      <w:bookmarkStart w:id="169" w:name="chapter-10-scores-become-weights"/>
       <w:r>
         <w:t xml:space="preserve">Scores Become Weights</w:t>
       </w:r>
@@ -22795,7 +22795,7 @@
       <w:pPr>
         <w:pStyle w:val="Heading2"/>
       </w:pPr>
-      <w:bookmarkStart w:id="170" w:name="weights-act-on-values"/>
+      <w:bookmarkStart w:id="170" w:name="chapter-10-weights-act-on-values"/>
       <w:r>
         <w:t xml:space="preserve">Weights Act on Values</w:t>
       </w:r>
@@ -23422,7 +23422,7 @@
       <w:pPr>
         <w:pStyle w:val="Heading2"/>
       </w:pPr>
-      <w:bookmarkStart w:id="171" w:name="a-direct-contribution-path"/>
+      <w:bookmarkStart w:id="171" w:name="chapter-10-a-direct-contribution-path"/>
       <w:r>
         <w:t xml:space="preserve">A Direct Contribution Path</w:t>
       </w:r>
@@ -23717,7 +23717,7 @@
       <w:pPr>
         <w:pStyle w:val="Heading2"/>
       </w:pPr>
-      <w:bookmarkStart w:id="173" w:name="hold-the-weights-fixed"/>
+      <w:bookmarkStart w:id="173" w:name="chapter-10-hold-the-weights-fixed"/>
       <w:r>
         <w:t xml:space="preserve">Hold the Weights Fixed</w:t>
       </w:r>
@@ -23965,7 +23965,7 @@
       <w:pPr>
         <w:pStyle w:val="Heading2"/>
       </w:pPr>
-      <w:bookmarkStart w:id="174" w:name="masking-changes-the-admitted-set"/>
+      <w:bookmarkStart w:id="174" w:name="X05880b48fd5b0a68734c840407b53e30ae6aa48"/>
       <w:r>
         <w:t xml:space="preserve">Masking Changes the Admitted Set</w:t>
       </w:r>
@@ -24035,7 +24035,7 @@
       <w:pPr>
         <w:pStyle w:val="Heading2"/>
       </w:pPr>
-      <w:bookmarkStart w:id="175" w:name="from-alignment-to-self-attention"/>
+      <w:bookmarkStart w:id="175" w:name="X08c5dd8afe3eb0c034f6411338b7f1a3ef4e725"/>
       <w:r>
         <w:t xml:space="preserve">From Alignment to Self-Attention</w:t>
       </w:r>
@@ -24069,7 +24069,7 @@
       <w:pPr>
         <w:pStyle w:val="Heading2"/>
       </w:pPr>
-      <w:bookmarkStart w:id="176" w:name="attention-weight-is-not-explanation"/>
+      <w:bookmarkStart w:id="176" w:name="X322d773348c0471fd226f4bfbfea336687ea7a7"/>
       <w:r>
         <w:t xml:space="preserve">Attention Weight Is Not Explanation</w:t>
       </w:r>
@@ -24167,7 +24167,7 @@
       <w:pPr>
         <w:pStyle w:val="Heading2"/>
       </w:pPr>
-      <w:bookmarkStart w:id="177" w:name="what-the-probe-establishes"/>
+      <w:bookmarkStart w:id="177" w:name="chapter-10-what-the-probe-establishes"/>
       <w:r>
         <w:t xml:space="preserve">What the Probe Establishes</w:t>
       </w:r>
@@ -24224,7 +24224,7 @@
       <w:pPr>
         <w:pStyle w:val="Heading2"/>
       </w:pPr>
-      <w:bookmarkStart w:id="178" w:name="attention-ready-for-architecture"/>
+      <w:bookmarkStart w:id="178" w:name="X2f8f8afe554c277d01736113f87a57e74bec495"/>
       <w:r>
         <w:t xml:space="preserve">Attention Ready for Architecture</w:t>
       </w:r>
@@ -24250,7 +24250,7 @@
       <w:pPr>
         <w:pStyle w:val="Heading2"/>
       </w:pPr>
-      <w:bookmarkStart w:id="179" w:name="sources-and-evidence"/>
+      <w:bookmarkStart w:id="179" w:name="chapter-10-sources-and-evidence"/>
       <w:r>
         <w:t xml:space="preserve">Sources and Evidence</w:t>
       </w:r>
@@ -24324,7 +24324,7 @@
       <w:pPr>
         <w:pStyle w:val="Heading1"/>
       </w:pPr>
-      <w:bookmarkStart w:id="184" w:name="chapter-11-the-transformer"/>
+      <w:bookmarkStart w:id="184" w:name="chapter-11"/>
       <w:r>
         <w:t xml:space="preserve">Chapter 11 — The Transformer</w:t>
       </w:r>
@@ -24358,7 +24358,7 @@
       <w:pPr>
         <w:pStyle w:val="Heading2"/>
       </w:pPr>
-      <w:bookmarkStart w:id="185" w:name="attention-is-a-component-not-the-whole"/>
+      <w:bookmarkStart w:id="185" w:name="X3a72c8ad132b55b1974abb72e326c71e5cb91bf"/>
       <w:r>
         <w:t xml:space="preserve">Attention Is a Component, Not the Whole</w:t>
       </w:r>
@@ -24478,7 +24478,7 @@
       <w:pPr>
         <w:pStyle w:val="Heading2"/>
       </w:pPr>
-      <w:bookmarkStart w:id="186" w:name="fixed-fixture-and-declared-shapes"/>
+      <w:bookmarkStart w:id="186" w:name="X6395ae818d0dfbb7174116218f2aaa5d8b10ec4"/>
       <w:r>
         <w:t xml:space="preserve">Fixed Fixture and Declared Shapes</w:t>
       </w:r>
@@ -25201,7 +25201,7 @@
       <w:pPr>
         <w:pStyle w:val="Heading2"/>
       </w:pPr>
-      <w:bookmarkStart w:id="187" w:name="two-heads-distinct-rows"/>
+      <w:bookmarkStart w:id="187" w:name="chapter-11-two-heads-distinct-rows"/>
       <w:r>
         <w:t xml:space="preserve">Two Heads, Distinct Rows</w:t>
       </w:r>
@@ -25367,7 +25367,7 @@
       <w:pPr>
         <w:pStyle w:val="Heading2"/>
       </w:pPr>
-      <w:bookmarkStart w:id="188" w:name="X2909e0453f3823c447bcdcfaab5a330e506a4cc"/>
+      <w:bookmarkStart w:id="188" w:name="X250a9fc3468c306e21d6f770a2729b5c21c33a5"/>
       <w:r>
         <w:t xml:space="preserve">Output Projection and First Residual Interface</w:t>
       </w:r>
@@ -25650,7 +25650,7 @@
       <w:pPr>
         <w:pStyle w:val="Heading2"/>
       </w:pPr>
-      <w:bookmarkStart w:id="189" w:name="Xd87fb6bfaeb61ab450312f92bdf1af17a1c9f35"/>
+      <w:bookmarkStart w:id="189" w:name="X6bee991af437dad8c6807a2c60602cffa48667d"/>
       <w:r>
         <w:t xml:space="preserve">Positionwise Feed-Forward and Second Residual Interface</w:t>
       </w:r>
@@ -26129,7 +26129,7 @@
       <w:pPr>
         <w:pStyle w:val="Heading2"/>
       </w:pPr>
-      <w:bookmarkStart w:id="191" w:name="control-remove-projected-attention"/>
+      <w:bookmarkStart w:id="191" w:name="Xcb038a719b7d8fe335d9671e1605bc0745a6c61"/>
       <w:r>
         <w:t xml:space="preserve">Control: Remove Projected Attention</w:t>
       </w:r>
@@ -26383,7 +26383,7 @@
       <w:pPr>
         <w:pStyle w:val="Heading2"/>
       </w:pPr>
-      <w:bookmarkStart w:id="192" w:name="encoder-block-boundary-in-this-chapter"/>
+      <w:bookmarkStart w:id="192" w:name="X97c1393ddf3f8da670f60db09f01b3619b8f082"/>
       <w:r>
         <w:t xml:space="preserve">Encoder-Block Boundary in This Chapter</w:t>
       </w:r>
@@ -26417,7 +26417,7 @@
       <w:pPr>
         <w:pStyle w:val="Heading2"/>
       </w:pPr>
-      <w:bookmarkStart w:id="193" w:name="what-this-chapter-does-not-claim"/>
+      <w:bookmarkStart w:id="193" w:name="Xde3985f9e508ec6cad5e272729ad7f84c2b9110"/>
       <w:r>
         <w:t xml:space="preserve">What This Chapter Does Not Claim</w:t>
       </w:r>
@@ -26511,7 +26511,7 @@
       <w:pPr>
         <w:pStyle w:val="Heading2"/>
       </w:pPr>
-      <w:bookmarkStart w:id="194" w:name="historical-and-technical-anchors"/>
+      <w:bookmarkStart w:id="194" w:name="X38e9db9ddfa5f346ed5940add97b5768c074929"/>
       <w:r>
         <w:t xml:space="preserve">Historical and Technical Anchors</w:t>
       </w:r>
@@ -26573,7 +26573,7 @@
       <w:pPr>
         <w:pStyle w:val="Heading2"/>
       </w:pPr>
-      <w:bookmarkStart w:id="195" w:name="interface-clarity-before-scale"/>
+      <w:bookmarkStart w:id="195" w:name="X925d9203261d546b8417f0c6f5e768a7e4e5244"/>
       <w:r>
         <w:t xml:space="preserve">Interface Clarity Before Scale</w:t>
       </w:r>
@@ -26655,7 +26655,7 @@
       <w:pPr>
         <w:pStyle w:val="Heading2"/>
       </w:pPr>
-      <w:bookmarkStart w:id="196" w:name="what-the-probe-establishes"/>
+      <w:bookmarkStart w:id="196" w:name="chapter-11-what-the-probe-establishes"/>
       <w:r>
         <w:t xml:space="preserve">What the Probe Establishes</w:t>
       </w:r>
@@ -26765,7 +26765,7 @@
       <w:pPr>
         <w:pStyle w:val="Heading2"/>
       </w:pPr>
-      <w:bookmarkStart w:id="197" w:name="transition-to-chapter-12"/>
+      <w:bookmarkStart w:id="197" w:name="chapter-11-transition-to-chapter-12"/>
       <w:r>
         <w:t xml:space="preserve">Transition to Chapter 12</w:t>
       </w:r>
@@ -26783,7 +26783,7 @@
       <w:pPr>
         <w:pStyle w:val="Heading2"/>
       </w:pPr>
-      <w:bookmarkStart w:id="198" w:name="sources-and-evidence"/>
+      <w:bookmarkStart w:id="198" w:name="chapter-11-sources-and-evidence"/>
       <w:r>
         <w:t xml:space="preserve">Sources and Evidence</w:t>
       </w:r>
@@ -26857,7 +26857,7 @@
       <w:pPr>
         <w:pStyle w:val="Heading1"/>
       </w:pPr>
-      <w:bookmarkStart w:id="203" w:name="chapter-12-from-paper-to-tool"/>
+      <w:bookmarkStart w:id="203" w:name="chapter-12"/>
       <w:r>
         <w:t xml:space="preserve">Chapter 12 — From Paper to Tool</w:t>
       </w:r>
@@ -26891,7 +26891,7 @@
       <w:pPr>
         <w:pStyle w:val="Heading2"/>
       </w:pPr>
-      <w:bookmarkStart w:id="204" w:name="Xb0eef797891849191cabe92f21db9583b6fac3f"/>
+      <w:bookmarkStart w:id="204" w:name="Xb6fa295e6e972b46a299fa42fd7ad81d948832b"/>
       <w:r>
         <w:t xml:space="preserve">The Architecture Is an Implementation Target</w:t>
       </w:r>
@@ -27075,7 +27075,7 @@
       <w:pPr>
         <w:pStyle w:val="Heading2"/>
       </w:pPr>
-      <w:bookmarkStart w:id="205" w:name="X207d3357688916efd7146a75522163e08328b3c"/>
+      <w:bookmarkStart w:id="205" w:name="X7852f0fcb70c7b45dc8274075c6d923218acb5d"/>
       <w:r>
         <w:t xml:space="preserve">A Framework Supplies Operations, Not This Model</w:t>
       </w:r>
@@ -27160,7 +27160,7 @@
       <w:pPr>
         <w:pStyle w:val="Heading2"/>
       </w:pPr>
-      <w:bookmarkStart w:id="206" w:name="a-package-binds-metadata-to-parameters"/>
+      <w:bookmarkStart w:id="206" w:name="X241e83cee811deb5f6331e6837a96f0f6f5a3e1"/>
       <w:r>
         <w:t xml:space="preserve">A Package Binds Metadata to Parameters</w:t>
       </w:r>
@@ -27236,7 +27236,7 @@
       <w:pPr>
         <w:pStyle w:val="Heading2"/>
       </w:pPr>
-      <w:bookmarkStart w:id="207" w:name="parsing-is-not-validation"/>
+      <w:bookmarkStart w:id="207" w:name="chapter-12-parsing-is-not-validation"/>
       <w:r>
         <w:t xml:space="preserve">Parsing Is Not Validation</w:t>
       </w:r>
@@ -27374,7 +27374,7 @@
       <w:pPr>
         <w:pStyle w:val="Heading2"/>
       </w:pPr>
-      <w:bookmarkStart w:id="208" w:name="runtime-selection-is-a-separate-contract"/>
+      <w:bookmarkStart w:id="208" w:name="X8a7e68bbb7b7e5afbac982ec71af91cd731699c"/>
       <w:r>
         <w:t xml:space="preserve">Runtime Selection Is a Separate Contract</w:t>
       </w:r>
@@ -27501,7 +27501,7 @@
       <w:pPr>
         <w:pStyle w:val="Heading2"/>
       </w:pPr>
-      <w:bookmarkStart w:id="210" w:name="X7d27ecb2a38533bd7bf0bfae43f4da0dee6a245"/>
+      <w:bookmarkStart w:id="210" w:name="X7d712b0783ee9e4e1f7afa998f66a39af0d9c2c"/>
       <w:r>
         <w:t xml:space="preserve">The Callable Boundary Translates Requests</w:t>
       </w:r>
@@ -27790,7 +27790,7 @@
       <w:pPr>
         <w:pStyle w:val="Heading2"/>
       </w:pPr>
-      <w:bookmarkStart w:id="211" w:name="reload-must-preserve-behavior"/>
+      <w:bookmarkStart w:id="211" w:name="chapter-12-reload-must-preserve-behavior"/>
       <w:r>
         <w:t xml:space="preserve">Reload Must Preserve Behavior</w:t>
       </w:r>
@@ -27824,7 +27824,7 @@
       <w:pPr>
         <w:pStyle w:val="Heading2"/>
       </w:pPr>
-      <w:bookmarkStart w:id="212" w:name="corrupt-one-contract-stop-early"/>
+      <w:bookmarkStart w:id="212" w:name="X053187ac9b2fe7b940acb3e87fc234e96cf009c"/>
       <w:r>
         <w:t xml:space="preserve">Corrupt One Contract, Stop Early</w:t>
       </w:r>
@@ -27880,7 +27880,7 @@
       <w:pPr>
         <w:pStyle w:val="Heading2"/>
       </w:pPr>
-      <w:bookmarkStart w:id="213" w:name="what-became-callable"/>
+      <w:bookmarkStart w:id="213" w:name="chapter-12-what-became-callable"/>
       <w:r>
         <w:t xml:space="preserve">What Became Callable</w:t>
       </w:r>
@@ -28007,7 +28007,7 @@
       <w:pPr>
         <w:pStyle w:val="Heading2"/>
       </w:pPr>
-      <w:bookmarkStart w:id="214" w:name="the-boundary-of-the-tool"/>
+      <w:bookmarkStart w:id="214" w:name="chapter-12-the-boundary-of-the-tool"/>
       <w:r>
         <w:t xml:space="preserve">The Boundary of the Tool</w:t>
       </w:r>
@@ -28041,7 +28041,7 @@
       <w:pPr>
         <w:pStyle w:val="Heading2"/>
       </w:pPr>
-      <w:bookmarkStart w:id="215" w:name="sources-and-evidence"/>
+      <w:bookmarkStart w:id="215" w:name="chapter-12-sources-and-evidence"/>
       <w:r>
         <w:t xml:space="preserve">Sources and Evidence</w:t>
       </w:r>
@@ -28115,7 +28115,7 @@
       <w:pPr>
         <w:pStyle w:val="Heading1"/>
       </w:pPr>
-      <w:bookmarkStart w:id="220" w:name="chapter-13-where-the-journeys-meet"/>
+      <w:bookmarkStart w:id="220" w:name="chapter-13"/>
       <w:r>
         <w:t xml:space="preserve">Chapter 13 — Where the Journeys Meet</w:t>
       </w:r>
@@ -28161,7 +28161,7 @@
       <w:pPr>
         <w:pStyle w:val="Heading2"/>
       </w:pPr>
-      <w:bookmarkStart w:id="221" w:name="convergence-begins-with-edges"/>
+      <w:bookmarkStart w:id="221" w:name="chapter-13-convergence-begins-with-edges"/>
       <w:r>
         <w:t xml:space="preserve">Convergence Begins with Edges</w:t>
       </w:r>
@@ -28290,7 +28290,7 @@
       <w:pPr>
         <w:pStyle w:val="Heading2"/>
       </w:pPr>
-      <w:bookmarkStart w:id="222" w:name="what-ai-exports"/>
+      <w:bookmarkStart w:id="222" w:name="chapter-13-what-ai-exports"/>
       <w:r>
         <w:t xml:space="preserve">What AI Exports</w:t>
       </w:r>
@@ -28351,7 +28351,7 @@
       <w:pPr>
         <w:pStyle w:val="Heading2"/>
       </w:pPr>
-      <w:bookmarkStart w:id="223" w:name="what-mathematics-exports"/>
+      <w:bookmarkStart w:id="223" w:name="chapter-13-what-mathematics-exports"/>
       <w:r>
         <w:t xml:space="preserve">What Mathematics Exports</w:t>
       </w:r>
@@ -28412,7 +28412,7 @@
       <w:pPr>
         <w:pStyle w:val="Heading2"/>
       </w:pPr>
-      <w:bookmarkStart w:id="224" w:name="what-programming-exports"/>
+      <w:bookmarkStart w:id="224" w:name="chapter-13-what-programming-exports"/>
       <w:r>
         <w:t xml:space="preserve">What Programming Exports</w:t>
       </w:r>
@@ -28473,7 +28473,7 @@
       <w:pPr>
         <w:pStyle w:val="Heading2"/>
       </w:pPr>
-      <w:bookmarkStart w:id="225" w:name="exact-matching-preserves-identity"/>
+      <w:bookmarkStart w:id="225" w:name="X17ed994d1f67a43d6602beea95a4e967c393a4d"/>
       <w:r>
         <w:t xml:space="preserve">Exact Matching Preserves Identity</w:t>
       </w:r>
@@ -28689,7 +28689,7 @@
       <w:pPr>
         <w:pStyle w:val="Heading2"/>
       </w:pPr>
-      <w:bookmarkStart w:id="227" w:name="control-one-remove-an-edge"/>
+      <w:bookmarkStart w:id="227" w:name="chapter-13-control-one-remove-an-edge"/>
       <w:r>
         <w:t xml:space="preserve">Control One: Remove an Edge</w:t>
       </w:r>
@@ -28799,7 +28799,7 @@
       <w:pPr>
         <w:pStyle w:val="Heading2"/>
       </w:pPr>
-      <w:bookmarkStart w:id="228" w:name="control-two-reject-a-familiar-word"/>
+      <w:bookmarkStart w:id="228" w:name="Xbdbacacd6710ff2cb31d7f0311923e3ffc7b809"/>
       <w:r>
         <w:t xml:space="preserve">Control Two: Reject a Familiar Word</w:t>
       </w:r>
@@ -28896,7 +28896,7 @@
       <w:pPr>
         <w:pStyle w:val="Heading2"/>
       </w:pPr>
-      <w:bookmarkStart w:id="229" w:name="one-aligned-technical-handoff"/>
+      <w:bookmarkStart w:id="229" w:name="chapter-13-one-aligned-technical-handoff"/>
       <w:r>
         <w:t xml:space="preserve">One Aligned Technical Handoff</w:t>
       </w:r>
@@ -28956,7 +28956,7 @@
       <w:pPr>
         <w:pStyle w:val="Heading2"/>
       </w:pPr>
-      <w:bookmarkStart w:id="230" w:name="what-the-probe-establishes"/>
+      <w:bookmarkStart w:id="230" w:name="chapter-13-what-the-probe-establishes"/>
       <w:r>
         <w:t xml:space="preserve">What the Probe Establishes</w:t>
       </w:r>
@@ -28990,7 +28990,7 @@
       <w:pPr>
         <w:pStyle w:val="Heading2"/>
       </w:pPr>
-      <w:bookmarkStart w:id="231" w:name="sources-and-evidence"/>
+      <w:bookmarkStart w:id="231" w:name="chapter-13-sources-and-evidence"/>
       <w:r>
         <w:t xml:space="preserve">Sources and Evidence</w:t>
       </w:r>
@@ -29064,7 +29064,7 @@
       <w:pPr>
         <w:pStyle w:val="Heading1"/>
       </w:pPr>
-      <w:bookmarkStart w:id="236" w:name="chapter-14-architecture-in-full"/>
+      <w:bookmarkStart w:id="236" w:name="chapter-14"/>
       <w:r>
         <w:t xml:space="preserve">Chapter 14 — Architecture in Full</w:t>
       </w:r>
@@ -29113,7 +29113,7 @@
       <w:pPr>
         <w:pStyle w:val="Heading2"/>
       </w:pPr>
-      <w:bookmarkStart w:id="237" w:name="one-identity-four-selections"/>
+      <w:bookmarkStart w:id="237" w:name="chapter-14-one-identity-four-selections"/>
       <w:r>
         <w:t xml:space="preserve">One Identity, Four Selections</w:t>
       </w:r>
@@ -29202,7 +29202,7 @@
       <w:pPr>
         <w:pStyle w:val="Heading2"/>
       </w:pPr>
-      <w:bookmarkStart w:id="238" w:name="system-scale-the-external-boundary"/>
+      <w:bookmarkStart w:id="238" w:name="X4906e011486c00f686663ef9a4bcaa98825794b"/>
       <w:r>
         <w:t xml:space="preserve">System Scale: The External Boundary</w:t>
       </w:r>
@@ -29263,7 +29263,7 @@
       <w:pPr>
         <w:pStyle w:val="Heading2"/>
       </w:pPr>
-      <w:bookmarkStart w:id="239" w:name="stack-scale-repetition-without-collapse"/>
+      <w:bookmarkStart w:id="239" w:name="X77ccdcb91722f48f305a5d6ad97c46b82a16a72"/>
       <w:r>
         <w:t xml:space="preserve">Stack Scale: Repetition Without Collapse</w:t>
       </w:r>
@@ -29346,7 +29346,7 @@
       <w:pPr>
         <w:pStyle w:val="Heading2"/>
       </w:pPr>
-      <w:bookmarkStart w:id="240" w:name="block-scale-the-local-assembly"/>
+      <w:bookmarkStart w:id="240" w:name="Xfe51faa73ce28c9e12205deeab2aefcbf0220f3"/>
       <w:r>
         <w:t xml:space="preserve">Block Scale: The Local Assembly</w:t>
       </w:r>
@@ -29380,7 +29380,7 @@
       <w:pPr>
         <w:pStyle w:val="Heading2"/>
       </w:pPr>
-      <w:bookmarkStart w:id="241" w:name="X2a295802e6db67e3292a841890e00cdc3bc2ff6"/>
+      <w:bookmarkStart w:id="241" w:name="Xe849076e9ee518dbb6dc3e178e864f371507bb0"/>
       <w:r>
         <w:t xml:space="preserve">Operation Scale: Attention as Selected Detail</w:t>
       </w:r>
@@ -29480,7 +29480,7 @@
       <w:pPr>
         <w:pStyle w:val="Heading2"/>
       </w:pPr>
-      <w:bookmarkStart w:id="243" w:name="Xf04a2dcbae77792677287716c2be793e094a3f1"/>
+      <w:bookmarkStart w:id="243" w:name="Xe265c6d53c183ca3b3e43a1fd484a2609bfb108"/>
       <w:r>
         <w:t xml:space="preserve">Exact Containment, Not a Suggestive Nesting</w:t>
       </w:r>
@@ -29551,7 +29551,7 @@
       <w:pPr>
         <w:pStyle w:val="Heading2"/>
       </w:pPr>
-      <w:bookmarkStart w:id="244" w:name="containment-is-not-execution-order"/>
+      <w:bookmarkStart w:id="244" w:name="X1d6062dbc575e167cb43f5cd11c6bc7f4a72d4b"/>
       <w:r>
         <w:t xml:space="preserve">Containment Is Not Execution Order</w:t>
       </w:r>
@@ -29621,7 +29621,7 @@
       <w:pPr>
         <w:pStyle w:val="Heading2"/>
       </w:pPr>
-      <w:bookmarkStart w:id="245" w:name="X808c7277c80790c130e048d17516d277e0604a9"/>
+      <w:bookmarkStart w:id="245" w:name="X08f262fd7d53fc2ec9f10621526b1e5189bcc9c"/>
       <w:r>
         <w:t xml:space="preserve">Control: One Attention Row Claims the System</w:t>
       </w:r>
@@ -29754,7 +29754,7 @@
       <w:pPr>
         <w:pStyle w:val="Heading2"/>
       </w:pPr>
-      <w:bookmarkStart w:id="246" w:name="what-the-four-views-establish"/>
+      <w:bookmarkStart w:id="246" w:name="chapter-14-what-the-four-views-establish"/>
       <w:r>
         <w:t xml:space="preserve">What the Four Views Establish</w:t>
       </w:r>
@@ -29780,7 +29780,7 @@
       <w:pPr>
         <w:pStyle w:val="Heading2"/>
       </w:pPr>
-      <w:bookmarkStart w:id="247" w:name="two-exact-handoffs"/>
+      <w:bookmarkStart w:id="247" w:name="chapter-14-two-exact-handoffs"/>
       <w:r>
         <w:t xml:space="preserve">Two Exact Handoffs</w:t>
       </w:r>
@@ -29834,7 +29834,7 @@
       <w:pPr>
         <w:pStyle w:val="Heading2"/>
       </w:pPr>
-      <w:bookmarkStart w:id="248" w:name="sources-and-evidence"/>
+      <w:bookmarkStart w:id="248" w:name="chapter-14-sources-and-evidence"/>
       <w:r>
         <w:t xml:space="preserve">Sources and Evidence</w:t>
       </w:r>
@@ -29908,7 +29908,7 @@
       <w:pPr>
         <w:pStyle w:val="Heading1"/>
       </w:pPr>
-      <w:bookmarkStart w:id="253" w:name="chapter-15-a-token-through-the-machine"/>
+      <w:bookmarkStart w:id="253" w:name="chapter-15"/>
       <w:r>
         <w:t xml:space="preserve">Chapter 15 — A Token Through the Machine</w:t>
       </w:r>
@@ -29934,7 +29934,7 @@
       <w:pPr>
         <w:pStyle w:val="Heading2"/>
       </w:pPr>
-      <w:bookmarkStart w:id="254" w:name="a-fixture-small-enough-to-see"/>
+      <w:bookmarkStart w:id="254" w:name="chapter-15-a-fixture-small-enough-to-see"/>
       <w:r>
         <w:t xml:space="preserve">A Fixture Small Enough to See</w:t>
       </w:r>
@@ -30142,7 +30142,7 @@
       <w:pPr>
         <w:pStyle w:val="Heading2"/>
       </w:pPr>
-      <w:bookmarkStart w:id="255" w:name="the-gate-before-the-block"/>
+      <w:bookmarkStart w:id="255" w:name="chapter-15-the-gate-before-the-block"/>
       <w:r>
         <w:t xml:space="preserve">The Gate Before the Block</w:t>
       </w:r>
@@ -30203,7 +30203,7 @@
       <w:pPr>
         <w:pStyle w:val="Heading2"/>
       </w:pPr>
-      <w:bookmarkStart w:id="256" w:name="one-block-in-runtime-order"/>
+      <w:bookmarkStart w:id="256" w:name="chapter-15-one-block-in-runtime-order"/>
       <w:r>
         <w:t xml:space="preserve">One Block in Runtime Order</w:t>
       </w:r>
@@ -30452,7 +30452,7 @@
       <w:pPr>
         <w:pStyle w:val="Heading2"/>
       </w:pPr>
-      <w:bookmarkStart w:id="258" w:name="from-hidden-row-to-token"/>
+      <w:bookmarkStart w:id="258" w:name="chapter-15-from-hidden-row-to-token"/>
       <w:r>
         <w:t xml:space="preserve">From Hidden Row to Token</w:t>
       </w:r>
@@ -30650,7 +30650,7 @@
       <w:pPr>
         <w:pStyle w:val="Heading2"/>
       </w:pPr>
-      <w:bookmarkStart w:id="259" w:name="records-are-not-timings"/>
+      <w:bookmarkStart w:id="259" w:name="chapter-15-records-are-not-timings"/>
       <w:r>
         <w:t xml:space="preserve">Records Are Not Timings</w:t>
       </w:r>
@@ -30684,7 +30684,7 @@
       <w:pPr>
         <w:pStyle w:val="Heading2"/>
       </w:pPr>
-      <w:bookmarkStart w:id="260" w:name="the-first-failure-control"/>
+      <w:bookmarkStart w:id="260" w:name="chapter-15-the-first-failure-control"/>
       <w:r>
         <w:t xml:space="preserve">The First-Failure Control</w:t>
       </w:r>
@@ -30808,7 +30808,7 @@
       <w:pPr>
         <w:pStyle w:val="Heading2"/>
       </w:pPr>
-      <w:bookmarkStart w:id="261" w:name="what-the-trace-establishes"/>
+      <w:bookmarkStart w:id="261" w:name="chapter-15-what-the-trace-establishes"/>
       <w:r>
         <w:t xml:space="preserve">What the Trace Establishes</w:t>
       </w:r>
@@ -30861,7 +30861,7 @@
       <w:pPr>
         <w:pStyle w:val="Heading2"/>
       </w:pPr>
-      <w:bookmarkStart w:id="262" w:name="exact-handoffs"/>
+      <w:bookmarkStart w:id="262" w:name="chapter-15-exact-handoffs"/>
       <w:r>
         <w:t xml:space="preserve">Exact Handoffs</w:t>
       </w:r>
@@ -30926,7 +30926,7 @@
       <w:pPr>
         <w:pStyle w:val="Heading2"/>
       </w:pPr>
-      <w:bookmarkStart w:id="263" w:name="sources-and-evidence"/>
+      <w:bookmarkStart w:id="263" w:name="chapter-15-sources-and-evidence"/>
       <w:r>
         <w:t xml:space="preserve">Sources and Evidence</w:t>
       </w:r>
@@ -31000,7 +31000,7 @@
       <w:pPr>
         <w:pStyle w:val="Heading1"/>
       </w:pPr>
-      <w:bookmarkStart w:id="268" w:name="chapter-16-measured-limits"/>
+      <w:bookmarkStart w:id="268" w:name="chapter-16"/>
       <w:r>
         <w:t xml:space="preserve">Chapter 16 — Measured Limits</w:t>
       </w:r>
@@ -31026,7 +31026,7 @@
       <w:pPr>
         <w:pStyle w:val="Heading2"/>
       </w:pPr>
-      <w:bookmarkStart w:id="269" w:name="one-fixture-six-result-types"/>
+      <w:bookmarkStart w:id="269" w:name="chapter-16-one-fixture-six-result-types"/>
       <w:r>
         <w:t xml:space="preserve">One Fixture, Six Result Types</w:t>
       </w:r>
@@ -31087,7 +31087,7 @@
       <w:pPr>
         <w:pStyle w:val="Heading2"/>
       </w:pPr>
-      <w:bookmarkStart w:id="270" w:name="context-stop-before-embedding"/>
+      <w:bookmarkStart w:id="270" w:name="chapter-16-context-stop-before-embedding"/>
       <w:r>
         <w:t xml:space="preserve">Context: Stop Before Embedding</w:t>
       </w:r>
@@ -31147,7 +31147,7 @@
       <w:pPr>
         <w:pStyle w:val="Heading2"/>
       </w:pPr>
-      <w:bookmarkStart w:id="271" w:name="Xbb44b0bb9879ec3dba03e07aded184942502f8f"/>
+      <w:bookmarkStart w:id="271" w:name="X574999ecb3a1a808e13ee8b28d8b2c838ee8979"/>
       <w:r>
         <w:t xml:space="preserve">Representation: Width Is an Interface Contract</w:t>
       </w:r>
@@ -31251,7 +31251,7 @@
       <w:pPr>
         <w:pStyle w:val="Heading2"/>
       </w:pPr>
-      <w:bookmarkStart w:id="272" w:name="compute-exact-counts-are-not-time"/>
+      <w:bookmarkStart w:id="272" w:name="X9309723be42f7983c1de7274f78fe0207b4a848"/>
       <w:r>
         <w:t xml:space="preserve">Compute: Exact Counts Are Not Time</w:t>
       </w:r>
@@ -31762,7 +31762,7 @@
       <w:pPr>
         <w:pStyle w:val="Heading2"/>
       </w:pPr>
-      <w:bookmarkStart w:id="273" w:name="X73b88fe30273a6e6fced808dc2dcd5bde848695"/>
+      <w:bookmarkStart w:id="273" w:name="Xa0b5983f549eb5667ac8a89a3d9cbefceaa46c4"/>
       <w:r>
         <w:t xml:space="preserve">Vocabulary: Distinct Strings Can Share One Row</w:t>
       </w:r>
@@ -31850,7 +31850,7 @@
       <w:pPr>
         <w:pStyle w:val="Heading2"/>
       </w:pPr>
-      <w:bookmarkStart w:id="274" w:name="decoding-policy-is-part-of-the-result"/>
+      <w:bookmarkStart w:id="274" w:name="X5f1a41ebc973a6c8e05774f9329e211950f6c9f"/>
       <w:r>
         <w:t xml:space="preserve">Decoding: Policy Is Part of the Result</w:t>
       </w:r>
@@ -31915,7 +31915,7 @@
       <w:pPr>
         <w:pStyle w:val="Heading2"/>
       </w:pPr>
-      <w:bookmarkStart w:id="275" w:name="X1c0875fb4fb0880066280218babe982d3f5f949"/>
+      <w:bookmarkStart w:id="275" w:name="Xf8e2101a1d2cabdd0b6c4a4abc70d34b51b1a72"/>
       <w:r>
         <w:t xml:space="preserve">Architecture: A Numerical Contribution Control</w:t>
       </w:r>
@@ -32109,7 +32109,7 @@
       <w:pPr>
         <w:pStyle w:val="Heading2"/>
       </w:pPr>
-      <w:bookmarkStart w:id="277" w:name="the-boundary-around-the-envelope"/>
+      <w:bookmarkStart w:id="277" w:name="X118e6c7b2684b845dada2ed807f9545439d5720"/>
       <w:r>
         <w:t xml:space="preserve">The Boundary Around the Envelope</w:t>
       </w:r>
@@ -32192,7 +32192,7 @@
       <w:pPr>
         <w:pStyle w:val="Heading2"/>
       </w:pPr>
-      <w:bookmarkStart w:id="278" w:name="exact-terminal-handoff"/>
+      <w:bookmarkStart w:id="278" w:name="chapter-16-exact-terminal-handoff"/>
       <w:r>
         <w:t xml:space="preserve">Exact Terminal Handoff</w:t>
       </w:r>
@@ -32266,7 +32266,7 @@
       <w:pPr>
         <w:pStyle w:val="Heading2"/>
       </w:pPr>
-      <w:bookmarkStart w:id="279" w:name="sources-and-evidence"/>
+      <w:bookmarkStart w:id="279" w:name="chapter-16-sources-and-evidence"/>
       <w:r>
         <w:t xml:space="preserve">Sources and Evidence</w:t>
       </w:r>
@@ -32396,14 +32396,9 @@
       <w:r>
         <w:t xml:space="preserve"> </w:t>
       </w:r>
-      <w:hyperlink r:id="rId285">
-        <w:r>
-          <w:rPr>
-            <w:rStyle w:val="Hyperlink"/>
-          </w:rPr>
-          <w:t xml:space="preserve">man(7)</w:t>
-        </w:r>
-      </w:hyperlink>
+      <w:r>
+        <w:t xml:space="preserve">man(7)</w:t>
+      </w:r>
       <w:r>
         <w:t xml:space="preserve"> </w:t>
       </w:r>
@@ -32415,67 +32410,67 @@
       <w:pPr>
         <w:pStyle w:val="Heading2"/>
       </w:pPr>
-      <w:bookmarkStart w:id="286" w:name="why-this-exists"/>
+      <w:bookmarkStart w:id="285" w:name="book-two-man-pages-why-this-exists"/>
       <w:r>
         <w:t xml:space="preserve">Why This Exists</w:t>
       </w:r>
+      <w:bookmarkEnd w:id="285"/>
+    </w:p>
+    <w:p>
+      <w:pPr>
+        <w:pStyle w:val="FirstParagraph"/>
+      </w:pPr>
+      <w:r>
+        <w:t xml:space="preserve">A question-and-answer tool gives an answer and the interaction ends. This layer is built to do something different: expose stable, inspectable primitives - one per operation - so a reader can compose their own understanding in whatever order their own confusion demands, the way a Unix reference sheet let a programmer look things up without breaking flow.</w:t>
+      </w:r>
+    </w:p>
+    <w:p>
+      <w:pPr>
+        <w:pStyle w:val="BodyText"/>
+      </w:pPr>
+      <w:r>
+        <w:t xml:space="preserve">That only works if the primitives are trustworthy. If one page overclaimed - if</w:t>
+      </w:r>
+      <w:r>
+        <w:t xml:space="preserve"> </w:t>
+      </w:r>
+      <w:r>
+        <w:rPr>
+          <w:rStyle w:val="VerbatimChar"/>
+        </w:rPr>
+        <w:t xml:space="preserve">softmax</w:t>
+      </w:r>
+      <w:r>
+        <w:t xml:space="preserve"> </w:t>
+      </w:r>
+      <w:r>
+        <w:t xml:space="preserve">quietly became a Bayesian posterior, or</w:t>
+      </w:r>
+      <w:r>
+        <w:t xml:space="preserve"> </w:t>
+      </w:r>
+      <w:r>
+        <w:rPr>
+          <w:rStyle w:val="VerbatimChar"/>
+        </w:rPr>
+        <w:t xml:space="preserve">attention</w:t>
+      </w:r>
+      <w:r>
+        <w:t xml:space="preserve"> </w:t>
+      </w:r>
+      <w:r>
+        <w:t xml:space="preserve">quietly became explanation - every later composition built on it would inherit the error. The terseness of these pages and the epistemic discipline in their NOTES sections are the same design choice, not two separate ones. A tool’s value is not the answer it emits; it is whether its primitives hold up under whatever the reader builds on top of them.</w:t>
+      </w:r>
+    </w:p>
+    <w:p>
+      <w:pPr>
+        <w:pStyle w:val="Heading2"/>
+      </w:pPr>
+      <w:bookmarkStart w:id="286" w:name="book-two-man-pages-index-apropos"/>
+      <w:r>
+        <w:t xml:space="preserve">Index (apropos)</w:t>
+      </w:r>
       <w:bookmarkEnd w:id="286"/>
-    </w:p>
-    <w:p>
-      <w:pPr>
-        <w:pStyle w:val="FirstParagraph"/>
-      </w:pPr>
-      <w:r>
-        <w:t xml:space="preserve">A question-and-answer tool gives an answer and the interaction ends. This layer is built to do something different: expose stable, inspectable primitives - one per operation - so a reader can compose their own understanding in whatever order their own confusion demands, the way a Unix reference sheet let a programmer look things up without breaking flow.</w:t>
-      </w:r>
-    </w:p>
-    <w:p>
-      <w:pPr>
-        <w:pStyle w:val="BodyText"/>
-      </w:pPr>
-      <w:r>
-        <w:t xml:space="preserve">That only works if the primitives are trustworthy. If one page overclaimed - if</w:t>
-      </w:r>
-      <w:r>
-        <w:t xml:space="preserve"> </w:t>
-      </w:r>
-      <w:r>
-        <w:rPr>
-          <w:rStyle w:val="VerbatimChar"/>
-        </w:rPr>
-        <w:t xml:space="preserve">softmax</w:t>
-      </w:r>
-      <w:r>
-        <w:t xml:space="preserve"> </w:t>
-      </w:r>
-      <w:r>
-        <w:t xml:space="preserve">quietly became a Bayesian posterior, or</w:t>
-      </w:r>
-      <w:r>
-        <w:t xml:space="preserve"> </w:t>
-      </w:r>
-      <w:r>
-        <w:rPr>
-          <w:rStyle w:val="VerbatimChar"/>
-        </w:rPr>
-        <w:t xml:space="preserve">attention</w:t>
-      </w:r>
-      <w:r>
-        <w:t xml:space="preserve"> </w:t>
-      </w:r>
-      <w:r>
-        <w:t xml:space="preserve">quietly became explanation - every later composition built on it would inherit the error. The terseness of these pages and the epistemic discipline in their NOTES sections are the same design choice, not two separate ones. A tool’s value is not the answer it emits; it is whether its primitives hold up under whatever the reader builds on top of them.</w:t>
-      </w:r>
-    </w:p>
-    <w:p>
-      <w:pPr>
-        <w:pStyle w:val="Heading2"/>
-      </w:pPr>
-      <w:bookmarkStart w:id="287" w:name="index-apropos"/>
-      <w:r>
-        <w:t xml:space="preserve">Index (apropos)</w:t>
-      </w:r>
-      <w:bookmarkEnd w:id="287"/>
     </w:p>
     <w:tbl>
       <w:tblPr>
@@ -32569,14 +32564,9 @@
               <w:pStyle w:val="Compact"/>
               <w:jc w:val="left"/>
             </w:pPr>
-            <w:hyperlink r:id="rId285">
-              <w:r>
-                <w:rPr>
-                  <w:rStyle w:val="Hyperlink"/>
-                </w:rPr>
-                <w:t xml:space="preserve">man</w:t>
-              </w:r>
-            </w:hyperlink>
+            <w:r>
+              <w:t xml:space="preserve">man</w:t>
+            </w:r>
           </w:p>
         </w:tc>
         <w:tc>
@@ -32620,14 +32610,9 @@
               <w:pStyle w:val="Compact"/>
               <w:jc w:val="left"/>
             </w:pPr>
-            <w:hyperlink r:id="rId288">
-              <w:r>
-                <w:rPr>
-                  <w:rStyle w:val="Hyperlink"/>
-                </w:rPr>
-                <w:t xml:space="preserve">representation</w:t>
-              </w:r>
-            </w:hyperlink>
+            <w:r>
+              <w:t xml:space="preserve">representation</w:t>
+            </w:r>
           </w:p>
         </w:tc>
         <w:tc>
@@ -32658,7 +32643,7 @@
               <w:pStyle w:val="Compact"/>
               <w:jc w:val="left"/>
             </w:pPr>
-            <w:hyperlink r:id="rId289">
+            <w:hyperlink w:anchor="chapter-2">
               <w:r>
                 <w:rPr>
                   <w:rStyle w:val="Hyperlink"/>
@@ -32676,14 +32661,9 @@
               <w:pStyle w:val="Compact"/>
               <w:jc w:val="left"/>
             </w:pPr>
-            <w:hyperlink r:id="rId290">
-              <w:r>
-                <w:rPr>
-                  <w:rStyle w:val="Hyperlink"/>
-                </w:rPr>
-                <w:t xml:space="preserve">bayesian-update</w:t>
-              </w:r>
-            </w:hyperlink>
+            <w:r>
+              <w:t xml:space="preserve">bayesian-update</w:t>
+            </w:r>
           </w:p>
         </w:tc>
         <w:tc>
@@ -32714,7 +32694,7 @@
               <w:pStyle w:val="Compact"/>
               <w:jc w:val="left"/>
             </w:pPr>
-            <w:hyperlink r:id="rId291">
+            <w:hyperlink w:anchor="chapter-3">
               <w:r>
                 <w:rPr>
                   <w:rStyle w:val="Hyperlink"/>
@@ -32732,14 +32712,9 @@
               <w:pStyle w:val="Compact"/>
               <w:jc w:val="left"/>
             </w:pPr>
-            <w:hyperlink r:id="rId292">
-              <w:r>
-                <w:rPr>
-                  <w:rStyle w:val="Hyperlink"/>
-                </w:rPr>
-                <w:t xml:space="preserve">jacobian</w:t>
-              </w:r>
-            </w:hyperlink>
+            <w:r>
+              <w:t xml:space="preserve">jacobian</w:t>
+            </w:r>
           </w:p>
         </w:tc>
         <w:tc>
@@ -32770,7 +32745,7 @@
               <w:pStyle w:val="Compact"/>
               <w:jc w:val="left"/>
             </w:pPr>
-            <w:hyperlink r:id="rId293">
+            <w:hyperlink w:anchor="chapter-4">
               <w:r>
                 <w:rPr>
                   <w:rStyle w:val="Hyperlink"/>
@@ -32788,14 +32763,9 @@
               <w:pStyle w:val="Compact"/>
               <w:jc w:val="left"/>
             </w:pPr>
-            <w:hyperlink r:id="rId294">
-              <w:r>
-                <w:rPr>
-                  <w:rStyle w:val="Hyperlink"/>
-                </w:rPr>
-                <w:t xml:space="preserve">memory-layout</w:t>
-              </w:r>
-            </w:hyperlink>
+            <w:r>
+              <w:t xml:space="preserve">memory-layout</w:t>
+            </w:r>
           </w:p>
         </w:tc>
         <w:tc>
@@ -32826,7 +32796,7 @@
               <w:pStyle w:val="Compact"/>
               <w:jc w:val="left"/>
             </w:pPr>
-            <w:hyperlink r:id="rId295">
+            <w:hyperlink w:anchor="chapter-5">
               <w:r>
                 <w:rPr>
                   <w:rStyle w:val="Hyperlink"/>
@@ -32844,14 +32814,9 @@
               <w:pStyle w:val="Compact"/>
               <w:jc w:val="left"/>
             </w:pPr>
-            <w:hyperlink r:id="rId296">
-              <w:r>
-                <w:rPr>
-                  <w:rStyle w:val="Hyperlink"/>
-                </w:rPr>
-                <w:t xml:space="preserve">gradient-descent</w:t>
-              </w:r>
-            </w:hyperlink>
+            <w:r>
+              <w:t xml:space="preserve">gradient-descent</w:t>
+            </w:r>
           </w:p>
         </w:tc>
         <w:tc>
@@ -32882,7 +32847,7 @@
               <w:pStyle w:val="Compact"/>
               <w:jc w:val="left"/>
             </w:pPr>
-            <w:hyperlink r:id="rId297">
+            <w:hyperlink w:anchor="chapter-6">
               <w:r>
                 <w:rPr>
                   <w:rStyle w:val="Hyperlink"/>
@@ -32900,14 +32865,9 @@
               <w:pStyle w:val="Compact"/>
               <w:jc w:val="left"/>
             </w:pPr>
-            <w:hyperlink r:id="rId298">
-              <w:r>
-                <w:rPr>
-                  <w:rStyle w:val="Hyperlink"/>
-                </w:rPr>
-                <w:t xml:space="preserve">tensor</w:t>
-              </w:r>
-            </w:hyperlink>
+            <w:r>
+              <w:t xml:space="preserve">tensor</w:t>
+            </w:r>
           </w:p>
         </w:tc>
         <w:tc>
@@ -32938,7 +32898,7 @@
               <w:pStyle w:val="Compact"/>
               <w:jc w:val="left"/>
             </w:pPr>
-            <w:hyperlink r:id="rId299">
+            <w:hyperlink w:anchor="chapter-7">
               <w:r>
                 <w:rPr>
                   <w:rStyle w:val="Hyperlink"/>
@@ -32956,14 +32916,9 @@
               <w:pStyle w:val="Compact"/>
               <w:jc w:val="left"/>
             </w:pPr>
-            <w:hyperlink r:id="rId300">
-              <w:r>
-                <w:rPr>
-                  <w:rStyle w:val="Hyperlink"/>
-                </w:rPr>
-                <w:t xml:space="preserve">embedding-space</w:t>
-              </w:r>
-            </w:hyperlink>
+            <w:r>
+              <w:t xml:space="preserve">embedding-space</w:t>
+            </w:r>
           </w:p>
         </w:tc>
         <w:tc>
@@ -32994,7 +32949,7 @@
               <w:pStyle w:val="Compact"/>
               <w:jc w:val="left"/>
             </w:pPr>
-            <w:hyperlink r:id="rId301">
+            <w:hyperlink w:anchor="chapter-8">
               <w:r>
                 <w:rPr>
                   <w:rStyle w:val="Hyperlink"/>
@@ -33012,14 +32967,9 @@
               <w:pStyle w:val="Compact"/>
               <w:jc w:val="left"/>
             </w:pPr>
-            <w:hyperlink r:id="rId302">
-              <w:r>
-                <w:rPr>
-                  <w:rStyle w:val="Hyperlink"/>
-                </w:rPr>
-                <w:t xml:space="preserve">recurrence</w:t>
-              </w:r>
-            </w:hyperlink>
+            <w:r>
+              <w:t xml:space="preserve">recurrence</w:t>
+            </w:r>
           </w:p>
         </w:tc>
         <w:tc>
@@ -33050,7 +33000,7 @@
               <w:pStyle w:val="Compact"/>
               <w:jc w:val="left"/>
             </w:pPr>
-            <w:hyperlink r:id="rId303">
+            <w:hyperlink w:anchor="chapter-9">
               <w:r>
                 <w:rPr>
                   <w:rStyle w:val="Hyperlink"/>
@@ -33068,14 +33018,9 @@
               <w:pStyle w:val="Compact"/>
               <w:jc w:val="left"/>
             </w:pPr>
-            <w:hyperlink r:id="rId304">
-              <w:r>
-                <w:rPr>
-                  <w:rStyle w:val="Hyperlink"/>
-                </w:rPr>
-                <w:t xml:space="preserve">attention</w:t>
-              </w:r>
-            </w:hyperlink>
+            <w:r>
+              <w:t xml:space="preserve">attention</w:t>
+            </w:r>
           </w:p>
         </w:tc>
         <w:tc>
@@ -33106,7 +33051,7 @@
               <w:pStyle w:val="Compact"/>
               <w:jc w:val="left"/>
             </w:pPr>
-            <w:hyperlink r:id="rId305">
+            <w:hyperlink w:anchor="chapter-10">
               <w:r>
                 <w:rPr>
                   <w:rStyle w:val="Hyperlink"/>
@@ -33124,14 +33069,9 @@
               <w:pStyle w:val="Compact"/>
               <w:jc w:val="left"/>
             </w:pPr>
-            <w:hyperlink r:id="rId306">
-              <w:r>
-                <w:rPr>
-                  <w:rStyle w:val="Hyperlink"/>
-                </w:rPr>
-                <w:t xml:space="preserve">softmax</w:t>
-              </w:r>
-            </w:hyperlink>
+            <w:r>
+              <w:t xml:space="preserve">softmax</w:t>
+            </w:r>
           </w:p>
         </w:tc>
         <w:tc>
@@ -33162,7 +33102,7 @@
               <w:pStyle w:val="Compact"/>
               <w:jc w:val="left"/>
             </w:pPr>
-            <w:hyperlink r:id="rId305">
+            <w:hyperlink w:anchor="chapter-10">
               <w:r>
                 <w:rPr>
                   <w:rStyle w:val="Hyperlink"/>
@@ -33180,14 +33120,9 @@
               <w:pStyle w:val="Compact"/>
               <w:jc w:val="left"/>
             </w:pPr>
-            <w:hyperlink r:id="rId307">
-              <w:r>
-                <w:rPr>
-                  <w:rStyle w:val="Hyperlink"/>
-                </w:rPr>
-                <w:t xml:space="preserve">transformer-block</w:t>
-              </w:r>
-            </w:hyperlink>
+            <w:r>
+              <w:t xml:space="preserve">transformer-block</w:t>
+            </w:r>
           </w:p>
         </w:tc>
         <w:tc>
@@ -33218,7 +33153,7 @@
               <w:pStyle w:val="Compact"/>
               <w:jc w:val="left"/>
             </w:pPr>
-            <w:hyperlink r:id="rId308">
+            <w:hyperlink w:anchor="chapter-11">
               <w:r>
                 <w:rPr>
                   <w:rStyle w:val="Hyperlink"/>
@@ -33236,14 +33171,9 @@
               <w:pStyle w:val="Compact"/>
               <w:jc w:val="left"/>
             </w:pPr>
-            <w:hyperlink r:id="rId309">
-              <w:r>
-                <w:rPr>
-                  <w:rStyle w:val="Hyperlink"/>
-                </w:rPr>
-                <w:t xml:space="preserve">residual</w:t>
-              </w:r>
-            </w:hyperlink>
+            <w:r>
+              <w:t xml:space="preserve">residual</w:t>
+            </w:r>
           </w:p>
         </w:tc>
         <w:tc>
@@ -33274,7 +33204,7 @@
               <w:pStyle w:val="Compact"/>
               <w:jc w:val="left"/>
             </w:pPr>
-            <w:hyperlink r:id="rId308">
+            <w:hyperlink w:anchor="chapter-11">
               <w:r>
                 <w:rPr>
                   <w:rStyle w:val="Hyperlink"/>
@@ -33292,14 +33222,9 @@
               <w:pStyle w:val="Compact"/>
               <w:jc w:val="left"/>
             </w:pPr>
-            <w:hyperlink r:id="rId310">
-              <w:r>
-                <w:rPr>
-                  <w:rStyle w:val="Hyperlink"/>
-                </w:rPr>
-                <w:t xml:space="preserve">layer-norm</w:t>
-              </w:r>
-            </w:hyperlink>
+            <w:r>
+              <w:t xml:space="preserve">layer-norm</w:t>
+            </w:r>
           </w:p>
         </w:tc>
         <w:tc>
@@ -33330,7 +33255,7 @@
               <w:pStyle w:val="Compact"/>
               <w:jc w:val="left"/>
             </w:pPr>
-            <w:hyperlink r:id="rId308">
+            <w:hyperlink w:anchor="chapter-11">
               <w:r>
                 <w:rPr>
                   <w:rStyle w:val="Hyperlink"/>
@@ -33348,14 +33273,9 @@
               <w:pStyle w:val="Compact"/>
               <w:jc w:val="left"/>
             </w:pPr>
-            <w:hyperlink r:id="rId311">
-              <w:r>
-                <w:rPr>
-                  <w:rStyle w:val="Hyperlink"/>
-                </w:rPr>
-                <w:t xml:space="preserve">feed-forward</w:t>
-              </w:r>
-            </w:hyperlink>
+            <w:r>
+              <w:t xml:space="preserve">feed-forward</w:t>
+            </w:r>
           </w:p>
         </w:tc>
         <w:tc>
@@ -33386,7 +33306,7 @@
               <w:pStyle w:val="Compact"/>
               <w:jc w:val="left"/>
             </w:pPr>
-            <w:hyperlink r:id="rId308">
+            <w:hyperlink w:anchor="chapter-11">
               <w:r>
                 <w:rPr>
                   <w:rStyle w:val="Hyperlink"/>
@@ -33404,14 +33324,9 @@
               <w:pStyle w:val="Compact"/>
               <w:jc w:val="left"/>
             </w:pPr>
-            <w:hyperlink r:id="rId312">
-              <w:r>
-                <w:rPr>
-                  <w:rStyle w:val="Hyperlink"/>
-                </w:rPr>
-                <w:t xml:space="preserve">callable-package</w:t>
-              </w:r>
-            </w:hyperlink>
+            <w:r>
+              <w:t xml:space="preserve">callable-package</w:t>
+            </w:r>
           </w:p>
         </w:tc>
         <w:tc>
@@ -33442,7 +33357,7 @@
               <w:pStyle w:val="Compact"/>
               <w:jc w:val="left"/>
             </w:pPr>
-            <w:hyperlink r:id="rId313">
+            <w:hyperlink w:anchor="chapter-12">
               <w:r>
                 <w:rPr>
                   <w:rStyle w:val="Hyperlink"/>
@@ -33460,14 +33375,9 @@
               <w:pStyle w:val="Compact"/>
               <w:jc w:val="left"/>
             </w:pPr>
-            <w:hyperlink r:id="rId314">
-              <w:r>
-                <w:rPr>
-                  <w:rStyle w:val="Hyperlink"/>
-                </w:rPr>
-                <w:t xml:space="preserve">alignment</w:t>
-              </w:r>
-            </w:hyperlink>
+            <w:r>
+              <w:t xml:space="preserve">alignment</w:t>
+            </w:r>
           </w:p>
         </w:tc>
         <w:tc>
@@ -33498,7 +33408,7 @@
               <w:pStyle w:val="Compact"/>
               <w:jc w:val="left"/>
             </w:pPr>
-            <w:hyperlink r:id="rId315">
+            <w:hyperlink w:anchor="chapter-13">
               <w:r>
                 <w:rPr>
                   <w:rStyle w:val="Hyperlink"/>
@@ -33516,14 +33426,9 @@
               <w:pStyle w:val="Compact"/>
               <w:jc w:val="left"/>
             </w:pPr>
-            <w:hyperlink r:id="rId316">
-              <w:r>
-                <w:rPr>
-                  <w:rStyle w:val="Hyperlink"/>
-                </w:rPr>
-                <w:t xml:space="preserve">architecture-scales</w:t>
-              </w:r>
-            </w:hyperlink>
+            <w:r>
+              <w:t xml:space="preserve">architecture-scales</w:t>
+            </w:r>
           </w:p>
         </w:tc>
         <w:tc>
@@ -33554,7 +33459,7 @@
               <w:pStyle w:val="Compact"/>
               <w:jc w:val="left"/>
             </w:pPr>
-            <w:hyperlink r:id="rId317">
+            <w:hyperlink w:anchor="chapter-14">
               <w:r>
                 <w:rPr>
                   <w:rStyle w:val="Hyperlink"/>
@@ -33572,14 +33477,9 @@
               <w:pStyle w:val="Compact"/>
               <w:jc w:val="left"/>
             </w:pPr>
-            <w:hyperlink r:id="rId318">
-              <w:r>
-                <w:rPr>
-                  <w:rStyle w:val="Hyperlink"/>
-                </w:rPr>
-                <w:t xml:space="preserve">execution-trace</w:t>
-              </w:r>
-            </w:hyperlink>
+            <w:r>
+              <w:t xml:space="preserve">execution-trace</w:t>
+            </w:r>
           </w:p>
         </w:tc>
         <w:tc>
@@ -33610,7 +33510,7 @@
               <w:pStyle w:val="Compact"/>
               <w:jc w:val="left"/>
             </w:pPr>
-            <w:hyperlink r:id="rId319">
+            <w:hyperlink w:anchor="chapter-15">
               <w:r>
                 <w:rPr>
                   <w:rStyle w:val="Hyperlink"/>
@@ -33628,14 +33528,9 @@
               <w:pStyle w:val="Compact"/>
               <w:jc w:val="left"/>
             </w:pPr>
-            <w:hyperlink r:id="rId320">
-              <w:r>
-                <w:rPr>
-                  <w:rStyle w:val="Hyperlink"/>
-                </w:rPr>
-                <w:t xml:space="preserve">limits</w:t>
-              </w:r>
-            </w:hyperlink>
+            <w:r>
+              <w:t xml:space="preserve">limits</w:t>
+            </w:r>
           </w:p>
         </w:tc>
         <w:tc>
@@ -33666,7 +33561,7 @@
               <w:pStyle w:val="Compact"/>
               <w:jc w:val="left"/>
             </w:pPr>
-            <w:hyperlink r:id="rId321">
+            <w:hyperlink w:anchor="chapter-16">
               <w:r>
                 <w:rPr>
                   <w:rStyle w:val="Hyperlink"/>
@@ -33682,11 +33577,11 @@
       <w:pPr>
         <w:pStyle w:val="Heading2"/>
       </w:pPr>
-      <w:bookmarkStart w:id="322" w:name="section-conventions"/>
+      <w:bookmarkStart w:id="287" w:name="book-two-man-pages-section-conventions"/>
       <w:r>
         <w:t xml:space="preserve">Section Conventions</w:t>
       </w:r>
-      <w:bookmarkEnd w:id="322"/>
+      <w:bookmarkEnd w:id="287"/>
     </w:p>
     <w:p>
       <w:pPr>
@@ -33797,11 +33692,11 @@
       <w:pPr>
         <w:pStyle w:val="Heading2"/>
       </w:pPr>
-      <w:bookmarkStart w:id="323" w:name="page-format"/>
+      <w:bookmarkStart w:id="288" w:name="book-two-man-pages-page-format"/>
       <w:r>
         <w:t xml:space="preserve">Page Format</w:t>
       </w:r>
-      <w:bookmarkEnd w:id="323"/>
+      <w:bookmarkEnd w:id="288"/>
     </w:p>
     <w:p>
       <w:pPr>
@@ -33859,6 +33754,7 @@
         <w:t xml:space="preserve">SOURCE       (chapter and probe this page is grounded in)</w:t>
       </w:r>
     </w:p>
+    <w:bookmarkStart w:id="289" w:name="man-man"/>
     <w:p>
       <w:pPr>
         <w:pStyle w:val="SourceCode"/>
@@ -34389,6 +34285,8 @@
         <w:t xml:space="preserve">       book2/man/README.md; established August 31, 2026.</w:t>
       </w:r>
     </w:p>
+    <w:bookmarkEnd w:id="289"/>
+    <w:bookmarkStart w:id="290" w:name="man-representation"/>
     <w:p>
       <w:pPr>
         <w:pStyle w:val="SourceCode"/>
@@ -34676,6 +34574,8 @@
         <w:t xml:space="preserve">       Chapter 2, representation probe.</w:t>
       </w:r>
     </w:p>
+    <w:bookmarkEnd w:id="290"/>
+    <w:bookmarkStart w:id="291" w:name="man-bayesian-update"/>
     <w:p>
       <w:pPr>
         <w:pStyle w:val="SourceCode"/>
@@ -34945,6 +34845,8 @@
         <w:t xml:space="preserve">       Chapter 3, Bayesian update probe.</w:t>
       </w:r>
     </w:p>
+    <w:bookmarkEnd w:id="291"/>
+    <w:bookmarkStart w:id="292" w:name="man-jacobian"/>
     <w:p>
       <w:pPr>
         <w:pStyle w:val="SourceCode"/>
@@ -35193,6 +35095,8 @@
         <w:t xml:space="preserve">       Chapter 4, map-and-local-change probe.</w:t>
       </w:r>
     </w:p>
+    <w:bookmarkEnd w:id="292"/>
+    <w:bookmarkStart w:id="293" w:name="man-memory-layout"/>
     <w:p>
       <w:pPr>
         <w:pStyle w:val="SourceCode"/>
@@ -35432,6 +35336,8 @@
         <w:t xml:space="preserve">       Chapter 5, compiler probe (Rust, repr(C)).</w:t>
       </w:r>
     </w:p>
+    <w:bookmarkEnd w:id="293"/>
+    <w:bookmarkStart w:id="294" w:name="man-gradient-descent"/>
     <w:p>
       <w:pPr>
         <w:pStyle w:val="SourceCode"/>
@@ -35698,6 +35604,8 @@
         <w:t xml:space="preserve">       Chapter 6, learning-loop probe.</w:t>
       </w:r>
     </w:p>
+    <w:bookmarkEnd w:id="294"/>
+    <w:bookmarkStart w:id="295" w:name="man-tensor"/>
     <w:p>
       <w:pPr>
         <w:pStyle w:val="SourceCode"/>
@@ -35916,6 +35824,8 @@
         <w:t xml:space="preserve">       Chapter 7, tensor-parallel probe.</w:t>
       </w:r>
     </w:p>
+    <w:bookmarkEnd w:id="295"/>
+    <w:bookmarkStart w:id="296" w:name="man-embedding-space"/>
     <w:p>
       <w:pPr>
         <w:pStyle w:val="SourceCode"/>
@@ -36134,6 +36044,8 @@
         <w:t xml:space="preserve">       Chapter 8, learned-space probe.</w:t>
       </w:r>
     </w:p>
+    <w:bookmarkEnd w:id="296"/>
+    <w:bookmarkStart w:id="297" w:name="man-recurrence"/>
     <w:p>
       <w:pPr>
         <w:pStyle w:val="SourceCode"/>
@@ -36352,6 +36264,8 @@
         <w:t xml:space="preserve">       Chapter 9, recurrent-bottleneck probe.</w:t>
       </w:r>
     </w:p>
+    <w:bookmarkEnd w:id="297"/>
+    <w:bookmarkStart w:id="298" w:name="man-attention"/>
     <w:p>
       <w:pPr>
         <w:pStyle w:val="SourceCode"/>
@@ -36645,6 +36559,8 @@
         <w:t xml:space="preserve">       Chapter 10, attention-paths probe.</w:t>
       </w:r>
     </w:p>
+    <w:bookmarkEnd w:id="298"/>
+    <w:bookmarkStart w:id="299" w:name="man-softmax"/>
     <w:p>
       <w:pPr>
         <w:pStyle w:val="SourceCode"/>
@@ -36863,6 +36779,8 @@
         <w:t xml:space="preserve">       Chapter 10, attention-paths probe.</w:t>
       </w:r>
     </w:p>
+    <w:bookmarkEnd w:id="299"/>
+    <w:bookmarkStart w:id="300" w:name="man-transformer-block"/>
     <w:p>
       <w:pPr>
         <w:pStyle w:val="SourceCode"/>
@@ -37162,6 +37080,8 @@
         <w:t xml:space="preserve">       Chapter 11, transformer-block probe.</w:t>
       </w:r>
     </w:p>
+    <w:bookmarkEnd w:id="300"/>
+    <w:bookmarkStart w:id="301" w:name="man-residual"/>
     <w:p>
       <w:pPr>
         <w:pStyle w:val="SourceCode"/>
@@ -37353,6 +37273,8 @@
         <w:t xml:space="preserve">       Chapter 11, transformer-block probe; He et al. (residual networks).</w:t>
       </w:r>
     </w:p>
+    <w:bookmarkEnd w:id="301"/>
+    <w:bookmarkStart w:id="302" w:name="man-layer-norm"/>
     <w:p>
       <w:pPr>
         <w:pStyle w:val="SourceCode"/>
@@ -37544,6 +37466,8 @@
         <w:t xml:space="preserve">       Chapter 11, transformer-block probe; Ba, Kiros, Hinton (layer normalization).</w:t>
       </w:r>
     </w:p>
+    <w:bookmarkEnd w:id="302"/>
+    <w:bookmarkStart w:id="303" w:name="man-feed-forward"/>
     <w:p>
       <w:pPr>
         <w:pStyle w:val="SourceCode"/>
@@ -37735,6 +37659,8 @@
         <w:t xml:space="preserve">       Chapter 11, transformer-block probe.</w:t>
       </w:r>
     </w:p>
+    <w:bookmarkEnd w:id="303"/>
+    <w:bookmarkStart w:id="304" w:name="man-callable-package"/>
     <w:p>
       <w:pPr>
         <w:pStyle w:val="SourceCode"/>
@@ -38016,6 +37942,8 @@
         <w:t xml:space="preserve">       Chapter 12, callable-tool probe.</w:t>
       </w:r>
     </w:p>
+    <w:bookmarkEnd w:id="304"/>
+    <w:bookmarkStart w:id="305" w:name="man-alignment"/>
     <w:p>
       <w:pPr>
         <w:pStyle w:val="SourceCode"/>
@@ -38252,6 +38180,8 @@
         <w:t xml:space="preserve">       Chapter 13, lineage-alignment probe.</w:t>
       </w:r>
     </w:p>
+    <w:bookmarkEnd w:id="305"/>
+    <w:bookmarkStart w:id="306" w:name="man-architecture-scales"/>
     <w:p>
       <w:pPr>
         <w:pStyle w:val="SourceCode"/>
@@ -38479,6 +38409,8 @@
         <w:t xml:space="preserve">       Chapter 14, four-scales probe.</w:t>
       </w:r>
     </w:p>
+    <w:bookmarkEnd w:id="306"/>
+    <w:bookmarkStart w:id="307" w:name="man-execution-trace"/>
     <w:p>
       <w:pPr>
         <w:pStyle w:val="SourceCode"/>
@@ -38715,6 +38647,8 @@
         <w:t xml:space="preserve">       Chapter 15, token-through-machine probe.</w:t>
       </w:r>
     </w:p>
+    <w:bookmarkEnd w:id="307"/>
+    <w:bookmarkStart w:id="308" w:name="man-limits"/>
     <w:p>
       <w:pPr>
         <w:pStyle w:val="SourceCode"/>
@@ -38996,6 +38930,7 @@
         <w:t xml:space="preserve">       Chapter 16, measured-limits probe.</w:t>
       </w:r>
     </w:p>
+    <w:bookmarkEnd w:id="308"/>
     <w:sectPr/>
   </w:body>
 </w:document>

</xml_diff>

<commit_message>
Finalize Book Two ebook release candidate
</commit_message>
<xml_diff>
--- a/transformers-kdp.docx
+++ b/transformers-kdp.docx
@@ -4,62 +4,10 @@
   <w:body>
     <w:p>
       <w:pPr>
-        <w:pStyle w:val="Title"/>
-      </w:pPr>
-      <w:r>
-        <w:t xml:space="preserve">Transformers</w:t>
-      </w:r>
-    </w:p>
-    <w:p>
-      <w:pPr>
-        <w:pStyle w:val="Subtitle"/>
-      </w:pPr>
-      <w:r>
-        <w:t xml:space="preserve">An</w:t>
-      </w:r>
-      <w:r>
-        <w:t xml:space="preserve"> </w:t>
-      </w:r>
-      <w:r>
-        <w:t xml:space="preserve">Architecture</w:t>
-      </w:r>
-      <w:r>
-        <w:t xml:space="preserve"> </w:t>
-      </w:r>
-      <w:r>
-        <w:t xml:space="preserve">for</w:t>
-      </w:r>
-      <w:r>
-        <w:t xml:space="preserve"> </w:t>
-      </w:r>
-      <w:r>
-        <w:t xml:space="preserve">Geometric</w:t>
-      </w:r>
-      <w:r>
-        <w:t xml:space="preserve"> </w:t>
-      </w:r>
-      <w:r>
-        <w:t xml:space="preserve">Computation</w:t>
-      </w:r>
-    </w:p>
-    <w:p>
-      <w:pPr>
-        <w:pStyle w:val="Author"/>
-      </w:pPr>
-      <w:r>
-        <w:t xml:space="preserve">Terrence</w:t>
-      </w:r>
-      <w:r>
-        <w:t xml:space="preserve"> </w:t>
-      </w:r>
-      <w:r>
-        <w:t xml:space="preserve">J</w:t>
-      </w:r>
-      <w:r>
-        <w:t xml:space="preserve"> </w:t>
-      </w:r>
-      <w:r>
-        <w:t xml:space="preserve">McLaughlin</w:t>
+        <w:pStyle w:val="Date"/>
+      </w:pPr>
+      <w:r>
+        <w:t xml:space="preserve">2026-09-30</w:t>
       </w:r>
     </w:p>
     <w:sdt>
@@ -415,11 +363,93 @@
       <w:pPr>
         <w:pStyle w:val="Heading1"/>
       </w:pPr>
-      <w:bookmarkStart w:id="26" w:name="chapter-1"/>
+      <w:bookmarkStart w:id="26" w:name="from-book-one"/>
+      <w:r>
+        <w:t xml:space="preserve">From Book One</w:t>
+      </w:r>
+      <w:bookmarkEnd w:id="26"/>
+    </w:p>
+    <w:p>
+      <w:pPr>
+        <w:pStyle w:val="FirstParagraph"/>
+      </w:pPr>
+      <w:r>
+        <w:rPr>
+          <w:i/>
+        </w:rPr>
+        <w:t xml:space="preserve">The Geometry of Meaning</w:t>
+      </w:r>
+      <w:r>
+        <w:t xml:space="preserve"> </w:t>
+      </w:r>
+      <w:r>
+        <w:t xml:space="preserve">begins at human scale.</w:t>
+      </w:r>
+    </w:p>
+    <w:p>
+      <w:pPr>
+        <w:pStyle w:val="BodyText"/>
+      </w:pPr>
+      <w:r>
+        <w:t xml:space="preserve">Book One,</w:t>
+      </w:r>
+      <w:r>
+        <w:t xml:space="preserve"> </w:t>
+      </w:r>
+      <w:r>
+        <w:rPr>
+          <w:i/>
+        </w:rPr>
+        <w:t xml:space="preserve">Embedding Geometry</w:t>
+      </w:r>
+      <w:r>
+        <w:t xml:space="preserve">, met AI through conversation, building, testing, and reverse engineering. Its governing discovery was practical: structure makes the tool more inspectable, but only execution and testing establish what can be trusted. The human supplies purpose, judgment, and responsibility; the transformer extends relational reach; tools make the work observable.</w:t>
+      </w:r>
+    </w:p>
+    <w:p>
+      <w:pPr>
+        <w:pStyle w:val="BodyText"/>
+      </w:pPr>
+      <w:r>
+        <w:t xml:space="preserve">Book Two begins where that encounter leaves a technical question. What is the machine whose behavior became visible through use?</w:t>
+      </w:r>
+    </w:p>
+    <w:p>
+      <w:pPr>
+        <w:pStyle w:val="BodyText"/>
+      </w:pPr>
+      <w:r>
+        <w:t xml:space="preserve">The answer requires an excursion through three lineages: artificial intelligence, the mathematics that makes learning expressible, and the programming systems that make those ideas executable. No conclusion from Book One is treated as a substitute for this inspection. Its workflow becomes the method used here:</w:t>
+      </w:r>
+    </w:p>
+    <w:p>
+      <w:pPr>
+        <w:pStyle w:val="BodyText"/>
+      </w:pPr>
+      <w:r>
+        <w:rPr>
+          <w:b/>
+        </w:rPr>
+        <w:t xml:space="preserve">Conversation → Build → Test → Reverse Engineer → Conversation Update</w:t>
+      </w:r>
+    </w:p>
+    <w:p>
+      <w:pPr>
+        <w:pStyle w:val="BodyText"/>
+      </w:pPr>
+      <w:r>
+        <w:t xml:space="preserve">This volume can be read independently. Readers arriving from Book One carry the human-scale encounter into the architecture; readers beginning here can follow the machinery without reconstructing the earlier journey.</w:t>
+      </w:r>
+    </w:p>
+    <w:p>
+      <w:pPr>
+        <w:pStyle w:val="Heading1"/>
+      </w:pPr>
+      <w:bookmarkStart w:id="27" w:name="chapter-1"/>
       <w:r>
         <w:t xml:space="preserve">Chapter 1 — Rules, Operations, and Programs</w:t>
       </w:r>
-      <w:bookmarkEnd w:id="26"/>
+      <w:bookmarkEnd w:id="27"/>
     </w:p>
     <w:p>
       <w:pPr>
@@ -469,11 +499,11 @@
       <w:pPr>
         <w:pStyle w:val="Heading2"/>
       </w:pPr>
-      <w:bookmarkStart w:id="27" w:name="chapter-1-one-door-three-states"/>
+      <w:bookmarkStart w:id="28" w:name="chapter-1-one-door-three-states"/>
       <w:r>
         <w:t xml:space="preserve">One Door, Three States</w:t>
       </w:r>
-      <w:bookmarkEnd w:id="27"/>
+      <w:bookmarkEnd w:id="28"/>
     </w:p>
     <w:p>
       <w:pPr>
@@ -989,11 +1019,11 @@
       <w:pPr>
         <w:pStyle w:val="Heading2"/>
       </w:pPr>
-      <w:bookmarkStart w:id="28" w:name="chapter-1-the-algebraic-gate"/>
+      <w:bookmarkStart w:id="29" w:name="chapter-1-the-algebraic-gate"/>
       <w:r>
         <w:t xml:space="preserve">The Algebraic Gate</w:t>
       </w:r>
-      <w:bookmarkEnd w:id="28"/>
+      <w:bookmarkEnd w:id="29"/>
     </w:p>
     <w:p>
       <w:pPr>
@@ -1440,11 +1470,11 @@
       <w:pPr>
         <w:pStyle w:val="Heading2"/>
       </w:pPr>
-      <w:bookmarkStart w:id="29" w:name="chapter-1-the-symbolic-gate"/>
+      <w:bookmarkStart w:id="30" w:name="chapter-1-the-symbolic-gate"/>
       <w:r>
         <w:t xml:space="preserve">The Symbolic Gate</w:t>
       </w:r>
-      <w:bookmarkEnd w:id="29"/>
+      <w:bookmarkEnd w:id="30"/>
     </w:p>
     <w:p>
       <w:pPr>
@@ -1746,11 +1776,11 @@
       <w:pPr>
         <w:pStyle w:val="Heading2"/>
       </w:pPr>
-      <w:bookmarkStart w:id="30" w:name="chapter-1-the-programmed-gate"/>
+      <w:bookmarkStart w:id="31" w:name="chapter-1-the-programmed-gate"/>
       <w:r>
         <w:t xml:space="preserve">The Programmed Gate</w:t>
       </w:r>
-      <w:bookmarkEnd w:id="30"/>
+      <w:bookmarkEnd w:id="31"/>
     </w:p>
     <w:p>
       <w:pPr>
@@ -2637,11 +2667,11 @@
       <w:pPr>
         <w:pStyle w:val="Heading2"/>
       </w:pPr>
-      <w:bookmarkStart w:id="31" w:name="chapter-1-three-forms-of-constraint"/>
+      <w:bookmarkStart w:id="32" w:name="chapter-1-three-forms-of-constraint"/>
       <w:r>
         <w:t xml:space="preserve">Three Forms of Constraint</w:t>
       </w:r>
-      <w:bookmarkEnd w:id="31"/>
+      <w:bookmarkEnd w:id="32"/>
     </w:p>
     <w:p>
       <w:pPr>
@@ -2663,7 +2693,7 @@
                     </pic:cNvPicPr>
                   </pic:nvPicPr>
                   <pic:blipFill>
-                    <a:blip r:embed="rId32"/>
+                    <a:blip r:embed="rId33"/>
                     <a:stretch>
                       <a:fillRect/>
                     </a:stretch>
@@ -3092,11 +3122,11 @@
       <w:pPr>
         <w:pStyle w:val="Heading2"/>
       </w:pPr>
-      <w:bookmarkStart w:id="33" w:name="chapter-1-where-internal-success-ends"/>
+      <w:bookmarkStart w:id="34" w:name="chapter-1-where-internal-success-ends"/>
       <w:r>
         <w:t xml:space="preserve">Where Internal Success Ends</w:t>
       </w:r>
-      <w:bookmarkEnd w:id="33"/>
+      <w:bookmarkEnd w:id="34"/>
     </w:p>
     <w:p>
       <w:pPr>
@@ -3476,11 +3506,11 @@
       <w:pPr>
         <w:pStyle w:val="Heading2"/>
       </w:pPr>
-      <w:bookmarkStart w:id="34" w:name="chapter-1-from-rules-to-representation"/>
+      <w:bookmarkStart w:id="35" w:name="chapter-1-from-rules-to-representation"/>
       <w:r>
         <w:t xml:space="preserve">From Rules to Representation</w:t>
       </w:r>
-      <w:bookmarkEnd w:id="34"/>
+      <w:bookmarkEnd w:id="35"/>
     </w:p>
     <w:p>
       <w:pPr>
@@ -3549,11 +3579,11 @@
       <w:pPr>
         <w:pStyle w:val="Heading2"/>
       </w:pPr>
-      <w:bookmarkStart w:id="35" w:name="chapter-1-sources-and-evidence"/>
+      <w:bookmarkStart w:id="36" w:name="chapter-1-sources-and-evidence"/>
       <w:r>
         <w:t xml:space="preserve">Sources and Evidence</w:t>
       </w:r>
-      <w:bookmarkEnd w:id="35"/>
+      <w:bookmarkEnd w:id="36"/>
     </w:p>
     <w:p>
       <w:pPr>
@@ -3565,7 +3595,7 @@
       <w:r>
         <w:t xml:space="preserve"> </w:t>
       </w:r>
-      <w:hyperlink r:id="rId36">
+      <w:hyperlink r:id="rId37">
         <w:r>
           <w:rPr>
             <w:rStyle w:val="Hyperlink"/>
@@ -3579,7 +3609,7 @@
       <w:r>
         <w:t xml:space="preserve"> </w:t>
       </w:r>
-      <w:hyperlink r:id="rId37">
+      <w:hyperlink r:id="rId38">
         <w:r>
           <w:rPr>
             <w:rStyle w:val="Hyperlink"/>
@@ -3593,7 +3623,7 @@
       <w:r>
         <w:t xml:space="preserve"> </w:t>
       </w:r>
-      <w:hyperlink r:id="rId38">
+      <w:hyperlink r:id="rId39">
         <w:r>
           <w:rPr>
             <w:rStyle w:val="Hyperlink"/>
@@ -3607,7 +3637,7 @@
       <w:r>
         <w:t xml:space="preserve"> </w:t>
       </w:r>
-      <w:hyperlink r:id="rId39">
+      <w:hyperlink r:id="rId40">
         <w:r>
           <w:rPr>
             <w:rStyle w:val="Hyperlink"/>
@@ -3623,11 +3653,11 @@
       <w:pPr>
         <w:pStyle w:val="Heading1"/>
       </w:pPr>
-      <w:bookmarkStart w:id="40" w:name="chapter-2"/>
+      <w:bookmarkStart w:id="41" w:name="chapter-2"/>
       <w:r>
         <w:t xml:space="preserve">Chapter 2 — Representation Becomes Numerical</w:t>
       </w:r>
-      <w:bookmarkEnd w:id="40"/>
+      <w:bookmarkEnd w:id="41"/>
     </w:p>
     <w:p>
       <w:pPr>
@@ -3722,11 +3752,11 @@
       <w:pPr>
         <w:pStyle w:val="Heading2"/>
       </w:pPr>
-      <w:bookmarkStart w:id="41" w:name="chapter-2-start-with-source-text"/>
+      <w:bookmarkStart w:id="42" w:name="chapter-2-start-with-source-text"/>
       <w:r>
         <w:t xml:space="preserve">Start with Source Text</w:t>
       </w:r>
-      <w:bookmarkEnd w:id="41"/>
+      <w:bookmarkEnd w:id="42"/>
     </w:p>
     <w:p>
       <w:pPr>
@@ -3849,11 +3879,11 @@
       <w:pPr>
         <w:pStyle w:val="Heading2"/>
       </w:pPr>
-      <w:bookmarkStart w:id="42" w:name="chapter-2-a-token-is-not-its-identifier"/>
+      <w:bookmarkStart w:id="43" w:name="chapter-2-a-token-is-not-its-identifier"/>
       <w:r>
         <w:t xml:space="preserve">A Token Is Not Its Identifier</w:t>
       </w:r>
-      <w:bookmarkEnd w:id="42"/>
+      <w:bookmarkEnd w:id="43"/>
     </w:p>
     <w:p>
       <w:pPr>
@@ -4399,11 +4429,11 @@
       <w:pPr>
         <w:pStyle w:val="Heading2"/>
       </w:pPr>
-      <w:bookmarkStart w:id="43" w:name="chapter-2-from-identifier-to-coordinate"/>
+      <w:bookmarkStart w:id="44" w:name="chapter-2-from-identifier-to-coordinate"/>
       <w:r>
         <w:t xml:space="preserve">From Identifier to Coordinate</w:t>
       </w:r>
-      <w:bookmarkEnd w:id="43"/>
+      <w:bookmarkEnd w:id="44"/>
     </w:p>
     <w:p>
       <w:pPr>
@@ -4803,11 +4833,11 @@
       <w:pPr>
         <w:pStyle w:val="Heading2"/>
       </w:pPr>
-      <w:bookmarkStart w:id="44" w:name="chapter-2-lookup-is-another-mapping"/>
+      <w:bookmarkStart w:id="45" w:name="chapter-2-lookup-is-another-mapping"/>
       <w:r>
         <w:t xml:space="preserve">Lookup Is Another Mapping</w:t>
       </w:r>
-      <w:bookmarkEnd w:id="44"/>
+      <w:bookmarkEnd w:id="45"/>
     </w:p>
     <w:p>
       <w:pPr>
@@ -5423,11 +5453,11 @@
       <w:pPr>
         <w:pStyle w:val="Heading2"/>
       </w:pPr>
-      <w:bookmarkStart w:id="45" w:name="chapter-2-from-token-to-coordinate"/>
+      <w:bookmarkStart w:id="46" w:name="chapter-2-from-token-to-coordinate"/>
       <w:r>
         <w:t xml:space="preserve">From Token to Coordinate</w:t>
       </w:r>
-      <w:bookmarkEnd w:id="45"/>
+      <w:bookmarkEnd w:id="46"/>
     </w:p>
     <w:p>
       <w:pPr>
@@ -5449,7 +5479,7 @@
                     </pic:cNvPicPr>
                   </pic:nvPicPr>
                   <pic:blipFill>
-                    <a:blip r:embed="rId46"/>
+                    <a:blip r:embed="rId47"/>
                     <a:stretch>
                       <a:fillRect/>
                     </a:stretch>
@@ -5746,11 +5776,11 @@
       <w:pPr>
         <w:pStyle w:val="Heading2"/>
       </w:pPr>
-      <w:bookmarkStart w:id="47" w:name="Xf151ae8792c2fab9c54d3dbcdcf5541292af3f2"/>
+      <w:bookmarkStart w:id="48" w:name="Xf151ae8792c2fab9c54d3dbcdcf5541292af3f2"/>
       <w:r>
         <w:t xml:space="preserve">Representation Can Discard Distinctions</w:t>
       </w:r>
-      <w:bookmarkEnd w:id="47"/>
+      <w:bookmarkEnd w:id="48"/>
     </w:p>
     <w:p>
       <w:pPr>
@@ -6067,11 +6097,11 @@
       <w:pPr>
         <w:pStyle w:val="Heading2"/>
       </w:pPr>
-      <w:bookmarkStart w:id="48" w:name="chapter-2-what-the-probe-establishes"/>
+      <w:bookmarkStart w:id="49" w:name="chapter-2-what-the-probe-establishes"/>
       <w:r>
         <w:t xml:space="preserve">What the Probe Establishes</w:t>
       </w:r>
-      <w:bookmarkEnd w:id="48"/>
+      <w:bookmarkEnd w:id="49"/>
     </w:p>
     <w:p>
       <w:pPr>
@@ -6212,11 +6242,11 @@
       <w:pPr>
         <w:pStyle w:val="Heading2"/>
       </w:pPr>
-      <w:bookmarkStart w:id="49" w:name="X0cc56a7a6c171485317a6dfe9102cef46f4df23"/>
+      <w:bookmarkStart w:id="50" w:name="X0cc56a7a6c171485317a6dfe9102cef46f4df23"/>
       <w:r>
         <w:t xml:space="preserve">Numerical Objects Ready for Transformation</w:t>
       </w:r>
-      <w:bookmarkEnd w:id="49"/>
+      <w:bookmarkEnd w:id="50"/>
     </w:p>
     <w:p>
       <w:pPr>
@@ -6254,11 +6284,11 @@
       <w:pPr>
         <w:pStyle w:val="Heading2"/>
       </w:pPr>
-      <w:bookmarkStart w:id="50" w:name="chapter-2-sources-and-evidence"/>
+      <w:bookmarkStart w:id="51" w:name="chapter-2-sources-and-evidence"/>
       <w:r>
         <w:t xml:space="preserve">Sources and Evidence</w:t>
       </w:r>
-      <w:bookmarkEnd w:id="50"/>
+      <w:bookmarkEnd w:id="51"/>
     </w:p>
     <w:p>
       <w:pPr>
@@ -6270,7 +6300,7 @@
       <w:r>
         <w:t xml:space="preserve"> </w:t>
       </w:r>
-      <w:hyperlink r:id="rId51">
+      <w:hyperlink r:id="rId52">
         <w:r>
           <w:rPr>
             <w:rStyle w:val="Hyperlink"/>
@@ -6284,7 +6314,7 @@
       <w:r>
         <w:t xml:space="preserve"> </w:t>
       </w:r>
-      <w:hyperlink r:id="rId52">
+      <w:hyperlink r:id="rId53">
         <w:r>
           <w:rPr>
             <w:rStyle w:val="Hyperlink"/>
@@ -6298,7 +6328,7 @@
       <w:r>
         <w:t xml:space="preserve"> </w:t>
       </w:r>
-      <w:hyperlink r:id="rId53">
+      <w:hyperlink r:id="rId54">
         <w:r>
           <w:rPr>
             <w:rStyle w:val="Hyperlink"/>
@@ -6312,7 +6342,7 @@
       <w:r>
         <w:t xml:space="preserve"> </w:t>
       </w:r>
-      <w:hyperlink r:id="rId54">
+      <w:hyperlink r:id="rId55">
         <w:r>
           <w:rPr>
             <w:rStyle w:val="Hyperlink"/>
@@ -6328,11 +6358,11 @@
       <w:pPr>
         <w:pStyle w:val="Heading1"/>
       </w:pPr>
-      <w:bookmarkStart w:id="55" w:name="chapter-3"/>
+      <w:bookmarkStart w:id="56" w:name="chapter-3"/>
       <w:r>
         <w:t xml:space="preserve">Chapter 3 — Reasoning Under Uncertainty</w:t>
       </w:r>
-      <w:bookmarkEnd w:id="55"/>
+      <w:bookmarkEnd w:id="56"/>
     </w:p>
     <w:p>
       <w:pPr>
@@ -6362,11 +6392,11 @@
       <w:pPr>
         <w:pStyle w:val="Heading2"/>
       </w:pPr>
-      <w:bookmarkStart w:id="56" w:name="X27652c7096aa47ab46f16a1d3e6053731cfa4e2"/>
+      <w:bookmarkStart w:id="57" w:name="X27652c7096aa47ab46f16a1d3e6053731cfa4e2"/>
       <w:r>
         <w:t xml:space="preserve">Possibilities Before Predictions</w:t>
       </w:r>
-      <w:bookmarkEnd w:id="56"/>
+      <w:bookmarkEnd w:id="57"/>
     </w:p>
     <w:p>
       <w:pPr>
@@ -6690,11 +6720,11 @@
       <w:pPr>
         <w:pStyle w:val="Heading2"/>
       </w:pPr>
-      <w:bookmarkStart w:id="57" w:name="Xba3997721c17826e7cfb544cec7696c42a2d30d"/>
+      <w:bookmarkStart w:id="58" w:name="Xba3997721c17826e7cfb544cec7696c42a2d30d"/>
       <w:r>
         <w:t xml:space="preserve">Evidence Needs a Likelihood Model</w:t>
       </w:r>
-      <w:bookmarkEnd w:id="57"/>
+      <w:bookmarkEnd w:id="58"/>
     </w:p>
     <w:p>
       <w:pPr>
@@ -7007,11 +7037,11 @@
       <w:pPr>
         <w:pStyle w:val="Heading2"/>
       </w:pPr>
-      <w:bookmarkStart w:id="58" w:name="chapter-3-weight-then-normalize"/>
+      <w:bookmarkStart w:id="59" w:name="chapter-3-weight-then-normalize"/>
       <w:r>
         <w:t xml:space="preserve">Weight, Then Normalize</w:t>
       </w:r>
-      <w:bookmarkEnd w:id="58"/>
+      <w:bookmarkEnd w:id="59"/>
     </w:p>
     <w:p>
       <w:pPr>
@@ -7608,7 +7638,7 @@
                     </pic:cNvPicPr>
                   </pic:nvPicPr>
                   <pic:blipFill>
-                    <a:blip r:embed="rId59"/>
+                    <a:blip r:embed="rId60"/>
                     <a:stretch>
                       <a:fillRect/>
                     </a:stretch>
@@ -7747,11 +7777,11 @@
       <w:pPr>
         <w:pStyle w:val="Heading2"/>
       </w:pPr>
-      <w:bookmarkStart w:id="60" w:name="Xd9bc5ff74c3066f8c3715c2e6f88ea753ee2351"/>
+      <w:bookmarkStart w:id="61" w:name="Xd9bc5ff74c3066f8c3715c2e6f88ea753ee2351"/>
       <w:r>
         <w:t xml:space="preserve">The Same Evidence, Different Assumptions</w:t>
       </w:r>
-      <w:bookmarkEnd w:id="60"/>
+      <w:bookmarkEnd w:id="61"/>
     </w:p>
     <w:p>
       <w:pPr>
@@ -8307,11 +8337,11 @@
       <w:pPr>
         <w:pStyle w:val="Heading2"/>
       </w:pPr>
-      <w:bookmarkStart w:id="61" w:name="chapter-3-a-graph-declares-dependence"/>
+      <w:bookmarkStart w:id="62" w:name="chapter-3-a-graph-declares-dependence"/>
       <w:r>
         <w:t xml:space="preserve">A Graph Declares Dependence</w:t>
       </w:r>
-      <w:bookmarkEnd w:id="61"/>
+      <w:bookmarkEnd w:id="62"/>
     </w:p>
     <w:p>
       <w:pPr>
@@ -8373,11 +8403,11 @@
       <w:pPr>
         <w:pStyle w:val="Heading2"/>
       </w:pPr>
-      <w:bookmarkStart w:id="62" w:name="chapter-3-inference-is-not-a-decision"/>
+      <w:bookmarkStart w:id="63" w:name="chapter-3-inference-is-not-a-decision"/>
       <w:r>
         <w:t xml:space="preserve">Inference Is Not a Decision</w:t>
       </w:r>
-      <w:bookmarkEnd w:id="62"/>
+      <w:bookmarkEnd w:id="63"/>
     </w:p>
     <w:p>
       <w:pPr>
@@ -8533,11 +8563,11 @@
       <w:pPr>
         <w:pStyle w:val="Heading2"/>
       </w:pPr>
-      <w:bookmarkStart w:id="63" w:name="chapter-3-what-the-probe-establishes"/>
+      <w:bookmarkStart w:id="64" w:name="chapter-3-what-the-probe-establishes"/>
       <w:r>
         <w:t xml:space="preserve">What the Probe Establishes</w:t>
       </w:r>
-      <w:bookmarkEnd w:id="63"/>
+      <w:bookmarkEnd w:id="64"/>
     </w:p>
     <w:p>
       <w:pPr>
@@ -8612,11 +8642,11 @@
       <w:pPr>
         <w:pStyle w:val="Heading2"/>
       </w:pPr>
-      <w:bookmarkStart w:id="64" w:name="X3bebad3c1d955aa2a3c20d7e6c69792489b6ea6"/>
+      <w:bookmarkStart w:id="65" w:name="X3bebad3c1d955aa2a3c20d7e6c69792489b6ea6"/>
       <w:r>
         <w:t xml:space="preserve">A Distribution Ready for Later Machinery</w:t>
       </w:r>
-      <w:bookmarkEnd w:id="64"/>
+      <w:bookmarkEnd w:id="65"/>
     </w:p>
     <w:p>
       <w:pPr>
@@ -8654,11 +8684,11 @@
       <w:pPr>
         <w:pStyle w:val="Heading2"/>
       </w:pPr>
-      <w:bookmarkStart w:id="65" w:name="chapter-3-sources-and-evidence"/>
+      <w:bookmarkStart w:id="66" w:name="chapter-3-sources-and-evidence"/>
       <w:r>
         <w:t xml:space="preserve">Sources and Evidence</w:t>
       </w:r>
-      <w:bookmarkEnd w:id="65"/>
+      <w:bookmarkEnd w:id="66"/>
     </w:p>
     <w:p>
       <w:pPr>
@@ -8670,7 +8700,7 @@
       <w:r>
         <w:t xml:space="preserve"> </w:t>
       </w:r>
-      <w:hyperlink r:id="rId66">
+      <w:hyperlink r:id="rId67">
         <w:r>
           <w:rPr>
             <w:rStyle w:val="Hyperlink"/>
@@ -8684,7 +8714,7 @@
       <w:r>
         <w:t xml:space="preserve"> </w:t>
       </w:r>
-      <w:hyperlink r:id="rId67">
+      <w:hyperlink r:id="rId68">
         <w:r>
           <w:rPr>
             <w:rStyle w:val="Hyperlink"/>
@@ -8698,7 +8728,7 @@
       <w:r>
         <w:t xml:space="preserve"> </w:t>
       </w:r>
-      <w:hyperlink r:id="rId68">
+      <w:hyperlink r:id="rId69">
         <w:r>
           <w:rPr>
             <w:rStyle w:val="Hyperlink"/>
@@ -8712,7 +8742,7 @@
       <w:r>
         <w:t xml:space="preserve"> </w:t>
       </w:r>
-      <w:hyperlink r:id="rId69">
+      <w:hyperlink r:id="rId70">
         <w:r>
           <w:rPr>
             <w:rStyle w:val="Hyperlink"/>
@@ -8728,11 +8758,11 @@
       <w:pPr>
         <w:pStyle w:val="Heading1"/>
       </w:pPr>
-      <w:bookmarkStart w:id="70" w:name="chapter-4"/>
+      <w:bookmarkStart w:id="71" w:name="chapter-4"/>
       <w:r>
         <w:t xml:space="preserve">Chapter 4 — Transformations and Change</w:t>
       </w:r>
-      <w:bookmarkEnd w:id="70"/>
+      <w:bookmarkEnd w:id="71"/>
     </w:p>
     <w:p>
       <w:pPr>
@@ -8777,11 +8807,11 @@
       <w:pPr>
         <w:pStyle w:val="Heading2"/>
       </w:pPr>
-      <w:bookmarkStart w:id="71" w:name="chapter-4-a-matrix-acts-on-coordinates"/>
+      <w:bookmarkStart w:id="72" w:name="chapter-4-a-matrix-acts-on-coordinates"/>
       <w:r>
         <w:t xml:space="preserve">A Matrix Acts on Coordinates</w:t>
       </w:r>
-      <w:bookmarkEnd w:id="71"/>
+      <w:bookmarkEnd w:id="72"/>
     </w:p>
     <w:p>
       <w:pPr>
@@ -9109,11 +9139,11 @@
       <w:pPr>
         <w:pStyle w:val="Heading2"/>
       </w:pPr>
-      <w:bookmarkStart w:id="72" w:name="chapter-4-what-makes-the-map-linear"/>
+      <w:bookmarkStart w:id="73" w:name="chapter-4-what-makes-the-map-linear"/>
       <w:r>
         <w:t xml:space="preserve">What Makes the Map Linear</w:t>
       </w:r>
-      <w:bookmarkEnd w:id="72"/>
+      <w:bookmarkEnd w:id="73"/>
     </w:p>
     <w:p>
       <w:pPr>
@@ -9668,11 +9698,11 @@
       <w:pPr>
         <w:pStyle w:val="Heading2"/>
       </w:pPr>
-      <w:bookmarkStart w:id="73" w:name="X4ca777c6cef9e1b14abd0974c6c9be9a5ccbd24"/>
+      <w:bookmarkStart w:id="74" w:name="X4ca777c6cef9e1b14abd0974c6c9be9a5ccbd24"/>
       <w:r>
         <w:t xml:space="preserve">A Transformation That Is Not Linear</w:t>
       </w:r>
-      <w:bookmarkEnd w:id="73"/>
+      <w:bookmarkEnd w:id="74"/>
     </w:p>
     <w:p>
       <w:pPr>
@@ -10037,11 +10067,11 @@
       <w:pPr>
         <w:pStyle w:val="Heading2"/>
       </w:pPr>
-      <w:bookmarkStart w:id="74" w:name="chapter-4-change-near-one-point"/>
+      <w:bookmarkStart w:id="75" w:name="chapter-4-change-near-one-point"/>
       <w:r>
         <w:t xml:space="preserve">Change Near One Point</w:t>
       </w:r>
-      <w:bookmarkEnd w:id="74"/>
+      <w:bookmarkEnd w:id="75"/>
     </w:p>
     <w:p>
       <w:pPr>
@@ -10483,7 +10513,7 @@
                     </pic:cNvPicPr>
                   </pic:nvPicPr>
                   <pic:blipFill>
-                    <a:blip r:embed="rId75"/>
+                    <a:blip r:embed="rId76"/>
                     <a:stretch>
                       <a:fillRect/>
                     </a:stretch>
@@ -10620,11 +10650,11 @@
       <w:pPr>
         <w:pStyle w:val="Heading2"/>
       </w:pPr>
-      <w:bookmarkStart w:id="76" w:name="X1098cbb4237a0d54469f7b1efacc9becdcdc1a1"/>
+      <w:bookmarkStart w:id="77" w:name="X1098cbb4237a0d54469f7b1efacc9becdcdc1a1"/>
       <w:r>
         <w:t xml:space="preserve">Checking the Derivative Numerically</w:t>
       </w:r>
-      <w:bookmarkEnd w:id="76"/>
+      <w:bookmarkEnd w:id="77"/>
     </w:p>
     <w:p>
       <w:pPr>
@@ -11118,11 +11148,11 @@
       <w:pPr>
         <w:pStyle w:val="Heading2"/>
       </w:pPr>
-      <w:bookmarkStart w:id="77" w:name="chapter-4-jacobian-gradient-and-learning"/>
+      <w:bookmarkStart w:id="78" w:name="chapter-4-jacobian-gradient-and-learning"/>
       <w:r>
         <w:t xml:space="preserve">Jacobian, Gradient, and Learning</w:t>
       </w:r>
-      <w:bookmarkEnd w:id="77"/>
+      <w:bookmarkEnd w:id="78"/>
     </w:p>
     <w:p>
       <w:pPr>
@@ -11200,11 +11230,11 @@
       <w:pPr>
         <w:pStyle w:val="Heading2"/>
       </w:pPr>
-      <w:bookmarkStart w:id="78" w:name="chapter-4-what-the-probe-establishes"/>
+      <w:bookmarkStart w:id="79" w:name="chapter-4-what-the-probe-establishes"/>
       <w:r>
         <w:t xml:space="preserve">What the Probe Establishes</w:t>
       </w:r>
-      <w:bookmarkEnd w:id="78"/>
+      <w:bookmarkEnd w:id="79"/>
     </w:p>
     <w:p>
       <w:pPr>
@@ -11288,11 +11318,11 @@
       <w:pPr>
         <w:pStyle w:val="Heading2"/>
       </w:pPr>
-      <w:bookmarkStart w:id="79" w:name="Xcda2158c2b783e643ac33298395b406b9342f72"/>
+      <w:bookmarkStart w:id="80" w:name="Xcda2158c2b783e643ac33298395b406b9342f72"/>
       <w:r>
         <w:t xml:space="preserve">Machinery Ready for Composition</w:t>
       </w:r>
-      <w:bookmarkEnd w:id="79"/>
+      <w:bookmarkEnd w:id="80"/>
     </w:p>
     <w:p>
       <w:pPr>
@@ -11330,11 +11360,11 @@
       <w:pPr>
         <w:pStyle w:val="Heading2"/>
       </w:pPr>
-      <w:bookmarkStart w:id="80" w:name="chapter-4-sources-and-evidence"/>
+      <w:bookmarkStart w:id="81" w:name="chapter-4-sources-and-evidence"/>
       <w:r>
         <w:t xml:space="preserve">Sources and Evidence</w:t>
       </w:r>
-      <w:bookmarkEnd w:id="80"/>
+      <w:bookmarkEnd w:id="81"/>
     </w:p>
     <w:p>
       <w:pPr>
@@ -11346,7 +11376,7 @@
       <w:r>
         <w:t xml:space="preserve"> </w:t>
       </w:r>
-      <w:hyperlink r:id="rId81">
+      <w:hyperlink r:id="rId82">
         <w:r>
           <w:rPr>
             <w:rStyle w:val="Hyperlink"/>
@@ -11360,7 +11390,7 @@
       <w:r>
         <w:t xml:space="preserve"> </w:t>
       </w:r>
-      <w:hyperlink r:id="rId82">
+      <w:hyperlink r:id="rId83">
         <w:r>
           <w:rPr>
             <w:rStyle w:val="Hyperlink"/>
@@ -11374,7 +11404,7 @@
       <w:r>
         <w:t xml:space="preserve"> </w:t>
       </w:r>
-      <w:hyperlink r:id="rId83">
+      <w:hyperlink r:id="rId84">
         <w:r>
           <w:rPr>
             <w:rStyle w:val="Hyperlink"/>
@@ -11388,7 +11418,7 @@
       <w:r>
         <w:t xml:space="preserve"> </w:t>
       </w:r>
-      <w:hyperlink r:id="rId84">
+      <w:hyperlink r:id="rId85">
         <w:r>
           <w:rPr>
             <w:rStyle w:val="Hyperlink"/>
@@ -11404,11 +11434,11 @@
       <w:pPr>
         <w:pStyle w:val="Heading1"/>
       </w:pPr>
-      <w:bookmarkStart w:id="85" w:name="chapter-5"/>
+      <w:bookmarkStart w:id="86" w:name="chapter-5"/>
       <w:r>
         <w:t xml:space="preserve">Chapter 5 — Memory, Types, and Translation</w:t>
       </w:r>
-      <w:bookmarkEnd w:id="85"/>
+      <w:bookmarkEnd w:id="86"/>
     </w:p>
     <w:p>
       <w:pPr>
@@ -11438,11 +11468,11 @@
       <w:pPr>
         <w:pStyle w:val="Heading2"/>
       </w:pPr>
-      <w:bookmarkStart w:id="86" w:name="chapter-5-a-typed-source-declaration"/>
+      <w:bookmarkStart w:id="87" w:name="chapter-5-a-typed-source-declaration"/>
       <w:r>
         <w:t xml:space="preserve">A Typed Source Declaration</w:t>
       </w:r>
-      <w:bookmarkEnd w:id="86"/>
+      <w:bookmarkEnd w:id="87"/>
     </w:p>
     <w:p>
       <w:pPr>
@@ -11897,11 +11927,11 @@
       <w:pPr>
         <w:pStyle w:val="Heading2"/>
       </w:pPr>
-      <w:bookmarkStart w:id="87" w:name="chapter-5-a-type-is-not-yet-a-layout"/>
+      <w:bookmarkStart w:id="88" w:name="chapter-5-a-type-is-not-yet-a-layout"/>
       <w:r>
         <w:t xml:space="preserve">A Type Is Not Yet a Layout</w:t>
       </w:r>
-      <w:bookmarkEnd w:id="87"/>
+      <w:bookmarkEnd w:id="88"/>
     </w:p>
     <w:p>
       <w:pPr>
@@ -12406,11 +12436,11 @@
       <w:pPr>
         <w:pStyle w:val="Heading2"/>
       </w:pPr>
-      <w:bookmarkStart w:id="88" w:name="chapter-5-representation-is-a-policy"/>
+      <w:bookmarkStart w:id="89" w:name="chapter-5-representation-is-a-policy"/>
       <w:r>
         <w:t xml:space="preserve">Representation Is a Policy</w:t>
       </w:r>
-      <w:bookmarkEnd w:id="88"/>
+      <w:bookmarkEnd w:id="89"/>
     </w:p>
     <w:p>
       <w:pPr>
@@ -12470,11 +12500,11 @@
       <w:pPr>
         <w:pStyle w:val="Heading2"/>
       </w:pPr>
-      <w:bookmarkStart w:id="89" w:name="chapter-5-a-typed-operation"/>
+      <w:bookmarkStart w:id="90" w:name="chapter-5-a-typed-operation"/>
       <w:r>
         <w:t xml:space="preserve">A Typed Operation</w:t>
       </w:r>
-      <w:bookmarkEnd w:id="89"/>
+      <w:bookmarkEnd w:id="90"/>
     </w:p>
     <w:p>
       <w:pPr>
@@ -12829,11 +12859,11 @@
       <w:pPr>
         <w:pStyle w:val="Heading2"/>
       </w:pPr>
-      <w:bookmarkStart w:id="90" w:name="X879b5975ce4f70824f8d130b6826cf2e3573176"/>
+      <w:bookmarkStart w:id="91" w:name="X879b5975ce4f70824f8d130b6826cf2e3573176"/>
       <w:r>
         <w:t xml:space="preserve">Source Becomes an Intermediate Form</w:t>
       </w:r>
-      <w:bookmarkEnd w:id="90"/>
+      <w:bookmarkEnd w:id="91"/>
     </w:p>
     <w:p>
       <w:pPr>
@@ -12921,7 +12951,7 @@
                     </pic:cNvPicPr>
                   </pic:nvPicPr>
                   <pic:blipFill>
-                    <a:blip r:embed="rId91"/>
+                    <a:blip r:embed="rId92"/>
                     <a:stretch>
                       <a:fillRect/>
                     </a:stretch>
@@ -13031,11 +13061,11 @@
       <w:pPr>
         <w:pStyle w:val="Heading2"/>
       </w:pPr>
-      <w:bookmarkStart w:id="92" w:name="chapter-5-observable-output"/>
+      <w:bookmarkStart w:id="93" w:name="chapter-5-observable-output"/>
       <w:r>
         <w:t xml:space="preserve">Observable Output</w:t>
       </w:r>
-      <w:bookmarkEnd w:id="92"/>
+      <w:bookmarkEnd w:id="93"/>
     </w:p>
     <w:p>
       <w:pPr>
@@ -13103,11 +13133,11 @@
       <w:pPr>
         <w:pStyle w:val="Heading2"/>
       </w:pPr>
-      <w:bookmarkStart w:id="93" w:name="Xbac0ed21fe2971f3fa97646098fea525555c5c3"/>
+      <w:bookmarkStart w:id="94" w:name="Xbac0ed21fe2971f3fa97646098fea525555c5c3"/>
       <w:r>
         <w:t xml:space="preserve">Compilation Stops Before Runtime Analysis</w:t>
       </w:r>
-      <w:bookmarkEnd w:id="93"/>
+      <w:bookmarkEnd w:id="94"/>
     </w:p>
     <w:p>
       <w:pPr>
@@ -13145,11 +13175,11 @@
       <w:pPr>
         <w:pStyle w:val="Heading2"/>
       </w:pPr>
-      <w:bookmarkStart w:id="94" w:name="chapter-5-what-the-probe-establishes"/>
+      <w:bookmarkStart w:id="95" w:name="chapter-5-what-the-probe-establishes"/>
       <w:r>
         <w:t xml:space="preserve">What the Probe Establishes</w:t>
       </w:r>
-      <w:bookmarkEnd w:id="94"/>
+      <w:bookmarkEnd w:id="95"/>
     </w:p>
     <w:p>
       <w:pPr>
@@ -13186,11 +13216,11 @@
       <w:pPr>
         <w:pStyle w:val="Heading2"/>
       </w:pPr>
-      <w:bookmarkStart w:id="95" w:name="X29e6ca295a9db37ce9df3799e8ce3c1b793e49e"/>
+      <w:bookmarkStart w:id="96" w:name="X29e6ca295a9db37ce9df3799e8ce3c1b793e49e"/>
       <w:r>
         <w:t xml:space="preserve">Part I: Structures Ready to Work</w:t>
       </w:r>
-      <w:bookmarkEnd w:id="95"/>
+      <w:bookmarkEnd w:id="96"/>
     </w:p>
     <w:p>
       <w:pPr>
@@ -13220,11 +13250,11 @@
       <w:pPr>
         <w:pStyle w:val="Heading2"/>
       </w:pPr>
-      <w:bookmarkStart w:id="96" w:name="chapter-5-sources-and-evidence"/>
+      <w:bookmarkStart w:id="97" w:name="chapter-5-sources-and-evidence"/>
       <w:r>
         <w:t xml:space="preserve">Sources and Evidence</w:t>
       </w:r>
-      <w:bookmarkEnd w:id="96"/>
+      <w:bookmarkEnd w:id="97"/>
     </w:p>
     <w:p>
       <w:pPr>
@@ -13251,7 +13281,7 @@
       <w:r>
         <w:t xml:space="preserve"> </w:t>
       </w:r>
-      <w:hyperlink r:id="rId97">
+      <w:hyperlink r:id="rId98">
         <w:r>
           <w:rPr>
             <w:rStyle w:val="Hyperlink"/>
@@ -13265,7 +13295,7 @@
       <w:r>
         <w:t xml:space="preserve"> </w:t>
       </w:r>
-      <w:hyperlink r:id="rId98">
+      <w:hyperlink r:id="rId99">
         <w:r>
           <w:rPr>
             <w:rStyle w:val="Hyperlink"/>
@@ -13279,7 +13309,7 @@
       <w:r>
         <w:t xml:space="preserve"> </w:t>
       </w:r>
-      <w:hyperlink r:id="rId99">
+      <w:hyperlink r:id="rId100">
         <w:r>
           <w:rPr>
             <w:rStyle w:val="Hyperlink"/>
@@ -13296,7 +13326,7 @@
       <w:r>
         <w:t xml:space="preserve"> </w:t>
       </w:r>
-      <w:hyperlink r:id="rId100">
+      <w:hyperlink r:id="rId101">
         <w:r>
           <w:rPr>
             <w:rStyle w:val="Hyperlink"/>
@@ -13310,7 +13340,7 @@
       <w:r>
         <w:t xml:space="preserve"> </w:t>
       </w:r>
-      <w:hyperlink r:id="rId101">
+      <w:hyperlink r:id="rId102">
         <w:r>
           <w:rPr>
             <w:rStyle w:val="Hyperlink"/>
@@ -13326,11 +13356,11 @@
       <w:pPr>
         <w:pStyle w:val="Heading1"/>
       </w:pPr>
-      <w:bookmarkStart w:id="102" w:name="chapter-6"/>
+      <w:bookmarkStart w:id="103" w:name="chapter-6"/>
       <w:r>
         <w:t xml:space="preserve">Chapter 6 — Learning by Adjustment</w:t>
       </w:r>
-      <w:bookmarkEnd w:id="102"/>
+      <w:bookmarkEnd w:id="103"/>
     </w:p>
     <w:p>
       <w:pPr>
@@ -13360,11 +13390,11 @@
       <w:pPr>
         <w:pStyle w:val="Heading2"/>
       </w:pPr>
-      <w:bookmarkStart w:id="103" w:name="X3265169ebfd4c4f3681059cdf04affc716d181e"/>
+      <w:bookmarkStart w:id="104" w:name="X3265169ebfd4c4f3681059cdf04affc716d181e"/>
       <w:r>
         <w:t xml:space="preserve">A Model with Adjustable Parameters</w:t>
       </w:r>
-      <w:bookmarkEnd w:id="103"/>
+      <w:bookmarkEnd w:id="104"/>
     </w:p>
     <w:p>
       <w:pPr>
@@ -13587,11 +13617,11 @@
       <w:pPr>
         <w:pStyle w:val="Heading2"/>
       </w:pPr>
-      <w:bookmarkStart w:id="104" w:name="chapter-6-examples-and-their-weights"/>
+      <w:bookmarkStart w:id="105" w:name="chapter-6-examples-and-their-weights"/>
       <w:r>
         <w:t xml:space="preserve">Examples and Their Weights</w:t>
       </w:r>
-      <w:bookmarkEnd w:id="104"/>
+      <w:bookmarkEnd w:id="105"/>
     </w:p>
     <w:p>
       <w:pPr>
@@ -14271,11 +14301,11 @@
       <w:pPr>
         <w:pStyle w:val="Heading2"/>
       </w:pPr>
-      <w:bookmarkStart w:id="105" w:name="chapter-6-from-loss-to-gradient"/>
+      <w:bookmarkStart w:id="106" w:name="chapter-6-from-loss-to-gradient"/>
       <w:r>
         <w:t xml:space="preserve">From Loss to Gradient</w:t>
       </w:r>
-      <w:bookmarkEnd w:id="105"/>
+      <w:bookmarkEnd w:id="106"/>
     </w:p>
     <w:p>
       <w:pPr>
@@ -14942,11 +14972,11 @@
       <w:pPr>
         <w:pStyle w:val="Heading2"/>
       </w:pPr>
-      <w:bookmarkStart w:id="106" w:name="chapter-6-an-update-is-a-decision"/>
+      <w:bookmarkStart w:id="107" w:name="chapter-6-an-update-is-a-decision"/>
       <w:r>
         <w:t xml:space="preserve">An Update Is a Decision</w:t>
       </w:r>
-      <w:bookmarkEnd w:id="106"/>
+      <w:bookmarkEnd w:id="107"/>
     </w:p>
     <w:p>
       <w:pPr>
@@ -15237,11 +15267,11 @@
       <w:pPr>
         <w:pStyle w:val="Heading2"/>
       </w:pPr>
-      <w:bookmarkStart w:id="107" w:name="chapter-6-the-repeated-loop"/>
+      <w:bookmarkStart w:id="108" w:name="chapter-6-the-repeated-loop"/>
       <w:r>
         <w:t xml:space="preserve">The Repeated Loop</w:t>
       </w:r>
-      <w:bookmarkEnd w:id="107"/>
+      <w:bookmarkEnd w:id="108"/>
     </w:p>
     <w:p>
       <w:pPr>
@@ -15685,7 +15715,7 @@
                     </pic:cNvPicPr>
                   </pic:nvPicPr>
                   <pic:blipFill>
-                    <a:blip r:embed="rId108"/>
+                    <a:blip r:embed="rId109"/>
                     <a:stretch>
                       <a:fillRect/>
                     </a:stretch>
@@ -15829,11 +15859,11 @@
       <w:pPr>
         <w:pStyle w:val="Heading2"/>
       </w:pPr>
-      <w:bookmarkStart w:id="109" w:name="Xf0066358c1c75d0a6dbe6fef4aae98466b0e8f1"/>
+      <w:bookmarkStart w:id="110" w:name="Xf0066358c1c75d0a6dbe6fef4aae98466b0e8f1"/>
       <w:r>
         <w:t xml:space="preserve">Direction Does Not Guarantee a Good Step</w:t>
       </w:r>
-      <w:bookmarkEnd w:id="109"/>
+      <w:bookmarkEnd w:id="110"/>
     </w:p>
     <w:p>
       <w:pPr>
@@ -15928,11 +15958,11 @@
       <w:pPr>
         <w:pStyle w:val="Heading2"/>
       </w:pPr>
-      <w:bookmarkStart w:id="110" w:name="X990cc1089927d18cca87a08ec92dc6dc41ba72b"/>
+      <w:bookmarkStart w:id="111" w:name="X990cc1089927d18cca87a08ec92dc6dc41ba72b"/>
       <w:r>
         <w:t xml:space="preserve">Training Loss Is Not Generalization</w:t>
       </w:r>
-      <w:bookmarkEnd w:id="110"/>
+      <w:bookmarkEnd w:id="111"/>
     </w:p>
     <w:p>
       <w:pPr>
@@ -15977,11 +16007,11 @@
       <w:pPr>
         <w:pStyle w:val="Heading2"/>
       </w:pPr>
-      <w:bookmarkStart w:id="111" w:name="Xacc1778ad5b885dfe27311be5ac902dfb7fd486"/>
+      <w:bookmarkStart w:id="112" w:name="Xacc1778ad5b885dfe27311be5ac902dfb7fd486"/>
       <w:r>
         <w:t xml:space="preserve">From One Unit to Layered Systems</w:t>
       </w:r>
-      <w:bookmarkEnd w:id="111"/>
+      <w:bookmarkEnd w:id="112"/>
     </w:p>
     <w:p>
       <w:pPr>
@@ -16011,11 +16041,11 @@
       <w:pPr>
         <w:pStyle w:val="Heading2"/>
       </w:pPr>
-      <w:bookmarkStart w:id="112" w:name="chapter-6-what-the-probe-establishes"/>
+      <w:bookmarkStart w:id="113" w:name="chapter-6-what-the-probe-establishes"/>
       <w:r>
         <w:t xml:space="preserve">What the Probe Establishes</w:t>
       </w:r>
-      <w:bookmarkEnd w:id="112"/>
+      <w:bookmarkEnd w:id="113"/>
     </w:p>
     <w:p>
       <w:pPr>
@@ -16082,11 +16112,11 @@
       <w:pPr>
         <w:pStyle w:val="Heading2"/>
       </w:pPr>
-      <w:bookmarkStart w:id="113" w:name="chapter-6-adjustment-ready-to-scale"/>
+      <w:bookmarkStart w:id="114" w:name="chapter-6-adjustment-ready-to-scale"/>
       <w:r>
         <w:t xml:space="preserve">Adjustment Ready to Scale</w:t>
       </w:r>
-      <w:bookmarkEnd w:id="113"/>
+      <w:bookmarkEnd w:id="114"/>
     </w:p>
     <w:p>
       <w:pPr>
@@ -16116,11 +16146,11 @@
       <w:pPr>
         <w:pStyle w:val="Heading2"/>
       </w:pPr>
-      <w:bookmarkStart w:id="114" w:name="chapter-6-sources-and-evidence"/>
+      <w:bookmarkStart w:id="115" w:name="chapter-6-sources-and-evidence"/>
       <w:r>
         <w:t xml:space="preserve">Sources and Evidence</w:t>
       </w:r>
-      <w:bookmarkEnd w:id="114"/>
+      <w:bookmarkEnd w:id="115"/>
     </w:p>
     <w:p>
       <w:pPr>
@@ -16132,7 +16162,7 @@
       <w:r>
         <w:t xml:space="preserve"> </w:t>
       </w:r>
-      <w:hyperlink r:id="rId115">
+      <w:hyperlink r:id="rId116">
         <w:r>
           <w:rPr>
             <w:rStyle w:val="Hyperlink"/>
@@ -16146,7 +16176,7 @@
       <w:r>
         <w:t xml:space="preserve"> </w:t>
       </w:r>
-      <w:hyperlink r:id="rId116">
+      <w:hyperlink r:id="rId117">
         <w:r>
           <w:rPr>
             <w:rStyle w:val="Hyperlink"/>
@@ -16160,7 +16190,7 @@
       <w:r>
         <w:t xml:space="preserve"> </w:t>
       </w:r>
-      <w:hyperlink r:id="rId117">
+      <w:hyperlink r:id="rId118">
         <w:r>
           <w:rPr>
             <w:rStyle w:val="Hyperlink"/>
@@ -16174,7 +16204,7 @@
       <w:r>
         <w:t xml:space="preserve"> </w:t>
       </w:r>
-      <w:hyperlink r:id="rId118">
+      <w:hyperlink r:id="rId119">
         <w:r>
           <w:rPr>
             <w:rStyle w:val="Hyperlink"/>
@@ -16190,11 +16220,11 @@
       <w:pPr>
         <w:pStyle w:val="Heading1"/>
       </w:pPr>
-      <w:bookmarkStart w:id="119" w:name="chapter-7"/>
+      <w:bookmarkStart w:id="120" w:name="chapter-7"/>
       <w:r>
         <w:t xml:space="preserve">Chapter 7 — Tensors and Parallel Machines</w:t>
       </w:r>
-      <w:bookmarkEnd w:id="119"/>
+      <w:bookmarkEnd w:id="120"/>
     </w:p>
     <w:p>
       <w:pPr>
@@ -16224,11 +16254,11 @@
       <w:pPr>
         <w:pStyle w:val="Heading2"/>
       </w:pPr>
-      <w:bookmarkStart w:id="120" w:name="chapter-7-shape-before-arithmetic"/>
+      <w:bookmarkStart w:id="121" w:name="chapter-7-shape-before-arithmetic"/>
       <w:r>
         <w:t xml:space="preserve">Shape Before Arithmetic</w:t>
       </w:r>
-      <w:bookmarkEnd w:id="120"/>
+      <w:bookmarkEnd w:id="121"/>
     </w:p>
     <w:p>
       <w:pPr>
@@ -16397,11 +16427,11 @@
       <w:pPr>
         <w:pStyle w:val="Heading2"/>
       </w:pPr>
-      <w:bookmarkStart w:id="121" w:name="X440585e5228cb621a9719a90729bdd489b6efa5"/>
+      <w:bookmarkStart w:id="122" w:name="X440585e5228cb621a9719a90729bdd489b6efa5"/>
       <w:r>
         <w:t xml:space="preserve">Matrix Multiplication Across a Batch</w:t>
       </w:r>
-      <w:bookmarkEnd w:id="121"/>
+      <w:bookmarkEnd w:id="122"/>
     </w:p>
     <w:p>
       <w:pPr>
@@ -16799,11 +16829,11 @@
       <w:pPr>
         <w:pStyle w:val="Heading2"/>
       </w:pPr>
-      <w:bookmarkStart w:id="122" w:name="chapter-7-one-output-cell"/>
+      <w:bookmarkStart w:id="123" w:name="chapter-7-one-output-cell"/>
       <w:r>
         <w:t xml:space="preserve">One Output Cell</w:t>
       </w:r>
-      <w:bookmarkEnd w:id="122"/>
+      <w:bookmarkEnd w:id="123"/>
     </w:p>
     <w:p>
       <w:pPr>
@@ -17108,11 +17138,11 @@
       <w:pPr>
         <w:pStyle w:val="Heading2"/>
       </w:pPr>
-      <w:bookmarkStart w:id="123" w:name="X2f41cde74f278dd6d5e9105d37b285930f03898"/>
+      <w:bookmarkStart w:id="124" w:name="X2f41cde74f278dd6d5e9105d37b285930f03898"/>
       <w:r>
         <w:t xml:space="preserve">From Coordinates to Work Assignments</w:t>
       </w:r>
-      <w:bookmarkEnd w:id="123"/>
+      <w:bookmarkEnd w:id="124"/>
     </w:p>
     <w:p>
       <w:pPr>
@@ -17555,7 +17585,7 @@
                     </pic:cNvPicPr>
                   </pic:nvPicPr>
                   <pic:blipFill>
-                    <a:blip r:embed="rId124"/>
+                    <a:blip r:embed="rId125"/>
                     <a:stretch>
                       <a:fillRect/>
                     </a:stretch>
@@ -17613,11 +17643,11 @@
       <w:pPr>
         <w:pStyle w:val="Heading2"/>
       </w:pPr>
-      <w:bookmarkStart w:id="125" w:name="chapter-7-the-missing-cell"/>
+      <w:bookmarkStart w:id="126" w:name="chapter-7-the-missing-cell"/>
       <w:r>
         <w:t xml:space="preserve">The Missing Cell</w:t>
       </w:r>
-      <w:bookmarkEnd w:id="125"/>
+      <w:bookmarkEnd w:id="126"/>
     </w:p>
     <w:p>
       <w:pPr>
@@ -17698,11 +17728,11 @@
       <w:pPr>
         <w:pStyle w:val="Heading2"/>
       </w:pPr>
-      <w:bookmarkStart w:id="126" w:name="X55bd3d360b00e57518e4b56c8e0fa845df8ffbf"/>
+      <w:bookmarkStart w:id="127" w:name="X55bd3d360b00e57518e4b56c8e0fa845df8ffbf"/>
       <w:r>
         <w:t xml:space="preserve">Parallel Structure Is Not Parallel Execution</w:t>
       </w:r>
-      <w:bookmarkEnd w:id="126"/>
+      <w:bookmarkEnd w:id="127"/>
     </w:p>
     <w:p>
       <w:pPr>
@@ -17755,11 +17785,11 @@
       <w:pPr>
         <w:pStyle w:val="Heading2"/>
       </w:pPr>
-      <w:bookmarkStart w:id="127" w:name="X3412c87be45baf85bf87e13ce997dc5e56939db"/>
+      <w:bookmarkStart w:id="128" w:name="X3412c87be45baf85bf87e13ce997dc5e56939db"/>
       <w:r>
         <w:t xml:space="preserve">Where Performance Actually Enters</w:t>
       </w:r>
-      <w:bookmarkEnd w:id="127"/>
+      <w:bookmarkEnd w:id="128"/>
     </w:p>
     <w:p>
       <w:pPr>
@@ -17789,11 +17819,11 @@
       <w:pPr>
         <w:pStyle w:val="Heading2"/>
       </w:pPr>
-      <w:bookmarkStart w:id="128" w:name="chapter-7-what-the-probe-establishes"/>
+      <w:bookmarkStart w:id="129" w:name="chapter-7-what-the-probe-establishes"/>
       <w:r>
         <w:t xml:space="preserve">What the Probe Establishes</w:t>
       </w:r>
-      <w:bookmarkEnd w:id="128"/>
+      <w:bookmarkEnd w:id="129"/>
     </w:p>
     <w:p>
       <w:pPr>
@@ -17830,11 +17860,11 @@
       <w:pPr>
         <w:pStyle w:val="Heading2"/>
       </w:pPr>
-      <w:bookmarkStart w:id="129" w:name="X2d6a0520e9c265748444003f5453a890951319b"/>
+      <w:bookmarkStart w:id="130" w:name="X2d6a0520e9c265748444003f5453a890951319b"/>
       <w:r>
         <w:t xml:space="preserve">Shaped Work Ready for Later Systems</w:t>
       </w:r>
-      <w:bookmarkEnd w:id="129"/>
+      <w:bookmarkEnd w:id="130"/>
     </w:p>
     <w:p>
       <w:pPr>
@@ -17864,11 +17894,11 @@
       <w:pPr>
         <w:pStyle w:val="Heading2"/>
       </w:pPr>
-      <w:bookmarkStart w:id="130" w:name="chapter-7-sources-and-evidence"/>
+      <w:bookmarkStart w:id="131" w:name="chapter-7-sources-and-evidence"/>
       <w:r>
         <w:t xml:space="preserve">Sources and Evidence</w:t>
       </w:r>
-      <w:bookmarkEnd w:id="130"/>
+      <w:bookmarkEnd w:id="131"/>
     </w:p>
     <w:p>
       <w:pPr>
@@ -17880,7 +17910,7 @@
       <w:r>
         <w:t xml:space="preserve"> </w:t>
       </w:r>
-      <w:hyperlink r:id="rId131">
+      <w:hyperlink r:id="rId132">
         <w:r>
           <w:rPr>
             <w:rStyle w:val="Hyperlink"/>
@@ -17894,7 +17924,7 @@
       <w:r>
         <w:t xml:space="preserve"> </w:t>
       </w:r>
-      <w:hyperlink r:id="rId132">
+      <w:hyperlink r:id="rId133">
         <w:r>
           <w:rPr>
             <w:rStyle w:val="Hyperlink"/>
@@ -17908,7 +17938,7 @@
       <w:r>
         <w:t xml:space="preserve"> </w:t>
       </w:r>
-      <w:hyperlink r:id="rId133">
+      <w:hyperlink r:id="rId134">
         <w:r>
           <w:rPr>
             <w:rStyle w:val="Hyperlink"/>
@@ -17922,7 +17952,7 @@
       <w:r>
         <w:t xml:space="preserve"> </w:t>
       </w:r>
-      <w:hyperlink r:id="rId134">
+      <w:hyperlink r:id="rId135">
         <w:r>
           <w:rPr>
             <w:rStyle w:val="Hyperlink"/>
@@ -17938,11 +17968,11 @@
       <w:pPr>
         <w:pStyle w:val="Heading1"/>
       </w:pPr>
-      <w:bookmarkStart w:id="135" w:name="chapter-8"/>
+      <w:bookmarkStart w:id="136" w:name="chapter-8"/>
       <w:r>
         <w:t xml:space="preserve">Chapter 8 — Learned Spaces</w:t>
       </w:r>
-      <w:bookmarkEnd w:id="135"/>
+      <w:bookmarkEnd w:id="136"/>
     </w:p>
     <w:p>
       <w:pPr>
@@ -17972,11 +18002,11 @@
       <w:pPr>
         <w:pStyle w:val="Heading2"/>
       </w:pPr>
-      <w:bookmarkStart w:id="136" w:name="chapter-8-what-makes-a-space-learned"/>
+      <w:bookmarkStart w:id="137" w:name="chapter-8-what-makes-a-space-learned"/>
       <w:r>
         <w:t xml:space="preserve">What Makes a Space Learned</w:t>
       </w:r>
-      <w:bookmarkEnd w:id="136"/>
+      <w:bookmarkEnd w:id="137"/>
     </w:p>
     <w:p>
       <w:pPr>
@@ -18029,11 +18059,11 @@
       <w:pPr>
         <w:pStyle w:val="Heading2"/>
       </w:pPr>
-      <w:bookmarkStart w:id="137" w:name="Xa8fb180c7d02db4df4833975e66f0a639c0f572"/>
+      <w:bookmarkStart w:id="138" w:name="Xa8fb180c7d02db4df4833975e66f0a639c0f572"/>
       <w:r>
         <w:t xml:space="preserve">Coordinates Are Not Their Labels</w:t>
       </w:r>
-      <w:bookmarkEnd w:id="137"/>
+      <w:bookmarkEnd w:id="138"/>
     </w:p>
     <w:p>
       <w:pPr>
@@ -18277,11 +18307,11 @@
       <w:pPr>
         <w:pStyle w:val="Heading2"/>
       </w:pPr>
-      <w:bookmarkStart w:id="138" w:name="chapter-8-two-ways-to-be-near"/>
+      <w:bookmarkStart w:id="139" w:name="chapter-8-two-ways-to-be-near"/>
       <w:r>
         <w:t xml:space="preserve">Two Ways to Be Near</w:t>
       </w:r>
-      <w:bookmarkEnd w:id="138"/>
+      <w:bookmarkEnd w:id="139"/>
     </w:p>
     <w:p>
       <w:pPr>
@@ -18877,11 +18907,11 @@
       <w:pPr>
         <w:pStyle w:val="Heading2"/>
       </w:pPr>
-      <w:bookmarkStart w:id="139" w:name="X310bd15d2ff42e39f27cafecec5de1df6793905"/>
+      <w:bookmarkStart w:id="140" w:name="X310bd15d2ff42e39f27cafecec5de1df6793905"/>
       <w:r>
         <w:t xml:space="preserve">A Transformation That Preserves Distance</w:t>
       </w:r>
-      <w:bookmarkEnd w:id="139"/>
+      <w:bookmarkEnd w:id="140"/>
     </w:p>
     <w:p>
       <w:pPr>
@@ -19087,11 +19117,11 @@
       <w:pPr>
         <w:pStyle w:val="Heading2"/>
       </w:pPr>
-      <w:bookmarkStart w:id="140" w:name="X633ecf68414941376f8107c5e35a7c91c71ae4c"/>
+      <w:bookmarkStart w:id="141" w:name="X633ecf68414941376f8107c5e35a7c91c71ae4c"/>
       <w:r>
         <w:t xml:space="preserve">Invertible Does Not Mean Distance-Preserving</w:t>
       </w:r>
-      <w:bookmarkEnd w:id="140"/>
+      <w:bookmarkEnd w:id="141"/>
     </w:p>
     <w:p>
       <w:pPr>
@@ -19233,7 +19263,7 @@
                     </pic:cNvPicPr>
                   </pic:nvPicPr>
                   <pic:blipFill>
-                    <a:blip r:embed="rId141"/>
+                    <a:blip r:embed="rId142"/>
                     <a:stretch>
                       <a:fillRect/>
                     </a:stretch>
@@ -19299,11 +19329,11 @@
       <w:pPr>
         <w:pStyle w:val="Heading2"/>
       </w:pPr>
-      <w:bookmarkStart w:id="142" w:name="Xfe0ff668d2a970f22ed9116526036bc05cb97ab"/>
+      <w:bookmarkStart w:id="143" w:name="Xfe0ff668d2a970f22ed9116526036bc05cb97ab"/>
       <w:r>
         <w:t xml:space="preserve">Geometry Across Training and Context</w:t>
       </w:r>
-      <w:bookmarkEnd w:id="142"/>
+      <w:bookmarkEnd w:id="143"/>
     </w:p>
     <w:p>
       <w:pPr>
@@ -19325,11 +19355,11 @@
       <w:pPr>
         <w:pStyle w:val="Heading2"/>
       </w:pPr>
-      <w:bookmarkStart w:id="143" w:name="X30203e97e7efbebbcb1b87a738f1bb1e5da13af"/>
+      <w:bookmarkStart w:id="144" w:name="X30203e97e7efbebbcb1b87a738f1bb1e5da13af"/>
       <w:r>
         <w:t xml:space="preserve">From Regularity to Interpretation</w:t>
       </w:r>
-      <w:bookmarkEnd w:id="143"/>
+      <w:bookmarkEnd w:id="144"/>
     </w:p>
     <w:p>
       <w:pPr>
@@ -19359,11 +19389,11 @@
       <w:pPr>
         <w:pStyle w:val="Heading2"/>
       </w:pPr>
-      <w:bookmarkStart w:id="144" w:name="chapter-8-what-the-probe-establishes"/>
+      <w:bookmarkStart w:id="145" w:name="chapter-8-what-the-probe-establishes"/>
       <w:r>
         <w:t xml:space="preserve">What the Probe Establishes</w:t>
       </w:r>
-      <w:bookmarkEnd w:id="144"/>
+      <w:bookmarkEnd w:id="145"/>
     </w:p>
     <w:p>
       <w:pPr>
@@ -19430,11 +19460,11 @@
       <w:pPr>
         <w:pStyle w:val="Heading2"/>
       </w:pPr>
-      <w:bookmarkStart w:id="145" w:name="chapter-8-geometry-ready-for-convergence"/>
+      <w:bookmarkStart w:id="146" w:name="chapter-8-geometry-ready-for-convergence"/>
       <w:r>
         <w:t xml:space="preserve">Geometry Ready for Convergence</w:t>
       </w:r>
-      <w:bookmarkEnd w:id="145"/>
+      <w:bookmarkEnd w:id="146"/>
     </w:p>
     <w:p>
       <w:pPr>
@@ -19456,11 +19486,11 @@
       <w:pPr>
         <w:pStyle w:val="Heading2"/>
       </w:pPr>
-      <w:bookmarkStart w:id="146" w:name="chapter-8-sources-and-evidence"/>
+      <w:bookmarkStart w:id="147" w:name="chapter-8-sources-and-evidence"/>
       <w:r>
         <w:t xml:space="preserve">Sources and Evidence</w:t>
       </w:r>
-      <w:bookmarkEnd w:id="146"/>
+      <w:bookmarkEnd w:id="147"/>
     </w:p>
     <w:p>
       <w:pPr>
@@ -19472,7 +19502,7 @@
       <w:r>
         <w:t xml:space="preserve"> </w:t>
       </w:r>
-      <w:hyperlink r:id="rId147">
+      <w:hyperlink r:id="rId148">
         <w:r>
           <w:rPr>
             <w:rStyle w:val="Hyperlink"/>
@@ -19486,7 +19516,7 @@
       <w:r>
         <w:t xml:space="preserve"> </w:t>
       </w:r>
-      <w:hyperlink r:id="rId148">
+      <w:hyperlink r:id="rId149">
         <w:r>
           <w:rPr>
             <w:rStyle w:val="Hyperlink"/>
@@ -19500,7 +19530,7 @@
       <w:r>
         <w:t xml:space="preserve"> </w:t>
       </w:r>
-      <w:hyperlink r:id="rId149">
+      <w:hyperlink r:id="rId150">
         <w:r>
           <w:rPr>
             <w:rStyle w:val="Hyperlink"/>
@@ -19514,7 +19544,7 @@
       <w:r>
         <w:t xml:space="preserve"> </w:t>
       </w:r>
-      <w:hyperlink r:id="rId150">
+      <w:hyperlink r:id="rId151">
         <w:r>
           <w:rPr>
             <w:rStyle w:val="Hyperlink"/>
@@ -19530,11 +19560,11 @@
       <w:pPr>
         <w:pStyle w:val="Heading1"/>
       </w:pPr>
-      <w:bookmarkStart w:id="151" w:name="chapter-9"/>
+      <w:bookmarkStart w:id="152" w:name="chapter-9"/>
       <w:r>
         <w:t xml:space="preserve">Chapter 9 — Sequence, Memory, and Runtime</w:t>
       </w:r>
-      <w:bookmarkEnd w:id="151"/>
+      <w:bookmarkEnd w:id="152"/>
     </w:p>
     <w:p>
       <w:pPr>
@@ -19564,11 +19594,11 @@
       <w:pPr>
         <w:pStyle w:val="Heading2"/>
       </w:pPr>
-      <w:bookmarkStart w:id="152" w:name="chapter-9-order-before-recurrence"/>
+      <w:bookmarkStart w:id="153" w:name="chapter-9-order-before-recurrence"/>
       <w:r>
         <w:t xml:space="preserve">Order Before Recurrence</w:t>
       </w:r>
-      <w:bookmarkEnd w:id="152"/>
+      <w:bookmarkEnd w:id="153"/>
     </w:p>
     <w:p>
       <w:pPr>
@@ -20389,11 +20419,11 @@
       <w:pPr>
         <w:pStyle w:val="Heading2"/>
       </w:pPr>
-      <w:bookmarkStart w:id="153" w:name="chapter-9-the-path-through-time"/>
+      <w:bookmarkStart w:id="154" w:name="chapter-9-the-path-through-time"/>
       <w:r>
         <w:t xml:space="preserve">The Path Through Time</w:t>
       </w:r>
-      <w:bookmarkEnd w:id="153"/>
+      <w:bookmarkEnd w:id="154"/>
     </w:p>
     <w:p>
       <w:pPr>
@@ -20602,11 +20632,11 @@
       <w:pPr>
         <w:pStyle w:val="Heading2"/>
       </w:pPr>
-      <w:bookmarkStart w:id="154" w:name="chapter-9-sensitivity-across-the-path"/>
+      <w:bookmarkStart w:id="155" w:name="chapter-9-sensitivity-across-the-path"/>
       <w:r>
         <w:t xml:space="preserve">Sensitivity Across the Path</w:t>
       </w:r>
-      <w:bookmarkEnd w:id="154"/>
+      <w:bookmarkEnd w:id="155"/>
     </w:p>
     <w:p>
       <w:pPr>
@@ -21367,7 +21397,7 @@
                     </pic:cNvPicPr>
                   </pic:nvPicPr>
                   <pic:blipFill>
-                    <a:blip r:embed="rId155"/>
+                    <a:blip r:embed="rId156"/>
                     <a:stretch>
                       <a:fillRect/>
                     </a:stretch>
@@ -21417,11 +21447,11 @@
       <w:pPr>
         <w:pStyle w:val="Heading2"/>
       </w:pPr>
-      <w:bookmarkStart w:id="156" w:name="chapter-9-breaking-the-recurrent-link"/>
+      <w:bookmarkStart w:id="157" w:name="chapter-9-breaking-the-recurrent-link"/>
       <w:r>
         <w:t xml:space="preserve">Breaking the Recurrent Link</w:t>
       </w:r>
-      <w:bookmarkEnd w:id="156"/>
+      <w:bookmarkEnd w:id="157"/>
     </w:p>
     <w:p>
       <w:pPr>
@@ -21788,11 +21818,11 @@
       <w:pPr>
         <w:pStyle w:val="Heading2"/>
       </w:pPr>
-      <w:bookmarkStart w:id="157" w:name="chapter-9-what-the-counts-do-not-measure"/>
+      <w:bookmarkStart w:id="158" w:name="chapter-9-what-the-counts-do-not-measure"/>
       <w:r>
         <w:t xml:space="preserve">What the Counts Do Not Measure</w:t>
       </w:r>
-      <w:bookmarkEnd w:id="157"/>
+      <w:bookmarkEnd w:id="158"/>
     </w:p>
     <w:p>
       <w:pPr>
@@ -21865,11 +21895,11 @@
       <w:pPr>
         <w:pStyle w:val="Heading2"/>
       </w:pPr>
-      <w:bookmarkStart w:id="158" w:name="X7e7b4a809b4b461860289788618964876a0af72"/>
+      <w:bookmarkStart w:id="159" w:name="X7e7b4a809b4b461860289788618964876a0af72"/>
       <w:r>
         <w:t xml:space="preserve">Why Gates Entered the Architecture</w:t>
       </w:r>
-      <w:bookmarkEnd w:id="158"/>
+      <w:bookmarkEnd w:id="159"/>
     </w:p>
     <w:p>
       <w:pPr>
@@ -21899,11 +21929,11 @@
       <w:pPr>
         <w:pStyle w:val="Heading2"/>
       </w:pPr>
-      <w:bookmarkStart w:id="159" w:name="chapter-9-the-bottleneck-precisely"/>
+      <w:bookmarkStart w:id="160" w:name="chapter-9-the-bottleneck-precisely"/>
       <w:r>
         <w:t xml:space="preserve">The Bottleneck, Precisely</w:t>
       </w:r>
-      <w:bookmarkEnd w:id="159"/>
+      <w:bookmarkEnd w:id="160"/>
     </w:p>
     <w:p>
       <w:pPr>
@@ -21972,11 +22002,11 @@
       <w:pPr>
         <w:pStyle w:val="Heading2"/>
       </w:pPr>
-      <w:bookmarkStart w:id="160" w:name="chapter-9-what-the-probe-establishes"/>
+      <w:bookmarkStart w:id="161" w:name="chapter-9-what-the-probe-establishes"/>
       <w:r>
         <w:t xml:space="preserve">What the Probe Establishes</w:t>
       </w:r>
-      <w:bookmarkEnd w:id="160"/>
+      <w:bookmarkEnd w:id="161"/>
     </w:p>
     <w:p>
       <w:pPr>
@@ -22027,11 +22057,11 @@
       <w:pPr>
         <w:pStyle w:val="Heading2"/>
       </w:pPr>
-      <w:bookmarkStart w:id="161" w:name="X640c13c3ec6c08105aa6aaf3f8463e2d07f5a7e"/>
+      <w:bookmarkStart w:id="162" w:name="X640c13c3ec6c08105aa6aaf3f8463e2d07f5a7e"/>
       <w:r>
         <w:t xml:space="preserve">Part II: The Constraint Attention Inherits</w:t>
       </w:r>
-      <w:bookmarkEnd w:id="161"/>
+      <w:bookmarkEnd w:id="162"/>
     </w:p>
     <w:p>
       <w:pPr>
@@ -22053,11 +22083,11 @@
       <w:pPr>
         <w:pStyle w:val="Heading2"/>
       </w:pPr>
-      <w:bookmarkStart w:id="162" w:name="chapter-9-sources-and-evidence"/>
+      <w:bookmarkStart w:id="163" w:name="chapter-9-sources-and-evidence"/>
       <w:r>
         <w:t xml:space="preserve">Sources and Evidence</w:t>
       </w:r>
-      <w:bookmarkEnd w:id="162"/>
+      <w:bookmarkEnd w:id="163"/>
     </w:p>
     <w:p>
       <w:pPr>
@@ -22069,7 +22099,7 @@
       <w:r>
         <w:t xml:space="preserve"> </w:t>
       </w:r>
-      <w:hyperlink r:id="rId163">
+      <w:hyperlink r:id="rId164">
         <w:r>
           <w:rPr>
             <w:rStyle w:val="Hyperlink"/>
@@ -22083,7 +22113,7 @@
       <w:r>
         <w:t xml:space="preserve"> </w:t>
       </w:r>
-      <w:hyperlink r:id="rId164">
+      <w:hyperlink r:id="rId165">
         <w:r>
           <w:rPr>
             <w:rStyle w:val="Hyperlink"/>
@@ -22097,7 +22127,7 @@
       <w:r>
         <w:t xml:space="preserve"> </w:t>
       </w:r>
-      <w:hyperlink r:id="rId165">
+      <w:hyperlink r:id="rId166">
         <w:r>
           <w:rPr>
             <w:rStyle w:val="Hyperlink"/>
@@ -22111,7 +22141,7 @@
       <w:r>
         <w:t xml:space="preserve"> </w:t>
       </w:r>
-      <w:hyperlink r:id="rId166">
+      <w:hyperlink r:id="rId167">
         <w:r>
           <w:rPr>
             <w:rStyle w:val="Hyperlink"/>
@@ -22127,11 +22157,11 @@
       <w:pPr>
         <w:pStyle w:val="Heading1"/>
       </w:pPr>
-      <w:bookmarkStart w:id="167" w:name="chapter-10"/>
+      <w:bookmarkStart w:id="168" w:name="chapter-10"/>
       <w:r>
         <w:t xml:space="preserve">Chapter 10 — Attention Changes the Path</w:t>
       </w:r>
-      <w:bookmarkEnd w:id="167"/>
+      <w:bookmarkEnd w:id="168"/>
     </w:p>
     <w:p>
       <w:pPr>
@@ -22161,11 +22191,11 @@
       <w:pPr>
         <w:pStyle w:val="Heading2"/>
       </w:pPr>
-      <w:bookmarkStart w:id="168" w:name="chapter-10-three-roles-at-each-position"/>
+      <w:bookmarkStart w:id="169" w:name="chapter-10-three-roles-at-each-position"/>
       <w:r>
         <w:t xml:space="preserve">Three Roles at Each Position</w:t>
       </w:r>
-      <w:bookmarkEnd w:id="168"/>
+      <w:bookmarkEnd w:id="169"/>
     </w:p>
     <w:p>
       <w:pPr>
@@ -22587,11 +22617,11 @@
       <w:pPr>
         <w:pStyle w:val="Heading2"/>
       </w:pPr>
-      <w:bookmarkStart w:id="169" w:name="chapter-10-scores-become-weights"/>
+      <w:bookmarkStart w:id="170" w:name="chapter-10-scores-become-weights"/>
       <w:r>
         <w:t xml:space="preserve">Scores Become Weights</w:t>
       </w:r>
-      <w:bookmarkEnd w:id="169"/>
+      <w:bookmarkEnd w:id="170"/>
     </w:p>
     <w:p>
       <w:pPr>
@@ -22795,11 +22825,11 @@
       <w:pPr>
         <w:pStyle w:val="Heading2"/>
       </w:pPr>
-      <w:bookmarkStart w:id="170" w:name="chapter-10-weights-act-on-values"/>
+      <w:bookmarkStart w:id="171" w:name="chapter-10-weights-act-on-values"/>
       <w:r>
         <w:t xml:space="preserve">Weights Act on Values</w:t>
       </w:r>
-      <w:bookmarkEnd w:id="170"/>
+      <w:bookmarkEnd w:id="171"/>
     </w:p>
     <w:p>
       <w:pPr>
@@ -23422,11 +23452,11 @@
       <w:pPr>
         <w:pStyle w:val="Heading2"/>
       </w:pPr>
-      <w:bookmarkStart w:id="171" w:name="chapter-10-a-direct-contribution-path"/>
+      <w:bookmarkStart w:id="172" w:name="chapter-10-a-direct-contribution-path"/>
       <w:r>
         <w:t xml:space="preserve">A Direct Contribution Path</w:t>
       </w:r>
-      <w:bookmarkEnd w:id="171"/>
+      <w:bookmarkEnd w:id="172"/>
     </w:p>
     <w:p>
       <w:pPr>
@@ -23659,7 +23689,7 @@
                     </pic:cNvPicPr>
                   </pic:nvPicPr>
                   <pic:blipFill>
-                    <a:blip r:embed="rId172"/>
+                    <a:blip r:embed="rId173"/>
                     <a:stretch>
                       <a:fillRect/>
                     </a:stretch>
@@ -23717,11 +23747,11 @@
       <w:pPr>
         <w:pStyle w:val="Heading2"/>
       </w:pPr>
-      <w:bookmarkStart w:id="173" w:name="chapter-10-hold-the-weights-fixed"/>
+      <w:bookmarkStart w:id="174" w:name="chapter-10-hold-the-weights-fixed"/>
       <w:r>
         <w:t xml:space="preserve">Hold the Weights Fixed</w:t>
       </w:r>
-      <w:bookmarkEnd w:id="173"/>
+      <w:bookmarkEnd w:id="174"/>
     </w:p>
     <w:p>
       <w:pPr>
@@ -23965,11 +23995,11 @@
       <w:pPr>
         <w:pStyle w:val="Heading2"/>
       </w:pPr>
-      <w:bookmarkStart w:id="174" w:name="X05880b48fd5b0a68734c840407b53e30ae6aa48"/>
+      <w:bookmarkStart w:id="175" w:name="X05880b48fd5b0a68734c840407b53e30ae6aa48"/>
       <w:r>
         <w:t xml:space="preserve">Masking Changes the Admitted Set</w:t>
       </w:r>
-      <w:bookmarkEnd w:id="174"/>
+      <w:bookmarkEnd w:id="175"/>
     </w:p>
     <w:p>
       <w:pPr>
@@ -24035,11 +24065,11 @@
       <w:pPr>
         <w:pStyle w:val="Heading2"/>
       </w:pPr>
-      <w:bookmarkStart w:id="175" w:name="X08c5dd8afe3eb0c034f6411338b7f1a3ef4e725"/>
+      <w:bookmarkStart w:id="176" w:name="X08c5dd8afe3eb0c034f6411338b7f1a3ef4e725"/>
       <w:r>
         <w:t xml:space="preserve">From Alignment to Self-Attention</w:t>
       </w:r>
-      <w:bookmarkEnd w:id="175"/>
+      <w:bookmarkEnd w:id="176"/>
     </w:p>
     <w:p>
       <w:pPr>
@@ -24069,11 +24099,11 @@
       <w:pPr>
         <w:pStyle w:val="Heading2"/>
       </w:pPr>
-      <w:bookmarkStart w:id="176" w:name="X322d773348c0471fd226f4bfbfea336687ea7a7"/>
+      <w:bookmarkStart w:id="177" w:name="X322d773348c0471fd226f4bfbfea336687ea7a7"/>
       <w:r>
         <w:t xml:space="preserve">Attention Weight Is Not Explanation</w:t>
       </w:r>
-      <w:bookmarkEnd w:id="176"/>
+      <w:bookmarkEnd w:id="177"/>
     </w:p>
     <w:p>
       <w:pPr>
@@ -24167,11 +24197,11 @@
       <w:pPr>
         <w:pStyle w:val="Heading2"/>
       </w:pPr>
-      <w:bookmarkStart w:id="177" w:name="chapter-10-what-the-probe-establishes"/>
+      <w:bookmarkStart w:id="178" w:name="chapter-10-what-the-probe-establishes"/>
       <w:r>
         <w:t xml:space="preserve">What the Probe Establishes</w:t>
       </w:r>
-      <w:bookmarkEnd w:id="177"/>
+      <w:bookmarkEnd w:id="178"/>
     </w:p>
     <w:p>
       <w:pPr>
@@ -24224,11 +24254,11 @@
       <w:pPr>
         <w:pStyle w:val="Heading2"/>
       </w:pPr>
-      <w:bookmarkStart w:id="178" w:name="X2f8f8afe554c277d01736113f87a57e74bec495"/>
+      <w:bookmarkStart w:id="179" w:name="X2f8f8afe554c277d01736113f87a57e74bec495"/>
       <w:r>
         <w:t xml:space="preserve">Attention Ready for Architecture</w:t>
       </w:r>
-      <w:bookmarkEnd w:id="178"/>
+      <w:bookmarkEnd w:id="179"/>
     </w:p>
     <w:p>
       <w:pPr>
@@ -24250,11 +24280,11 @@
       <w:pPr>
         <w:pStyle w:val="Heading2"/>
       </w:pPr>
-      <w:bookmarkStart w:id="179" w:name="chapter-10-sources-and-evidence"/>
+      <w:bookmarkStart w:id="180" w:name="chapter-10-sources-and-evidence"/>
       <w:r>
         <w:t xml:space="preserve">Sources and Evidence</w:t>
       </w:r>
-      <w:bookmarkEnd w:id="179"/>
+      <w:bookmarkEnd w:id="180"/>
     </w:p>
     <w:p>
       <w:pPr>
@@ -24266,7 +24296,7 @@
       <w:r>
         <w:t xml:space="preserve"> </w:t>
       </w:r>
-      <w:hyperlink r:id="rId180">
+      <w:hyperlink r:id="rId181">
         <w:r>
           <w:rPr>
             <w:rStyle w:val="Hyperlink"/>
@@ -24280,7 +24310,7 @@
       <w:r>
         <w:t xml:space="preserve"> </w:t>
       </w:r>
-      <w:hyperlink r:id="rId181">
+      <w:hyperlink r:id="rId182">
         <w:r>
           <w:rPr>
             <w:rStyle w:val="Hyperlink"/>
@@ -24294,7 +24324,7 @@
       <w:r>
         <w:t xml:space="preserve"> </w:t>
       </w:r>
-      <w:hyperlink r:id="rId182">
+      <w:hyperlink r:id="rId183">
         <w:r>
           <w:rPr>
             <w:rStyle w:val="Hyperlink"/>
@@ -24308,7 +24338,7 @@
       <w:r>
         <w:t xml:space="preserve"> </w:t>
       </w:r>
-      <w:hyperlink r:id="rId183">
+      <w:hyperlink r:id="rId184">
         <w:r>
           <w:rPr>
             <w:rStyle w:val="Hyperlink"/>
@@ -24324,11 +24354,11 @@
       <w:pPr>
         <w:pStyle w:val="Heading1"/>
       </w:pPr>
-      <w:bookmarkStart w:id="184" w:name="chapter-11"/>
+      <w:bookmarkStart w:id="185" w:name="chapter-11"/>
       <w:r>
         <w:t xml:space="preserve">Chapter 11 — The Transformer</w:t>
       </w:r>
-      <w:bookmarkEnd w:id="184"/>
+      <w:bookmarkEnd w:id="185"/>
     </w:p>
     <w:p>
       <w:pPr>
@@ -24358,11 +24388,11 @@
       <w:pPr>
         <w:pStyle w:val="Heading2"/>
       </w:pPr>
-      <w:bookmarkStart w:id="185" w:name="X3a72c8ad132b55b1974abb72e326c71e5cb91bf"/>
+      <w:bookmarkStart w:id="186" w:name="X3a72c8ad132b55b1974abb72e326c71e5cb91bf"/>
       <w:r>
         <w:t xml:space="preserve">Attention Is a Component, Not the Whole</w:t>
       </w:r>
-      <w:bookmarkEnd w:id="185"/>
+      <w:bookmarkEnd w:id="186"/>
     </w:p>
     <w:p>
       <w:pPr>
@@ -24478,11 +24508,11 @@
       <w:pPr>
         <w:pStyle w:val="Heading2"/>
       </w:pPr>
-      <w:bookmarkStart w:id="186" w:name="X6395ae818d0dfbb7174116218f2aaa5d8b10ec4"/>
+      <w:bookmarkStart w:id="187" w:name="X6395ae818d0dfbb7174116218f2aaa5d8b10ec4"/>
       <w:r>
         <w:t xml:space="preserve">Fixed Fixture and Declared Shapes</w:t>
       </w:r>
-      <w:bookmarkEnd w:id="186"/>
+      <w:bookmarkEnd w:id="187"/>
     </w:p>
     <w:p>
       <w:pPr>
@@ -25201,11 +25231,11 @@
       <w:pPr>
         <w:pStyle w:val="Heading2"/>
       </w:pPr>
-      <w:bookmarkStart w:id="187" w:name="chapter-11-two-heads-distinct-rows"/>
+      <w:bookmarkStart w:id="188" w:name="chapter-11-two-heads-distinct-rows"/>
       <w:r>
         <w:t xml:space="preserve">Two Heads, Distinct Rows</w:t>
       </w:r>
-      <w:bookmarkEnd w:id="187"/>
+      <w:bookmarkEnd w:id="188"/>
     </w:p>
     <w:p>
       <w:pPr>
@@ -25367,11 +25397,11 @@
       <w:pPr>
         <w:pStyle w:val="Heading2"/>
       </w:pPr>
-      <w:bookmarkStart w:id="188" w:name="X250a9fc3468c306e21d6f770a2729b5c21c33a5"/>
+      <w:bookmarkStart w:id="189" w:name="X250a9fc3468c306e21d6f770a2729b5c21c33a5"/>
       <w:r>
         <w:t xml:space="preserve">Output Projection and First Residual Interface</w:t>
       </w:r>
-      <w:bookmarkEnd w:id="188"/>
+      <w:bookmarkEnd w:id="189"/>
     </w:p>
     <w:p>
       <w:pPr>
@@ -25650,11 +25680,11 @@
       <w:pPr>
         <w:pStyle w:val="Heading2"/>
       </w:pPr>
-      <w:bookmarkStart w:id="189" w:name="X6bee991af437dad8c6807a2c60602cffa48667d"/>
+      <w:bookmarkStart w:id="190" w:name="X6bee991af437dad8c6807a2c60602cffa48667d"/>
       <w:r>
         <w:t xml:space="preserve">Positionwise Feed-Forward and Second Residual Interface</w:t>
       </w:r>
-      <w:bookmarkEnd w:id="189"/>
+      <w:bookmarkEnd w:id="190"/>
     </w:p>
     <w:p>
       <w:pPr>
@@ -26079,7 +26109,7 @@
                     </pic:cNvPicPr>
                   </pic:nvPicPr>
                   <pic:blipFill>
-                    <a:blip r:embed="rId190"/>
+                    <a:blip r:embed="rId191"/>
                     <a:stretch>
                       <a:fillRect/>
                     </a:stretch>
@@ -26129,11 +26159,11 @@
       <w:pPr>
         <w:pStyle w:val="Heading2"/>
       </w:pPr>
-      <w:bookmarkStart w:id="191" w:name="Xcb038a719b7d8fe335d9671e1605bc0745a6c61"/>
+      <w:bookmarkStart w:id="192" w:name="Xcb038a719b7d8fe335d9671e1605bc0745a6c61"/>
       <w:r>
         <w:t xml:space="preserve">Control: Remove Projected Attention</w:t>
       </w:r>
-      <w:bookmarkEnd w:id="191"/>
+      <w:bookmarkEnd w:id="192"/>
     </w:p>
     <w:p>
       <w:pPr>
@@ -26383,11 +26413,11 @@
       <w:pPr>
         <w:pStyle w:val="Heading2"/>
       </w:pPr>
-      <w:bookmarkStart w:id="192" w:name="X97c1393ddf3f8da670f60db09f01b3619b8f082"/>
+      <w:bookmarkStart w:id="193" w:name="X97c1393ddf3f8da670f60db09f01b3619b8f082"/>
       <w:r>
         <w:t xml:space="preserve">Encoder-Block Boundary in This Chapter</w:t>
       </w:r>
-      <w:bookmarkEnd w:id="192"/>
+      <w:bookmarkEnd w:id="193"/>
     </w:p>
     <w:p>
       <w:pPr>
@@ -26417,11 +26447,11 @@
       <w:pPr>
         <w:pStyle w:val="Heading2"/>
       </w:pPr>
-      <w:bookmarkStart w:id="193" w:name="Xde3985f9e508ec6cad5e272729ad7f84c2b9110"/>
+      <w:bookmarkStart w:id="194" w:name="Xde3985f9e508ec6cad5e272729ad7f84c2b9110"/>
       <w:r>
         <w:t xml:space="preserve">What This Chapter Does Not Claim</w:t>
       </w:r>
-      <w:bookmarkEnd w:id="193"/>
+      <w:bookmarkEnd w:id="194"/>
     </w:p>
     <w:p>
       <w:pPr>
@@ -26511,11 +26541,11 @@
       <w:pPr>
         <w:pStyle w:val="Heading2"/>
       </w:pPr>
-      <w:bookmarkStart w:id="194" w:name="X38e9db9ddfa5f346ed5940add97b5768c074929"/>
+      <w:bookmarkStart w:id="195" w:name="X38e9db9ddfa5f346ed5940add97b5768c074929"/>
       <w:r>
         <w:t xml:space="preserve">Historical and Technical Anchors</w:t>
       </w:r>
-      <w:bookmarkEnd w:id="194"/>
+      <w:bookmarkEnd w:id="195"/>
     </w:p>
     <w:p>
       <w:pPr>
@@ -26573,11 +26603,11 @@
       <w:pPr>
         <w:pStyle w:val="Heading2"/>
       </w:pPr>
-      <w:bookmarkStart w:id="195" w:name="X925d9203261d546b8417f0c6f5e768a7e4e5244"/>
+      <w:bookmarkStart w:id="196" w:name="X925d9203261d546b8417f0c6f5e768a7e4e5244"/>
       <w:r>
         <w:t xml:space="preserve">Interface Clarity Before Scale</w:t>
       </w:r>
-      <w:bookmarkEnd w:id="195"/>
+      <w:bookmarkEnd w:id="196"/>
     </w:p>
     <w:p>
       <w:pPr>
@@ -26655,11 +26685,11 @@
       <w:pPr>
         <w:pStyle w:val="Heading2"/>
       </w:pPr>
-      <w:bookmarkStart w:id="196" w:name="chapter-11-what-the-probe-establishes"/>
+      <w:bookmarkStart w:id="197" w:name="chapter-11-what-the-probe-establishes"/>
       <w:r>
         <w:t xml:space="preserve">What the Probe Establishes</w:t>
       </w:r>
-      <w:bookmarkEnd w:id="196"/>
+      <w:bookmarkEnd w:id="197"/>
     </w:p>
     <w:p>
       <w:pPr>
@@ -26765,11 +26795,11 @@
       <w:pPr>
         <w:pStyle w:val="Heading2"/>
       </w:pPr>
-      <w:bookmarkStart w:id="197" w:name="chapter-11-transition-to-chapter-12"/>
+      <w:bookmarkStart w:id="198" w:name="chapter-11-transition-to-chapter-12"/>
       <w:r>
         <w:t xml:space="preserve">Transition to Chapter 12</w:t>
       </w:r>
-      <w:bookmarkEnd w:id="197"/>
+      <w:bookmarkEnd w:id="198"/>
     </w:p>
     <w:p>
       <w:pPr>
@@ -26783,11 +26813,11 @@
       <w:pPr>
         <w:pStyle w:val="Heading2"/>
       </w:pPr>
-      <w:bookmarkStart w:id="198" w:name="chapter-11-sources-and-evidence"/>
+      <w:bookmarkStart w:id="199" w:name="chapter-11-sources-and-evidence"/>
       <w:r>
         <w:t xml:space="preserve">Sources and Evidence</w:t>
       </w:r>
-      <w:bookmarkEnd w:id="198"/>
+      <w:bookmarkEnd w:id="199"/>
     </w:p>
     <w:p>
       <w:pPr>
@@ -26799,7 +26829,7 @@
       <w:r>
         <w:t xml:space="preserve"> </w:t>
       </w:r>
-      <w:hyperlink r:id="rId199">
+      <w:hyperlink r:id="rId200">
         <w:r>
           <w:rPr>
             <w:rStyle w:val="Hyperlink"/>
@@ -26813,7 +26843,7 @@
       <w:r>
         <w:t xml:space="preserve"> </w:t>
       </w:r>
-      <w:hyperlink r:id="rId200">
+      <w:hyperlink r:id="rId201">
         <w:r>
           <w:rPr>
             <w:rStyle w:val="Hyperlink"/>
@@ -26827,7 +26857,7 @@
       <w:r>
         <w:t xml:space="preserve"> </w:t>
       </w:r>
-      <w:hyperlink r:id="rId201">
+      <w:hyperlink r:id="rId202">
         <w:r>
           <w:rPr>
             <w:rStyle w:val="Hyperlink"/>
@@ -26841,7 +26871,7 @@
       <w:r>
         <w:t xml:space="preserve"> </w:t>
       </w:r>
-      <w:hyperlink r:id="rId202">
+      <w:hyperlink r:id="rId203">
         <w:r>
           <w:rPr>
             <w:rStyle w:val="Hyperlink"/>
@@ -26857,11 +26887,11 @@
       <w:pPr>
         <w:pStyle w:val="Heading1"/>
       </w:pPr>
-      <w:bookmarkStart w:id="203" w:name="chapter-12"/>
+      <w:bookmarkStart w:id="204" w:name="chapter-12"/>
       <w:r>
         <w:t xml:space="preserve">Chapter 12 — From Paper to Tool</w:t>
       </w:r>
-      <w:bookmarkEnd w:id="203"/>
+      <w:bookmarkEnd w:id="204"/>
     </w:p>
     <w:p>
       <w:pPr>
@@ -26891,11 +26921,11 @@
       <w:pPr>
         <w:pStyle w:val="Heading2"/>
       </w:pPr>
-      <w:bookmarkStart w:id="204" w:name="Xb6fa295e6e972b46a299fa42fd7ad81d948832b"/>
+      <w:bookmarkStart w:id="205" w:name="Xb6fa295e6e972b46a299fa42fd7ad81d948832b"/>
       <w:r>
         <w:t xml:space="preserve">The Architecture Is an Implementation Target</w:t>
       </w:r>
-      <w:bookmarkEnd w:id="204"/>
+      <w:bookmarkEnd w:id="205"/>
     </w:p>
     <w:p>
       <w:pPr>
@@ -27075,11 +27105,11 @@
       <w:pPr>
         <w:pStyle w:val="Heading2"/>
       </w:pPr>
-      <w:bookmarkStart w:id="205" w:name="X7852f0fcb70c7b45dc8274075c6d923218acb5d"/>
+      <w:bookmarkStart w:id="206" w:name="X7852f0fcb70c7b45dc8274075c6d923218acb5d"/>
       <w:r>
         <w:t xml:space="preserve">A Framework Supplies Operations, Not This Model</w:t>
       </w:r>
-      <w:bookmarkEnd w:id="205"/>
+      <w:bookmarkEnd w:id="206"/>
     </w:p>
     <w:p>
       <w:pPr>
@@ -27160,11 +27190,11 @@
       <w:pPr>
         <w:pStyle w:val="Heading2"/>
       </w:pPr>
-      <w:bookmarkStart w:id="206" w:name="X241e83cee811deb5f6331e6837a96f0f6f5a3e1"/>
+      <w:bookmarkStart w:id="207" w:name="X241e83cee811deb5f6331e6837a96f0f6f5a3e1"/>
       <w:r>
         <w:t xml:space="preserve">A Package Binds Metadata to Parameters</w:t>
       </w:r>
-      <w:bookmarkEnd w:id="206"/>
+      <w:bookmarkEnd w:id="207"/>
     </w:p>
     <w:p>
       <w:pPr>
@@ -27236,11 +27266,11 @@
       <w:pPr>
         <w:pStyle w:val="Heading2"/>
       </w:pPr>
-      <w:bookmarkStart w:id="207" w:name="chapter-12-parsing-is-not-validation"/>
+      <w:bookmarkStart w:id="208" w:name="chapter-12-parsing-is-not-validation"/>
       <w:r>
         <w:t xml:space="preserve">Parsing Is Not Validation</w:t>
       </w:r>
-      <w:bookmarkEnd w:id="207"/>
+      <w:bookmarkEnd w:id="208"/>
     </w:p>
     <w:p>
       <w:pPr>
@@ -27374,11 +27404,11 @@
       <w:pPr>
         <w:pStyle w:val="Heading2"/>
       </w:pPr>
-      <w:bookmarkStart w:id="208" w:name="X8a7e68bbb7b7e5afbac982ec71af91cd731699c"/>
+      <w:bookmarkStart w:id="209" w:name="X8a7e68bbb7b7e5afbac982ec71af91cd731699c"/>
       <w:r>
         <w:t xml:space="preserve">Runtime Selection Is a Separate Contract</w:t>
       </w:r>
-      <w:bookmarkEnd w:id="208"/>
+      <w:bookmarkEnd w:id="209"/>
     </w:p>
     <w:p>
       <w:pPr>
@@ -27451,7 +27481,7 @@
                     </pic:cNvPicPr>
                   </pic:nvPicPr>
                   <pic:blipFill>
-                    <a:blip r:embed="rId209"/>
+                    <a:blip r:embed="rId210"/>
                     <a:stretch>
                       <a:fillRect/>
                     </a:stretch>
@@ -27501,11 +27531,11 @@
       <w:pPr>
         <w:pStyle w:val="Heading2"/>
       </w:pPr>
-      <w:bookmarkStart w:id="210" w:name="X7d712b0783ee9e4e1f7afa998f66a39af0d9c2c"/>
+      <w:bookmarkStart w:id="211" w:name="X7d712b0783ee9e4e1f7afa998f66a39af0d9c2c"/>
       <w:r>
         <w:t xml:space="preserve">The Callable Boundary Translates Requests</w:t>
       </w:r>
-      <w:bookmarkEnd w:id="210"/>
+      <w:bookmarkEnd w:id="211"/>
     </w:p>
     <w:p>
       <w:pPr>
@@ -27790,11 +27820,11 @@
       <w:pPr>
         <w:pStyle w:val="Heading2"/>
       </w:pPr>
-      <w:bookmarkStart w:id="211" w:name="chapter-12-reload-must-preserve-behavior"/>
+      <w:bookmarkStart w:id="212" w:name="chapter-12-reload-must-preserve-behavior"/>
       <w:r>
         <w:t xml:space="preserve">Reload Must Preserve Behavior</w:t>
       </w:r>
-      <w:bookmarkEnd w:id="211"/>
+      <w:bookmarkEnd w:id="212"/>
     </w:p>
     <w:p>
       <w:pPr>
@@ -27824,11 +27854,11 @@
       <w:pPr>
         <w:pStyle w:val="Heading2"/>
       </w:pPr>
-      <w:bookmarkStart w:id="212" w:name="X053187ac9b2fe7b940acb3e87fc234e96cf009c"/>
+      <w:bookmarkStart w:id="213" w:name="X053187ac9b2fe7b940acb3e87fc234e96cf009c"/>
       <w:r>
         <w:t xml:space="preserve">Corrupt One Contract, Stop Early</w:t>
       </w:r>
-      <w:bookmarkEnd w:id="212"/>
+      <w:bookmarkEnd w:id="213"/>
     </w:p>
     <w:p>
       <w:pPr>
@@ -27880,11 +27910,11 @@
       <w:pPr>
         <w:pStyle w:val="Heading2"/>
       </w:pPr>
-      <w:bookmarkStart w:id="213" w:name="chapter-12-what-became-callable"/>
+      <w:bookmarkStart w:id="214" w:name="chapter-12-what-became-callable"/>
       <w:r>
         <w:t xml:space="preserve">What Became Callable</w:t>
       </w:r>
-      <w:bookmarkEnd w:id="213"/>
+      <w:bookmarkEnd w:id="214"/>
     </w:p>
     <w:p>
       <w:pPr>
@@ -28007,11 +28037,11 @@
       <w:pPr>
         <w:pStyle w:val="Heading2"/>
       </w:pPr>
-      <w:bookmarkStart w:id="214" w:name="chapter-12-the-boundary-of-the-tool"/>
+      <w:bookmarkStart w:id="215" w:name="chapter-12-the-boundary-of-the-tool"/>
       <w:r>
         <w:t xml:space="preserve">The Boundary of the Tool</w:t>
       </w:r>
-      <w:bookmarkEnd w:id="214"/>
+      <w:bookmarkEnd w:id="215"/>
     </w:p>
     <w:p>
       <w:pPr>
@@ -28041,11 +28071,11 @@
       <w:pPr>
         <w:pStyle w:val="Heading2"/>
       </w:pPr>
-      <w:bookmarkStart w:id="215" w:name="chapter-12-sources-and-evidence"/>
+      <w:bookmarkStart w:id="216" w:name="chapter-12-sources-and-evidence"/>
       <w:r>
         <w:t xml:space="preserve">Sources and Evidence</w:t>
       </w:r>
-      <w:bookmarkEnd w:id="215"/>
+      <w:bookmarkEnd w:id="216"/>
     </w:p>
     <w:p>
       <w:pPr>
@@ -28057,7 +28087,7 @@
       <w:r>
         <w:t xml:space="preserve"> </w:t>
       </w:r>
-      <w:hyperlink r:id="rId216">
+      <w:hyperlink r:id="rId217">
         <w:r>
           <w:rPr>
             <w:rStyle w:val="Hyperlink"/>
@@ -28071,7 +28101,7 @@
       <w:r>
         <w:t xml:space="preserve"> </w:t>
       </w:r>
-      <w:hyperlink r:id="rId217">
+      <w:hyperlink r:id="rId218">
         <w:r>
           <w:rPr>
             <w:rStyle w:val="Hyperlink"/>
@@ -28085,7 +28115,7 @@
       <w:r>
         <w:t xml:space="preserve"> </w:t>
       </w:r>
-      <w:hyperlink r:id="rId218">
+      <w:hyperlink r:id="rId219">
         <w:r>
           <w:rPr>
             <w:rStyle w:val="Hyperlink"/>
@@ -28099,7 +28129,7 @@
       <w:r>
         <w:t xml:space="preserve"> </w:t>
       </w:r>
-      <w:hyperlink r:id="rId219">
+      <w:hyperlink r:id="rId220">
         <w:r>
           <w:rPr>
             <w:rStyle w:val="Hyperlink"/>
@@ -28115,11 +28145,11 @@
       <w:pPr>
         <w:pStyle w:val="Heading1"/>
       </w:pPr>
-      <w:bookmarkStart w:id="220" w:name="chapter-13"/>
+      <w:bookmarkStart w:id="221" w:name="chapter-13"/>
       <w:r>
         <w:t xml:space="preserve">Chapter 13 — Where the Journeys Meet</w:t>
       </w:r>
-      <w:bookmarkEnd w:id="220"/>
+      <w:bookmarkEnd w:id="221"/>
     </w:p>
     <w:p>
       <w:pPr>
@@ -28161,11 +28191,11 @@
       <w:pPr>
         <w:pStyle w:val="Heading2"/>
       </w:pPr>
-      <w:bookmarkStart w:id="221" w:name="chapter-13-convergence-begins-with-edges"/>
+      <w:bookmarkStart w:id="222" w:name="chapter-13-convergence-begins-with-edges"/>
       <w:r>
         <w:t xml:space="preserve">Convergence Begins with Edges</w:t>
       </w:r>
-      <w:bookmarkEnd w:id="221"/>
+      <w:bookmarkEnd w:id="222"/>
     </w:p>
     <w:p>
       <w:pPr>
@@ -28290,11 +28320,11 @@
       <w:pPr>
         <w:pStyle w:val="Heading2"/>
       </w:pPr>
-      <w:bookmarkStart w:id="222" w:name="chapter-13-what-ai-exports"/>
+      <w:bookmarkStart w:id="223" w:name="chapter-13-what-ai-exports"/>
       <w:r>
         <w:t xml:space="preserve">What AI Exports</w:t>
       </w:r>
-      <w:bookmarkEnd w:id="222"/>
+      <w:bookmarkEnd w:id="223"/>
     </w:p>
     <w:p>
       <w:pPr>
@@ -28351,11 +28381,11 @@
       <w:pPr>
         <w:pStyle w:val="Heading2"/>
       </w:pPr>
-      <w:bookmarkStart w:id="223" w:name="chapter-13-what-mathematics-exports"/>
+      <w:bookmarkStart w:id="224" w:name="chapter-13-what-mathematics-exports"/>
       <w:r>
         <w:t xml:space="preserve">What Mathematics Exports</w:t>
       </w:r>
-      <w:bookmarkEnd w:id="223"/>
+      <w:bookmarkEnd w:id="224"/>
     </w:p>
     <w:p>
       <w:pPr>
@@ -28412,11 +28442,11 @@
       <w:pPr>
         <w:pStyle w:val="Heading2"/>
       </w:pPr>
-      <w:bookmarkStart w:id="224" w:name="chapter-13-what-programming-exports"/>
+      <w:bookmarkStart w:id="225" w:name="chapter-13-what-programming-exports"/>
       <w:r>
         <w:t xml:space="preserve">What Programming Exports</w:t>
       </w:r>
-      <w:bookmarkEnd w:id="224"/>
+      <w:bookmarkEnd w:id="225"/>
     </w:p>
     <w:p>
       <w:pPr>
@@ -28473,11 +28503,11 @@
       <w:pPr>
         <w:pStyle w:val="Heading2"/>
       </w:pPr>
-      <w:bookmarkStart w:id="225" w:name="X17ed994d1f67a43d6602beea95a4e967c393a4d"/>
+      <w:bookmarkStart w:id="226" w:name="X17ed994d1f67a43d6602beea95a4e967c393a4d"/>
       <w:r>
         <w:t xml:space="preserve">Exact Matching Preserves Identity</w:t>
       </w:r>
-      <w:bookmarkEnd w:id="225"/>
+      <w:bookmarkEnd w:id="226"/>
     </w:p>
     <w:p>
       <w:pPr>
@@ -28639,7 +28669,7 @@
                     </pic:cNvPicPr>
                   </pic:nvPicPr>
                   <pic:blipFill>
-                    <a:blip r:embed="rId226"/>
+                    <a:blip r:embed="rId227"/>
                     <a:stretch>
                       <a:fillRect/>
                     </a:stretch>
@@ -28689,11 +28719,11 @@
       <w:pPr>
         <w:pStyle w:val="Heading2"/>
       </w:pPr>
-      <w:bookmarkStart w:id="227" w:name="chapter-13-control-one-remove-an-edge"/>
+      <w:bookmarkStart w:id="228" w:name="chapter-13-control-one-remove-an-edge"/>
       <w:r>
         <w:t xml:space="preserve">Control One: Remove an Edge</w:t>
       </w:r>
-      <w:bookmarkEnd w:id="227"/>
+      <w:bookmarkEnd w:id="228"/>
     </w:p>
     <w:p>
       <w:pPr>
@@ -28799,11 +28829,11 @@
       <w:pPr>
         <w:pStyle w:val="Heading2"/>
       </w:pPr>
-      <w:bookmarkStart w:id="228" w:name="Xbdbacacd6710ff2cb31d7f0311923e3ffc7b809"/>
+      <w:bookmarkStart w:id="229" w:name="Xbdbacacd6710ff2cb31d7f0311923e3ffc7b809"/>
       <w:r>
         <w:t xml:space="preserve">Control Two: Reject a Familiar Word</w:t>
       </w:r>
-      <w:bookmarkEnd w:id="228"/>
+      <w:bookmarkEnd w:id="229"/>
     </w:p>
     <w:p>
       <w:pPr>
@@ -28896,11 +28926,11 @@
       <w:pPr>
         <w:pStyle w:val="Heading2"/>
       </w:pPr>
-      <w:bookmarkStart w:id="229" w:name="chapter-13-one-aligned-technical-handoff"/>
+      <w:bookmarkStart w:id="230" w:name="chapter-13-one-aligned-technical-handoff"/>
       <w:r>
         <w:t xml:space="preserve">One Aligned Technical Handoff</w:t>
       </w:r>
-      <w:bookmarkEnd w:id="229"/>
+      <w:bookmarkEnd w:id="230"/>
     </w:p>
     <w:p>
       <w:pPr>
@@ -28956,11 +28986,11 @@
       <w:pPr>
         <w:pStyle w:val="Heading2"/>
       </w:pPr>
-      <w:bookmarkStart w:id="230" w:name="chapter-13-what-the-probe-establishes"/>
+      <w:bookmarkStart w:id="231" w:name="chapter-13-what-the-probe-establishes"/>
       <w:r>
         <w:t xml:space="preserve">What the Probe Establishes</w:t>
       </w:r>
-      <w:bookmarkEnd w:id="230"/>
+      <w:bookmarkEnd w:id="231"/>
     </w:p>
     <w:p>
       <w:pPr>
@@ -28990,11 +29020,11 @@
       <w:pPr>
         <w:pStyle w:val="Heading2"/>
       </w:pPr>
-      <w:bookmarkStart w:id="231" w:name="chapter-13-sources-and-evidence"/>
+      <w:bookmarkStart w:id="232" w:name="chapter-13-sources-and-evidence"/>
       <w:r>
         <w:t xml:space="preserve">Sources and Evidence</w:t>
       </w:r>
-      <w:bookmarkEnd w:id="231"/>
+      <w:bookmarkEnd w:id="232"/>
     </w:p>
     <w:p>
       <w:pPr>
@@ -29006,7 +29036,7 @@
       <w:r>
         <w:t xml:space="preserve"> </w:t>
       </w:r>
-      <w:hyperlink r:id="rId232">
+      <w:hyperlink r:id="rId233">
         <w:r>
           <w:rPr>
             <w:rStyle w:val="Hyperlink"/>
@@ -29020,7 +29050,7 @@
       <w:r>
         <w:t xml:space="preserve"> </w:t>
       </w:r>
-      <w:hyperlink r:id="rId233">
+      <w:hyperlink r:id="rId234">
         <w:r>
           <w:rPr>
             <w:rStyle w:val="Hyperlink"/>
@@ -29034,7 +29064,7 @@
       <w:r>
         <w:t xml:space="preserve"> </w:t>
       </w:r>
-      <w:hyperlink r:id="rId234">
+      <w:hyperlink r:id="rId235">
         <w:r>
           <w:rPr>
             <w:rStyle w:val="Hyperlink"/>
@@ -29048,7 +29078,7 @@
       <w:r>
         <w:t xml:space="preserve"> </w:t>
       </w:r>
-      <w:hyperlink r:id="rId235">
+      <w:hyperlink r:id="rId236">
         <w:r>
           <w:rPr>
             <w:rStyle w:val="Hyperlink"/>
@@ -29064,11 +29094,11 @@
       <w:pPr>
         <w:pStyle w:val="Heading1"/>
       </w:pPr>
-      <w:bookmarkStart w:id="236" w:name="chapter-14"/>
+      <w:bookmarkStart w:id="237" w:name="chapter-14"/>
       <w:r>
         <w:t xml:space="preserve">Chapter 14 — Architecture in Full</w:t>
       </w:r>
-      <w:bookmarkEnd w:id="236"/>
+      <w:bookmarkEnd w:id="237"/>
     </w:p>
     <w:p>
       <w:pPr>
@@ -29113,11 +29143,11 @@
       <w:pPr>
         <w:pStyle w:val="Heading2"/>
       </w:pPr>
-      <w:bookmarkStart w:id="237" w:name="chapter-14-one-identity-four-selections"/>
+      <w:bookmarkStart w:id="238" w:name="chapter-14-one-identity-four-selections"/>
       <w:r>
         <w:t xml:space="preserve">One Identity, Four Selections</w:t>
       </w:r>
-      <w:bookmarkEnd w:id="237"/>
+      <w:bookmarkEnd w:id="238"/>
     </w:p>
     <w:p>
       <w:pPr>
@@ -29202,11 +29232,11 @@
       <w:pPr>
         <w:pStyle w:val="Heading2"/>
       </w:pPr>
-      <w:bookmarkStart w:id="238" w:name="X4906e011486c00f686663ef9a4bcaa98825794b"/>
+      <w:bookmarkStart w:id="239" w:name="X4906e011486c00f686663ef9a4bcaa98825794b"/>
       <w:r>
         <w:t xml:space="preserve">System Scale: The External Boundary</w:t>
       </w:r>
-      <w:bookmarkEnd w:id="238"/>
+      <w:bookmarkEnd w:id="239"/>
     </w:p>
     <w:p>
       <w:pPr>
@@ -29263,11 +29293,11 @@
       <w:pPr>
         <w:pStyle w:val="Heading2"/>
       </w:pPr>
-      <w:bookmarkStart w:id="239" w:name="X77ccdcb91722f48f305a5d6ad97c46b82a16a72"/>
+      <w:bookmarkStart w:id="240" w:name="X77ccdcb91722f48f305a5d6ad97c46b82a16a72"/>
       <w:r>
         <w:t xml:space="preserve">Stack Scale: Repetition Without Collapse</w:t>
       </w:r>
-      <w:bookmarkEnd w:id="239"/>
+      <w:bookmarkEnd w:id="240"/>
     </w:p>
     <w:p>
       <w:pPr>
@@ -29346,11 +29376,11 @@
       <w:pPr>
         <w:pStyle w:val="Heading2"/>
       </w:pPr>
-      <w:bookmarkStart w:id="240" w:name="Xfe51faa73ce28c9e12205deeab2aefcbf0220f3"/>
+      <w:bookmarkStart w:id="241" w:name="Xfe51faa73ce28c9e12205deeab2aefcbf0220f3"/>
       <w:r>
         <w:t xml:space="preserve">Block Scale: The Local Assembly</w:t>
       </w:r>
-      <w:bookmarkEnd w:id="240"/>
+      <w:bookmarkEnd w:id="241"/>
     </w:p>
     <w:p>
       <w:pPr>
@@ -29380,11 +29410,11 @@
       <w:pPr>
         <w:pStyle w:val="Heading2"/>
       </w:pPr>
-      <w:bookmarkStart w:id="241" w:name="Xe849076e9ee518dbb6dc3e178e864f371507bb0"/>
+      <w:bookmarkStart w:id="242" w:name="Xe849076e9ee518dbb6dc3e178e864f371507bb0"/>
       <w:r>
         <w:t xml:space="preserve">Operation Scale: Attention as Selected Detail</w:t>
       </w:r>
-      <w:bookmarkEnd w:id="241"/>
+      <w:bookmarkEnd w:id="242"/>
     </w:p>
     <w:p>
       <w:pPr>
@@ -29430,7 +29460,7 @@
                     </pic:cNvPicPr>
                   </pic:nvPicPr>
                   <pic:blipFill>
-                    <a:blip r:embed="rId242"/>
+                    <a:blip r:embed="rId243"/>
                     <a:stretch>
                       <a:fillRect/>
                     </a:stretch>
@@ -29480,11 +29510,11 @@
       <w:pPr>
         <w:pStyle w:val="Heading2"/>
       </w:pPr>
-      <w:bookmarkStart w:id="243" w:name="Xe265c6d53c183ca3b3e43a1fd484a2609bfb108"/>
+      <w:bookmarkStart w:id="244" w:name="Xe265c6d53c183ca3b3e43a1fd484a2609bfb108"/>
       <w:r>
         <w:t xml:space="preserve">Exact Containment, Not a Suggestive Nesting</w:t>
       </w:r>
-      <w:bookmarkEnd w:id="243"/>
+      <w:bookmarkEnd w:id="244"/>
     </w:p>
     <w:p>
       <w:pPr>
@@ -29551,11 +29581,11 @@
       <w:pPr>
         <w:pStyle w:val="Heading2"/>
       </w:pPr>
-      <w:bookmarkStart w:id="244" w:name="X1d6062dbc575e167cb43f5cd11c6bc7f4a72d4b"/>
+      <w:bookmarkStart w:id="245" w:name="X1d6062dbc575e167cb43f5cd11c6bc7f4a72d4b"/>
       <w:r>
         <w:t xml:space="preserve">Containment Is Not Execution Order</w:t>
       </w:r>
-      <w:bookmarkEnd w:id="244"/>
+      <w:bookmarkEnd w:id="245"/>
     </w:p>
     <w:p>
       <w:pPr>
@@ -29621,11 +29651,11 @@
       <w:pPr>
         <w:pStyle w:val="Heading2"/>
       </w:pPr>
-      <w:bookmarkStart w:id="245" w:name="X08f262fd7d53fc2ec9f10621526b1e5189bcc9c"/>
+      <w:bookmarkStart w:id="246" w:name="X08f262fd7d53fc2ec9f10621526b1e5189bcc9c"/>
       <w:r>
         <w:t xml:space="preserve">Control: One Attention Row Claims the System</w:t>
       </w:r>
-      <w:bookmarkEnd w:id="245"/>
+      <w:bookmarkEnd w:id="246"/>
     </w:p>
     <w:p>
       <w:pPr>
@@ -29754,11 +29784,11 @@
       <w:pPr>
         <w:pStyle w:val="Heading2"/>
       </w:pPr>
-      <w:bookmarkStart w:id="246" w:name="chapter-14-what-the-four-views-establish"/>
+      <w:bookmarkStart w:id="247" w:name="chapter-14-what-the-four-views-establish"/>
       <w:r>
         <w:t xml:space="preserve">What the Four Views Establish</w:t>
       </w:r>
-      <w:bookmarkEnd w:id="246"/>
+      <w:bookmarkEnd w:id="247"/>
     </w:p>
     <w:p>
       <w:pPr>
@@ -29780,11 +29810,11 @@
       <w:pPr>
         <w:pStyle w:val="Heading2"/>
       </w:pPr>
-      <w:bookmarkStart w:id="247" w:name="chapter-14-two-exact-handoffs"/>
+      <w:bookmarkStart w:id="248" w:name="chapter-14-two-exact-handoffs"/>
       <w:r>
         <w:t xml:space="preserve">Two Exact Handoffs</w:t>
       </w:r>
-      <w:bookmarkEnd w:id="247"/>
+      <w:bookmarkEnd w:id="248"/>
     </w:p>
     <w:p>
       <w:pPr>
@@ -29834,11 +29864,11 @@
       <w:pPr>
         <w:pStyle w:val="Heading2"/>
       </w:pPr>
-      <w:bookmarkStart w:id="248" w:name="chapter-14-sources-and-evidence"/>
+      <w:bookmarkStart w:id="249" w:name="chapter-14-sources-and-evidence"/>
       <w:r>
         <w:t xml:space="preserve">Sources and Evidence</w:t>
       </w:r>
-      <w:bookmarkEnd w:id="248"/>
+      <w:bookmarkEnd w:id="249"/>
     </w:p>
     <w:p>
       <w:pPr>
@@ -29850,7 +29880,7 @@
       <w:r>
         <w:t xml:space="preserve"> </w:t>
       </w:r>
-      <w:hyperlink r:id="rId249">
+      <w:hyperlink r:id="rId250">
         <w:r>
           <w:rPr>
             <w:rStyle w:val="Hyperlink"/>
@@ -29864,7 +29894,7 @@
       <w:r>
         <w:t xml:space="preserve"> </w:t>
       </w:r>
-      <w:hyperlink r:id="rId250">
+      <w:hyperlink r:id="rId251">
         <w:r>
           <w:rPr>
             <w:rStyle w:val="Hyperlink"/>
@@ -29878,7 +29908,7 @@
       <w:r>
         <w:t xml:space="preserve"> </w:t>
       </w:r>
-      <w:hyperlink r:id="rId251">
+      <w:hyperlink r:id="rId252">
         <w:r>
           <w:rPr>
             <w:rStyle w:val="Hyperlink"/>
@@ -29892,7 +29922,7 @@
       <w:r>
         <w:t xml:space="preserve"> </w:t>
       </w:r>
-      <w:hyperlink r:id="rId252">
+      <w:hyperlink r:id="rId253">
         <w:r>
           <w:rPr>
             <w:rStyle w:val="Hyperlink"/>
@@ -29908,11 +29938,11 @@
       <w:pPr>
         <w:pStyle w:val="Heading1"/>
       </w:pPr>
-      <w:bookmarkStart w:id="253" w:name="chapter-15"/>
+      <w:bookmarkStart w:id="254" w:name="chapter-15"/>
       <w:r>
         <w:t xml:space="preserve">Chapter 15 — A Token Through the Machine</w:t>
       </w:r>
-      <w:bookmarkEnd w:id="253"/>
+      <w:bookmarkEnd w:id="254"/>
     </w:p>
     <w:p>
       <w:pPr>
@@ -29934,11 +29964,11 @@
       <w:pPr>
         <w:pStyle w:val="Heading2"/>
       </w:pPr>
-      <w:bookmarkStart w:id="254" w:name="chapter-15-a-fixture-small-enough-to-see"/>
+      <w:bookmarkStart w:id="255" w:name="chapter-15-a-fixture-small-enough-to-see"/>
       <w:r>
         <w:t xml:space="preserve">A Fixture Small Enough to See</w:t>
       </w:r>
-      <w:bookmarkEnd w:id="254"/>
+      <w:bookmarkEnd w:id="255"/>
     </w:p>
     <w:p>
       <w:pPr>
@@ -30142,11 +30172,11 @@
       <w:pPr>
         <w:pStyle w:val="Heading2"/>
       </w:pPr>
-      <w:bookmarkStart w:id="255" w:name="chapter-15-the-gate-before-the-block"/>
+      <w:bookmarkStart w:id="256" w:name="chapter-15-the-gate-before-the-block"/>
       <w:r>
         <w:t xml:space="preserve">The Gate Before the Block</w:t>
       </w:r>
-      <w:bookmarkEnd w:id="255"/>
+      <w:bookmarkEnd w:id="256"/>
     </w:p>
     <w:p>
       <w:pPr>
@@ -30203,11 +30233,11 @@
       <w:pPr>
         <w:pStyle w:val="Heading2"/>
       </w:pPr>
-      <w:bookmarkStart w:id="256" w:name="chapter-15-one-block-in-runtime-order"/>
+      <w:bookmarkStart w:id="257" w:name="chapter-15-one-block-in-runtime-order"/>
       <w:r>
         <w:t xml:space="preserve">One Block in Runtime Order</w:t>
       </w:r>
-      <w:bookmarkEnd w:id="256"/>
+      <w:bookmarkEnd w:id="257"/>
     </w:p>
     <w:p>
       <w:pPr>
@@ -30402,7 +30432,7 @@
                     </pic:cNvPicPr>
                   </pic:nvPicPr>
                   <pic:blipFill>
-                    <a:blip r:embed="rId257"/>
+                    <a:blip r:embed="rId258"/>
                     <a:stretch>
                       <a:fillRect/>
                     </a:stretch>
@@ -30452,11 +30482,11 @@
       <w:pPr>
         <w:pStyle w:val="Heading2"/>
       </w:pPr>
-      <w:bookmarkStart w:id="258" w:name="chapter-15-from-hidden-row-to-token"/>
+      <w:bookmarkStart w:id="259" w:name="chapter-15-from-hidden-row-to-token"/>
       <w:r>
         <w:t xml:space="preserve">From Hidden Row to Token</w:t>
       </w:r>
-      <w:bookmarkEnd w:id="258"/>
+      <w:bookmarkEnd w:id="259"/>
     </w:p>
     <w:p>
       <w:pPr>
@@ -30650,11 +30680,11 @@
       <w:pPr>
         <w:pStyle w:val="Heading2"/>
       </w:pPr>
-      <w:bookmarkStart w:id="259" w:name="chapter-15-records-are-not-timings"/>
+      <w:bookmarkStart w:id="260" w:name="chapter-15-records-are-not-timings"/>
       <w:r>
         <w:t xml:space="preserve">Records Are Not Timings</w:t>
       </w:r>
-      <w:bookmarkEnd w:id="259"/>
+      <w:bookmarkEnd w:id="260"/>
     </w:p>
     <w:p>
       <w:pPr>
@@ -30684,11 +30714,11 @@
       <w:pPr>
         <w:pStyle w:val="Heading2"/>
       </w:pPr>
-      <w:bookmarkStart w:id="260" w:name="chapter-15-the-first-failure-control"/>
+      <w:bookmarkStart w:id="261" w:name="chapter-15-the-first-failure-control"/>
       <w:r>
         <w:t xml:space="preserve">The First-Failure Control</w:t>
       </w:r>
-      <w:bookmarkEnd w:id="260"/>
+      <w:bookmarkEnd w:id="261"/>
     </w:p>
     <w:p>
       <w:pPr>
@@ -30808,11 +30838,11 @@
       <w:pPr>
         <w:pStyle w:val="Heading2"/>
       </w:pPr>
-      <w:bookmarkStart w:id="261" w:name="chapter-15-what-the-trace-establishes"/>
+      <w:bookmarkStart w:id="262" w:name="chapter-15-what-the-trace-establishes"/>
       <w:r>
         <w:t xml:space="preserve">What the Trace Establishes</w:t>
       </w:r>
-      <w:bookmarkEnd w:id="261"/>
+      <w:bookmarkEnd w:id="262"/>
     </w:p>
     <w:p>
       <w:pPr>
@@ -30861,11 +30891,11 @@
       <w:pPr>
         <w:pStyle w:val="Heading2"/>
       </w:pPr>
-      <w:bookmarkStart w:id="262" w:name="chapter-15-exact-handoffs"/>
+      <w:bookmarkStart w:id="263" w:name="chapter-15-exact-handoffs"/>
       <w:r>
         <w:t xml:space="preserve">Exact Handoffs</w:t>
       </w:r>
-      <w:bookmarkEnd w:id="262"/>
+      <w:bookmarkEnd w:id="263"/>
     </w:p>
     <w:p>
       <w:pPr>
@@ -30926,11 +30956,11 @@
       <w:pPr>
         <w:pStyle w:val="Heading2"/>
       </w:pPr>
-      <w:bookmarkStart w:id="263" w:name="chapter-15-sources-and-evidence"/>
+      <w:bookmarkStart w:id="264" w:name="chapter-15-sources-and-evidence"/>
       <w:r>
         <w:t xml:space="preserve">Sources and Evidence</w:t>
       </w:r>
-      <w:bookmarkEnd w:id="263"/>
+      <w:bookmarkEnd w:id="264"/>
     </w:p>
     <w:p>
       <w:pPr>
@@ -30942,7 +30972,7 @@
       <w:r>
         <w:t xml:space="preserve"> </w:t>
       </w:r>
-      <w:hyperlink r:id="rId264">
+      <w:hyperlink r:id="rId265">
         <w:r>
           <w:rPr>
             <w:rStyle w:val="Hyperlink"/>
@@ -30956,7 +30986,7 @@
       <w:r>
         <w:t xml:space="preserve"> </w:t>
       </w:r>
-      <w:hyperlink r:id="rId265">
+      <w:hyperlink r:id="rId266">
         <w:r>
           <w:rPr>
             <w:rStyle w:val="Hyperlink"/>
@@ -30970,7 +31000,7 @@
       <w:r>
         <w:t xml:space="preserve"> </w:t>
       </w:r>
-      <w:hyperlink r:id="rId266">
+      <w:hyperlink r:id="rId267">
         <w:r>
           <w:rPr>
             <w:rStyle w:val="Hyperlink"/>
@@ -30984,7 +31014,7 @@
       <w:r>
         <w:t xml:space="preserve"> </w:t>
       </w:r>
-      <w:hyperlink r:id="rId267">
+      <w:hyperlink r:id="rId268">
         <w:r>
           <w:rPr>
             <w:rStyle w:val="Hyperlink"/>
@@ -31000,11 +31030,11 @@
       <w:pPr>
         <w:pStyle w:val="Heading1"/>
       </w:pPr>
-      <w:bookmarkStart w:id="268" w:name="chapter-16"/>
+      <w:bookmarkStart w:id="269" w:name="chapter-16"/>
       <w:r>
         <w:t xml:space="preserve">Chapter 16 — Measured Limits</w:t>
       </w:r>
-      <w:bookmarkEnd w:id="268"/>
+      <w:bookmarkEnd w:id="269"/>
     </w:p>
     <w:p>
       <w:pPr>
@@ -31026,11 +31056,11 @@
       <w:pPr>
         <w:pStyle w:val="Heading2"/>
       </w:pPr>
-      <w:bookmarkStart w:id="269" w:name="chapter-16-one-fixture-six-result-types"/>
+      <w:bookmarkStart w:id="270" w:name="chapter-16-one-fixture-six-result-types"/>
       <w:r>
         <w:t xml:space="preserve">One Fixture, Six Result Types</w:t>
       </w:r>
-      <w:bookmarkEnd w:id="269"/>
+      <w:bookmarkEnd w:id="270"/>
     </w:p>
     <w:p>
       <w:pPr>
@@ -31087,11 +31117,11 @@
       <w:pPr>
         <w:pStyle w:val="Heading2"/>
       </w:pPr>
-      <w:bookmarkStart w:id="270" w:name="chapter-16-context-stop-before-embedding"/>
+      <w:bookmarkStart w:id="271" w:name="chapter-16-context-stop-before-embedding"/>
       <w:r>
         <w:t xml:space="preserve">Context: Stop Before Embedding</w:t>
       </w:r>
-      <w:bookmarkEnd w:id="270"/>
+      <w:bookmarkEnd w:id="271"/>
     </w:p>
     <w:p>
       <w:pPr>
@@ -31147,11 +31177,11 @@
       <w:pPr>
         <w:pStyle w:val="Heading2"/>
       </w:pPr>
-      <w:bookmarkStart w:id="271" w:name="X574999ecb3a1a808e13ee8b28d8b2c838ee8979"/>
+      <w:bookmarkStart w:id="272" w:name="X574999ecb3a1a808e13ee8b28d8b2c838ee8979"/>
       <w:r>
         <w:t xml:space="preserve">Representation: Width Is an Interface Contract</w:t>
       </w:r>
-      <w:bookmarkEnd w:id="271"/>
+      <w:bookmarkEnd w:id="272"/>
     </w:p>
     <w:p>
       <w:pPr>
@@ -31251,11 +31281,11 @@
       <w:pPr>
         <w:pStyle w:val="Heading2"/>
       </w:pPr>
-      <w:bookmarkStart w:id="272" w:name="X9309723be42f7983c1de7274f78fe0207b4a848"/>
+      <w:bookmarkStart w:id="273" w:name="X9309723be42f7983c1de7274f78fe0207b4a848"/>
       <w:r>
         <w:t xml:space="preserve">Compute: Exact Counts Are Not Time</w:t>
       </w:r>
-      <w:bookmarkEnd w:id="272"/>
+      <w:bookmarkEnd w:id="273"/>
     </w:p>
     <w:p>
       <w:pPr>
@@ -31762,11 +31792,11 @@
       <w:pPr>
         <w:pStyle w:val="Heading2"/>
       </w:pPr>
-      <w:bookmarkStart w:id="273" w:name="Xa0b5983f549eb5667ac8a89a3d9cbefceaa46c4"/>
+      <w:bookmarkStart w:id="274" w:name="Xa0b5983f549eb5667ac8a89a3d9cbefceaa46c4"/>
       <w:r>
         <w:t xml:space="preserve">Vocabulary: Distinct Strings Can Share One Row</w:t>
       </w:r>
-      <w:bookmarkEnd w:id="273"/>
+      <w:bookmarkEnd w:id="274"/>
     </w:p>
     <w:p>
       <w:pPr>
@@ -31850,11 +31880,11 @@
       <w:pPr>
         <w:pStyle w:val="Heading2"/>
       </w:pPr>
-      <w:bookmarkStart w:id="274" w:name="X5f1a41ebc973a6c8e05774f9329e211950f6c9f"/>
+      <w:bookmarkStart w:id="275" w:name="X5f1a41ebc973a6c8e05774f9329e211950f6c9f"/>
       <w:r>
         <w:t xml:space="preserve">Decoding: Policy Is Part of the Result</w:t>
       </w:r>
-      <w:bookmarkEnd w:id="274"/>
+      <w:bookmarkEnd w:id="275"/>
     </w:p>
     <w:p>
       <w:pPr>
@@ -31915,11 +31945,11 @@
       <w:pPr>
         <w:pStyle w:val="Heading2"/>
       </w:pPr>
-      <w:bookmarkStart w:id="275" w:name="Xf8e2101a1d2cabdd0b6c4a4abc70d34b51b1a72"/>
+      <w:bookmarkStart w:id="276" w:name="Xf8e2101a1d2cabdd0b6c4a4abc70d34b51b1a72"/>
       <w:r>
         <w:t xml:space="preserve">Architecture: A Numerical Contribution Control</w:t>
       </w:r>
-      <w:bookmarkEnd w:id="275"/>
+      <w:bookmarkEnd w:id="276"/>
     </w:p>
     <w:p>
       <w:pPr>
@@ -32059,7 +32089,7 @@
                     </pic:cNvPicPr>
                   </pic:nvPicPr>
                   <pic:blipFill>
-                    <a:blip r:embed="rId276"/>
+                    <a:blip r:embed="rId277"/>
                     <a:stretch>
                       <a:fillRect/>
                     </a:stretch>
@@ -32109,11 +32139,11 @@
       <w:pPr>
         <w:pStyle w:val="Heading2"/>
       </w:pPr>
-      <w:bookmarkStart w:id="277" w:name="X118e6c7b2684b845dada2ed807f9545439d5720"/>
+      <w:bookmarkStart w:id="278" w:name="X118e6c7b2684b845dada2ed807f9545439d5720"/>
       <w:r>
         <w:t xml:space="preserve">The Boundary Around the Envelope</w:t>
       </w:r>
-      <w:bookmarkEnd w:id="277"/>
+      <w:bookmarkEnd w:id="278"/>
     </w:p>
     <w:p>
       <w:pPr>
@@ -32192,11 +32222,11 @@
       <w:pPr>
         <w:pStyle w:val="Heading2"/>
       </w:pPr>
-      <w:bookmarkStart w:id="278" w:name="chapter-16-exact-terminal-handoff"/>
+      <w:bookmarkStart w:id="279" w:name="chapter-16-exact-terminal-handoff"/>
       <w:r>
         <w:t xml:space="preserve">Exact Terminal Handoff</w:t>
       </w:r>
-      <w:bookmarkEnd w:id="278"/>
+      <w:bookmarkEnd w:id="279"/>
     </w:p>
     <w:p>
       <w:pPr>
@@ -32266,11 +32296,11 @@
       <w:pPr>
         <w:pStyle w:val="Heading2"/>
       </w:pPr>
-      <w:bookmarkStart w:id="279" w:name="chapter-16-sources-and-evidence"/>
+      <w:bookmarkStart w:id="280" w:name="chapter-16-sources-and-evidence"/>
       <w:r>
         <w:t xml:space="preserve">Sources and Evidence</w:t>
       </w:r>
-      <w:bookmarkEnd w:id="279"/>
+      <w:bookmarkEnd w:id="280"/>
     </w:p>
     <w:p>
       <w:pPr>
@@ -32282,7 +32312,7 @@
       <w:r>
         <w:t xml:space="preserve"> </w:t>
       </w:r>
-      <w:hyperlink r:id="rId280">
+      <w:hyperlink r:id="rId281">
         <w:r>
           <w:rPr>
             <w:rStyle w:val="Hyperlink"/>
@@ -32296,7 +32326,7 @@
       <w:r>
         <w:t xml:space="preserve"> </w:t>
       </w:r>
-      <w:hyperlink r:id="rId281">
+      <w:hyperlink r:id="rId282">
         <w:r>
           <w:rPr>
             <w:rStyle w:val="Hyperlink"/>
@@ -32310,7 +32340,7 @@
       <w:r>
         <w:t xml:space="preserve"> </w:t>
       </w:r>
-      <w:hyperlink r:id="rId282">
+      <w:hyperlink r:id="rId283">
         <w:r>
           <w:rPr>
             <w:rStyle w:val="Hyperlink"/>
@@ -32324,7 +32354,7 @@
       <w:r>
         <w:t xml:space="preserve"> </w:t>
       </w:r>
-      <w:hyperlink r:id="rId283">
+      <w:hyperlink r:id="rId284">
         <w:r>
           <w:rPr>
             <w:rStyle w:val="Hyperlink"/>
@@ -32340,11 +32370,11 @@
       <w:pPr>
         <w:pStyle w:val="Heading1"/>
       </w:pPr>
-      <w:bookmarkStart w:id="284" w:name="book-two-man-pages"/>
+      <w:bookmarkStart w:id="285" w:name="book-two-man-pages"/>
       <w:r>
         <w:t xml:space="preserve">Book Two — Man Pages</w:t>
       </w:r>
-      <w:bookmarkEnd w:id="284"/>
+      <w:bookmarkEnd w:id="285"/>
     </w:p>
     <w:p>
       <w:pPr>
@@ -32410,11 +32440,11 @@
       <w:pPr>
         <w:pStyle w:val="Heading2"/>
       </w:pPr>
-      <w:bookmarkStart w:id="285" w:name="book-two-man-pages-why-this-exists"/>
+      <w:bookmarkStart w:id="286" w:name="book-two-man-pages-why-this-exists"/>
       <w:r>
         <w:t xml:space="preserve">Why This Exists</w:t>
       </w:r>
-      <w:bookmarkEnd w:id="285"/>
+      <w:bookmarkEnd w:id="286"/>
     </w:p>
     <w:p>
       <w:pPr>
@@ -32466,11 +32496,11 @@
       <w:pPr>
         <w:pStyle w:val="Heading2"/>
       </w:pPr>
-      <w:bookmarkStart w:id="286" w:name="book-two-man-pages-index-apropos"/>
+      <w:bookmarkStart w:id="287" w:name="book-two-man-pages-index-apropos"/>
       <w:r>
         <w:t xml:space="preserve">Index (apropos)</w:t>
       </w:r>
-      <w:bookmarkEnd w:id="286"/>
+      <w:bookmarkEnd w:id="287"/>
     </w:p>
     <w:tbl>
       <w:tblPr>
@@ -33577,11 +33607,11 @@
       <w:pPr>
         <w:pStyle w:val="Heading2"/>
       </w:pPr>
-      <w:bookmarkStart w:id="287" w:name="book-two-man-pages-section-conventions"/>
+      <w:bookmarkStart w:id="288" w:name="book-two-man-pages-section-conventions"/>
       <w:r>
         <w:t xml:space="preserve">Section Conventions</w:t>
       </w:r>
-      <w:bookmarkEnd w:id="287"/>
+      <w:bookmarkEnd w:id="288"/>
     </w:p>
     <w:p>
       <w:pPr>
@@ -33692,11 +33722,11 @@
       <w:pPr>
         <w:pStyle w:val="Heading2"/>
       </w:pPr>
-      <w:bookmarkStart w:id="288" w:name="book-two-man-pages-page-format"/>
+      <w:bookmarkStart w:id="289" w:name="book-two-man-pages-page-format"/>
       <w:r>
         <w:t xml:space="preserve">Page Format</w:t>
       </w:r>
-      <w:bookmarkEnd w:id="288"/>
+      <w:bookmarkEnd w:id="289"/>
     </w:p>
     <w:p>
       <w:pPr>
@@ -33754,7 +33784,7 @@
         <w:t xml:space="preserve">SOURCE       (chapter and probe this page is grounded in)</w:t>
       </w:r>
     </w:p>
-    <w:bookmarkStart w:id="289" w:name="man-man"/>
+    <w:bookmarkStart w:id="290" w:name="man-man"/>
     <w:p>
       <w:pPr>
         <w:pStyle w:val="SourceCode"/>
@@ -34285,8 +34315,8 @@
         <w:t xml:space="preserve">       book2/man/README.md; established August 31, 2026.</w:t>
       </w:r>
     </w:p>
-    <w:bookmarkEnd w:id="289"/>
-    <w:bookmarkStart w:id="290" w:name="man-representation"/>
+    <w:bookmarkEnd w:id="290"/>
+    <w:bookmarkStart w:id="291" w:name="man-representation"/>
     <w:p>
       <w:pPr>
         <w:pStyle w:val="SourceCode"/>
@@ -34574,8 +34604,8 @@
         <w:t xml:space="preserve">       Chapter 2, representation probe.</w:t>
       </w:r>
     </w:p>
-    <w:bookmarkEnd w:id="290"/>
-    <w:bookmarkStart w:id="291" w:name="man-bayesian-update"/>
+    <w:bookmarkEnd w:id="291"/>
+    <w:bookmarkStart w:id="292" w:name="man-bayesian-update"/>
     <w:p>
       <w:pPr>
         <w:pStyle w:val="SourceCode"/>
@@ -34845,8 +34875,8 @@
         <w:t xml:space="preserve">       Chapter 3, Bayesian update probe.</w:t>
       </w:r>
     </w:p>
-    <w:bookmarkEnd w:id="291"/>
-    <w:bookmarkStart w:id="292" w:name="man-jacobian"/>
+    <w:bookmarkEnd w:id="292"/>
+    <w:bookmarkStart w:id="293" w:name="man-jacobian"/>
     <w:p>
       <w:pPr>
         <w:pStyle w:val="SourceCode"/>
@@ -35095,8 +35125,8 @@
         <w:t xml:space="preserve">       Chapter 4, map-and-local-change probe.</w:t>
       </w:r>
     </w:p>
-    <w:bookmarkEnd w:id="292"/>
-    <w:bookmarkStart w:id="293" w:name="man-memory-layout"/>
+    <w:bookmarkEnd w:id="293"/>
+    <w:bookmarkStart w:id="294" w:name="man-memory-layout"/>
     <w:p>
       <w:pPr>
         <w:pStyle w:val="SourceCode"/>
@@ -35336,8 +35366,8 @@
         <w:t xml:space="preserve">       Chapter 5, compiler probe (Rust, repr(C)).</w:t>
       </w:r>
     </w:p>
-    <w:bookmarkEnd w:id="293"/>
-    <w:bookmarkStart w:id="294" w:name="man-gradient-descent"/>
+    <w:bookmarkEnd w:id="294"/>
+    <w:bookmarkStart w:id="295" w:name="man-gradient-descent"/>
     <w:p>
       <w:pPr>
         <w:pStyle w:val="SourceCode"/>
@@ -35604,8 +35634,8 @@
         <w:t xml:space="preserve">       Chapter 6, learning-loop probe.</w:t>
       </w:r>
     </w:p>
-    <w:bookmarkEnd w:id="294"/>
-    <w:bookmarkStart w:id="295" w:name="man-tensor"/>
+    <w:bookmarkEnd w:id="295"/>
+    <w:bookmarkStart w:id="296" w:name="man-tensor"/>
     <w:p>
       <w:pPr>
         <w:pStyle w:val="SourceCode"/>
@@ -35824,8 +35854,8 @@
         <w:t xml:space="preserve">       Chapter 7, tensor-parallel probe.</w:t>
       </w:r>
     </w:p>
-    <w:bookmarkEnd w:id="295"/>
-    <w:bookmarkStart w:id="296" w:name="man-embedding-space"/>
+    <w:bookmarkEnd w:id="296"/>
+    <w:bookmarkStart w:id="297" w:name="man-embedding-space"/>
     <w:p>
       <w:pPr>
         <w:pStyle w:val="SourceCode"/>
@@ -36044,8 +36074,8 @@
         <w:t xml:space="preserve">       Chapter 8, learned-space probe.</w:t>
       </w:r>
     </w:p>
-    <w:bookmarkEnd w:id="296"/>
-    <w:bookmarkStart w:id="297" w:name="man-recurrence"/>
+    <w:bookmarkEnd w:id="297"/>
+    <w:bookmarkStart w:id="298" w:name="man-recurrence"/>
     <w:p>
       <w:pPr>
         <w:pStyle w:val="SourceCode"/>
@@ -36264,8 +36294,8 @@
         <w:t xml:space="preserve">       Chapter 9, recurrent-bottleneck probe.</w:t>
       </w:r>
     </w:p>
-    <w:bookmarkEnd w:id="297"/>
-    <w:bookmarkStart w:id="298" w:name="man-attention"/>
+    <w:bookmarkEnd w:id="298"/>
+    <w:bookmarkStart w:id="299" w:name="man-attention"/>
     <w:p>
       <w:pPr>
         <w:pStyle w:val="SourceCode"/>
@@ -36559,8 +36589,8 @@
         <w:t xml:space="preserve">       Chapter 10, attention-paths probe.</w:t>
       </w:r>
     </w:p>
-    <w:bookmarkEnd w:id="298"/>
-    <w:bookmarkStart w:id="299" w:name="man-softmax"/>
+    <w:bookmarkEnd w:id="299"/>
+    <w:bookmarkStart w:id="300" w:name="man-softmax"/>
     <w:p>
       <w:pPr>
         <w:pStyle w:val="SourceCode"/>
@@ -36779,8 +36809,8 @@
         <w:t xml:space="preserve">       Chapter 10, attention-paths probe.</w:t>
       </w:r>
     </w:p>
-    <w:bookmarkEnd w:id="299"/>
-    <w:bookmarkStart w:id="300" w:name="man-transformer-block"/>
+    <w:bookmarkEnd w:id="300"/>
+    <w:bookmarkStart w:id="301" w:name="man-transformer-block"/>
     <w:p>
       <w:pPr>
         <w:pStyle w:val="SourceCode"/>
@@ -37080,8 +37110,8 @@
         <w:t xml:space="preserve">       Chapter 11, transformer-block probe.</w:t>
       </w:r>
     </w:p>
-    <w:bookmarkEnd w:id="300"/>
-    <w:bookmarkStart w:id="301" w:name="man-residual"/>
+    <w:bookmarkEnd w:id="301"/>
+    <w:bookmarkStart w:id="302" w:name="man-residual"/>
     <w:p>
       <w:pPr>
         <w:pStyle w:val="SourceCode"/>
@@ -37273,8 +37303,8 @@
         <w:t xml:space="preserve">       Chapter 11, transformer-block probe; He et al. (residual networks).</w:t>
       </w:r>
     </w:p>
-    <w:bookmarkEnd w:id="301"/>
-    <w:bookmarkStart w:id="302" w:name="man-layer-norm"/>
+    <w:bookmarkEnd w:id="302"/>
+    <w:bookmarkStart w:id="303" w:name="man-layer-norm"/>
     <w:p>
       <w:pPr>
         <w:pStyle w:val="SourceCode"/>
@@ -37466,8 +37496,8 @@
         <w:t xml:space="preserve">       Chapter 11, transformer-block probe; Ba, Kiros, Hinton (layer normalization).</w:t>
       </w:r>
     </w:p>
-    <w:bookmarkEnd w:id="302"/>
-    <w:bookmarkStart w:id="303" w:name="man-feed-forward"/>
+    <w:bookmarkEnd w:id="303"/>
+    <w:bookmarkStart w:id="304" w:name="man-feed-forward"/>
     <w:p>
       <w:pPr>
         <w:pStyle w:val="SourceCode"/>
@@ -37659,8 +37689,8 @@
         <w:t xml:space="preserve">       Chapter 11, transformer-block probe.</w:t>
       </w:r>
     </w:p>
-    <w:bookmarkEnd w:id="303"/>
-    <w:bookmarkStart w:id="304" w:name="man-callable-package"/>
+    <w:bookmarkEnd w:id="304"/>
+    <w:bookmarkStart w:id="305" w:name="man-callable-package"/>
     <w:p>
       <w:pPr>
         <w:pStyle w:val="SourceCode"/>
@@ -37942,8 +37972,8 @@
         <w:t xml:space="preserve">       Chapter 12, callable-tool probe.</w:t>
       </w:r>
     </w:p>
-    <w:bookmarkEnd w:id="304"/>
-    <w:bookmarkStart w:id="305" w:name="man-alignment"/>
+    <w:bookmarkEnd w:id="305"/>
+    <w:bookmarkStart w:id="306" w:name="man-alignment"/>
     <w:p>
       <w:pPr>
         <w:pStyle w:val="SourceCode"/>
@@ -38180,8 +38210,8 @@
         <w:t xml:space="preserve">       Chapter 13, lineage-alignment probe.</w:t>
       </w:r>
     </w:p>
-    <w:bookmarkEnd w:id="305"/>
-    <w:bookmarkStart w:id="306" w:name="man-architecture-scales"/>
+    <w:bookmarkEnd w:id="306"/>
+    <w:bookmarkStart w:id="307" w:name="man-architecture-scales"/>
     <w:p>
       <w:pPr>
         <w:pStyle w:val="SourceCode"/>
@@ -38409,8 +38439,8 @@
         <w:t xml:space="preserve">       Chapter 14, four-scales probe.</w:t>
       </w:r>
     </w:p>
-    <w:bookmarkEnd w:id="306"/>
-    <w:bookmarkStart w:id="307" w:name="man-execution-trace"/>
+    <w:bookmarkEnd w:id="307"/>
+    <w:bookmarkStart w:id="308" w:name="man-execution-trace"/>
     <w:p>
       <w:pPr>
         <w:pStyle w:val="SourceCode"/>
@@ -38647,8 +38677,8 @@
         <w:t xml:space="preserve">       Chapter 15, token-through-machine probe.</w:t>
       </w:r>
     </w:p>
-    <w:bookmarkEnd w:id="307"/>
-    <w:bookmarkStart w:id="308" w:name="man-limits"/>
+    <w:bookmarkEnd w:id="308"/>
+    <w:bookmarkStart w:id="309" w:name="man-limits"/>
     <w:p>
       <w:pPr>
         <w:pStyle w:val="SourceCode"/>
@@ -38930,7 +38960,77 @@
         <w:t xml:space="preserve">       Chapter 16, measured-limits probe.</w:t>
       </w:r>
     </w:p>
-    <w:bookmarkEnd w:id="308"/>
+    <w:bookmarkEnd w:id="309"/>
+    <w:p>
+      <w:pPr>
+        <w:pStyle w:val="Heading1"/>
+      </w:pPr>
+      <w:bookmarkStart w:id="310" w:name="continue-to-book-three"/>
+      <w:r>
+        <w:t xml:space="preserve">Continue to Book Three</w:t>
+      </w:r>
+      <w:bookmarkEnd w:id="310"/>
+    </w:p>
+    <w:p>
+      <w:pPr>
+        <w:pStyle w:val="FirstParagraph"/>
+      </w:pPr>
+      <w:r>
+        <w:t xml:space="preserve">Book Two ends at a measured boundary.</w:t>
+      </w:r>
+    </w:p>
+    <w:p>
+      <w:pPr>
+        <w:pStyle w:val="BodyText"/>
+      </w:pPr>
+      <w:r>
+        <w:t xml:space="preserve">The transformer has become inspectable as an engineered architecture: representations enter, tensor operations transform them, programs and runtimes execute those operations, decoding policy shapes observable output, and explicit constraints limit what the resulting evidence can support. None of those measurements, alone, settles what an output means, what action it warrants, or who remains responsible for using it.</w:t>
+      </w:r>
+    </w:p>
+    <w:p>
+      <w:pPr>
+        <w:pStyle w:val="BodyText"/>
+      </w:pPr>
+      <w:r>
+        <w:t xml:space="preserve">Book Three,</w:t>
+      </w:r>
+      <w:r>
+        <w:t xml:space="preserve"> </w:t>
+      </w:r>
+      <w:r>
+        <w:rPr>
+          <w:i/>
+        </w:rPr>
+        <w:t xml:space="preserve">The Architecture of Geometric Semantics: Berkeley, Transformers, and the Geometry of Inquiry</w:t>
+      </w:r>
+      <w:r>
+        <w:t xml:space="preserve">, begins at that unresolved interface. It brings the technical excursion back to human purpose, interpretation, provenance, judgment, and accountability.</w:t>
+      </w:r>
+    </w:p>
+    <w:p>
+      <w:pPr>
+        <w:pStyle w:val="BodyText"/>
+      </w:pPr>
+      <w:r>
+        <w:t xml:space="preserve">The movement of the trilogy is therefore:</w:t>
+      </w:r>
+    </w:p>
+    <w:p>
+      <w:pPr>
+        <w:pStyle w:val="BlockText"/>
+      </w:pPr>
+      <w:r>
+        <w:t xml:space="preserve">Book One encounters the tool. Book Two inspects the architecture. Book Three returns the architecture to accountable human inquiry.</w:t>
+      </w:r>
+    </w:p>
+    <w:p>
+      <w:pPr>
+        <w:pStyle w:val="FirstParagraph"/>
+      </w:pPr>
+      <w:r>
+        <w:t xml:space="preserve">Architecture supplies bounded evidence. Philosophy states the assumptions. Interpretation remains accountable.</w:t>
+      </w:r>
+    </w:p>
     <w:sectPr/>
   </w:body>
 </w:document>

</xml_diff>